<commit_message>
Choose k=7 in tuning plot and update README
Document selection of k=7 (precision-oriented) and related analysis: README updated with 5-fold CV stats, clarified that raw F1 peaks at k=3 but k=7 was chosen for higher precision, added detailed baseline comparison showing a single-feature PageValues rule outperforms kNN on F1/recall, and adjusted runtime notes. knn_tune_k.py updated to mark CHOSEN_K=7 and draw the chosen k on the performance plot. Updated presentation, report, and tuning figure binaries to match the revised writeups.
</commit_message>
<xml_diff>
--- a/Capstone_Report.docx
+++ b/Capstone_Report.docx
@@ -735,7 +735,15 @@
           <w:sz w:val="24"/>
           <w:szCs w:val="24"/>
         </w:rPr>
-        <w:t xml:space="preserve"> with majority-vote prediction, and exhaustive tuning of k from 1 to 30. The final model (k = 7, Euclidean distance) achieved 87.67% accuracy, 0.6974 precision, 0.3570 recall, and 0.4722 F1 on a held-out test set, validated by 5-fold stratified cross-validation. The model outperformed both a majority-class baseline (zero recall) and a single-feature rule on </w:t>
+        <w:t xml:space="preserve"> with majority-vote prediction, and exhaustive tuning of k from 1 to 30. The final model (k = 7, Euclidean distance) achieved 87.67% accuracy, 0.6974 precision, 0.3570 recall, and 0.4722 F1 on a held-out test set, validated by 5-fold stratified cross-validation. </w:t>
+      </w:r>
+      <w:r>
+        <w:rPr>
+          <w:rFonts w:ascii="Arial" w:hAnsi="Arial" w:cs="Arial"/>
+          <w:sz w:val="24"/>
+          <w:szCs w:val="24"/>
+        </w:rPr>
+        <w:t xml:space="preserve">The model decisively outperformed a majority-class baseline (zero recall), but a single-feature rule on </w:t>
       </w:r>
       <w:proofErr w:type="spellStart"/>
       <w:r>
@@ -753,7 +761,7 @@
           <w:sz w:val="24"/>
           <w:szCs w:val="24"/>
         </w:rPr>
-        <w:t xml:space="preserve">. The dominant predictors were </w:t>
+        <w:t xml:space="preserve"> outperformed the </w:t>
       </w:r>
       <w:proofErr w:type="spellStart"/>
       <w:r>
@@ -762,6 +770,40 @@
           <w:sz w:val="24"/>
           <w:szCs w:val="24"/>
         </w:rPr>
+        <w:t>kNN</w:t>
+      </w:r>
+      <w:proofErr w:type="spellEnd"/>
+      <w:r>
+        <w:rPr>
+          <w:rFonts w:ascii="Arial" w:hAnsi="Arial" w:cs="Arial"/>
+          <w:sz w:val="24"/>
+          <w:szCs w:val="24"/>
+        </w:rPr>
+        <w:t xml:space="preserve"> on F1 and recall — a result this report examines rather than hides.</w:t>
+      </w:r>
+      <w:r>
+        <w:rPr>
+          <w:rFonts w:ascii="Arial" w:hAnsi="Arial" w:cs="Arial"/>
+          <w:sz w:val="24"/>
+          <w:szCs w:val="24"/>
+        </w:rPr>
+        <w:t xml:space="preserve"> </w:t>
+      </w:r>
+      <w:r>
+        <w:rPr>
+          <w:rFonts w:ascii="Arial" w:hAnsi="Arial" w:cs="Arial"/>
+          <w:sz w:val="24"/>
+          <w:szCs w:val="24"/>
+        </w:rPr>
+        <w:t xml:space="preserve">The dominant predictors were </w:t>
+      </w:r>
+      <w:proofErr w:type="spellStart"/>
+      <w:r>
+        <w:rPr>
+          <w:rFonts w:ascii="Arial" w:hAnsi="Arial" w:cs="Arial"/>
+          <w:sz w:val="24"/>
+          <w:szCs w:val="24"/>
+        </w:rPr>
         <w:t>PageValues</w:t>
       </w:r>
       <w:proofErr w:type="spellEnd"/>
@@ -789,25 +831,7 @@
           <w:sz w:val="24"/>
           <w:szCs w:val="24"/>
         </w:rPr>
-        <w:t xml:space="preserve">, </w:t>
-      </w:r>
-      <w:proofErr w:type="gramStart"/>
-      <w:r>
-        <w:rPr>
-          <w:rFonts w:ascii="Arial" w:hAnsi="Arial" w:cs="Arial"/>
-          <w:sz w:val="24"/>
-          <w:szCs w:val="24"/>
-        </w:rPr>
-        <w:t>visit</w:t>
-      </w:r>
-      <w:proofErr w:type="gramEnd"/>
-      <w:r>
-        <w:rPr>
-          <w:rFonts w:ascii="Arial" w:hAnsi="Arial" w:cs="Arial"/>
-          <w:sz w:val="24"/>
-          <w:szCs w:val="24"/>
-        </w:rPr>
-        <w:t xml:space="preserve"> Month (especially November), and </w:t>
+        <w:t xml:space="preserve">, visit Month (especially November), and </w:t>
       </w:r>
       <w:proofErr w:type="spellStart"/>
       <w:r>
@@ -825,25 +849,7 @@
           <w:sz w:val="24"/>
           <w:szCs w:val="24"/>
         </w:rPr>
-        <w:t xml:space="preserve">. The most honest finding of the project is that the model’s low recall (it misses ~64% of actual buyers) is not a coding </w:t>
-      </w:r>
-      <w:proofErr w:type="gramStart"/>
-      <w:r>
-        <w:rPr>
-          <w:rFonts w:ascii="Arial" w:hAnsi="Arial" w:cs="Arial"/>
-          <w:sz w:val="24"/>
-          <w:szCs w:val="24"/>
-        </w:rPr>
-        <w:t>bug</w:t>
-      </w:r>
-      <w:proofErr w:type="gramEnd"/>
-      <w:r>
-        <w:rPr>
-          <w:rFonts w:ascii="Arial" w:hAnsi="Arial" w:cs="Arial"/>
-          <w:sz w:val="24"/>
-          <w:szCs w:val="24"/>
-        </w:rPr>
-        <w:t xml:space="preserve"> but a structural consequence of severe class imbalance combined with </w:t>
+        <w:t xml:space="preserve">. The most honest finding of the project is that the model’s low recall (it misses ~64% of actual buyers) is not a coding bug but a structural consequence of severe class imbalance combined with </w:t>
       </w:r>
       <w:proofErr w:type="spellStart"/>
       <w:r>
@@ -945,25 +951,7 @@
           <w:sz w:val="24"/>
           <w:szCs w:val="24"/>
         </w:rPr>
-        <w:t xml:space="preserve">E-commerce platforms generate millions of clickstream sessions per day, yet only a small fraction culminate in a purchase. Understanding which sessions are likely to convert allows merchants to allocate marketing </w:t>
-      </w:r>
-      <w:proofErr w:type="gramStart"/>
-      <w:r>
-        <w:rPr>
-          <w:rFonts w:ascii="Arial" w:hAnsi="Arial" w:cs="Arial"/>
-          <w:sz w:val="24"/>
-          <w:szCs w:val="24"/>
-        </w:rPr>
-        <w:t>spend</w:t>
-      </w:r>
-      <w:proofErr w:type="gramEnd"/>
-      <w:r>
-        <w:rPr>
-          <w:rFonts w:ascii="Arial" w:hAnsi="Arial" w:cs="Arial"/>
-          <w:sz w:val="24"/>
-          <w:szCs w:val="24"/>
-        </w:rPr>
-        <w:t>, personalize on-site interventions (pop-ups, discounts, live-chat invitations), and forecast revenue. Machine learning offers a tractable way to model this behavior from observable session attributes such as page visit counts, durations, bounce rates, and Google Analytics-derived metrics.</w:t>
+        <w:t>E-commerce platforms generate millions of clickstream sessions per day, yet only a small fraction culminate in a purchase. Understanding which sessions are likely to convert allows merchants to allocate marketing spend, personalize on-site interventions (pop-ups, discounts, live-chat invitations), and forecast revenue. Machine learning offers a tractable way to model this behavior from observable session attributes such as page visit counts, durations, bounce rates, and Google Analytics-derived metrics.</w:t>
       </w:r>
     </w:p>
     <w:p>
@@ -1081,25 +1069,7 @@
           <w:sz w:val="24"/>
           <w:szCs w:val="24"/>
         </w:rPr>
-        <w:t xml:space="preserve">Implement the full machine-learning pipeline </w:t>
-      </w:r>
-      <w:proofErr w:type="gramStart"/>
-      <w:r>
-        <w:rPr>
-          <w:rFonts w:ascii="Arial" w:hAnsi="Arial" w:cs="Arial"/>
-          <w:sz w:val="24"/>
-          <w:szCs w:val="24"/>
-        </w:rPr>
-        <w:t>in order to</w:t>
-      </w:r>
-      <w:proofErr w:type="gramEnd"/>
-      <w:r>
-        <w:rPr>
-          <w:rFonts w:ascii="Arial" w:hAnsi="Arial" w:cs="Arial"/>
-          <w:sz w:val="24"/>
-          <w:szCs w:val="24"/>
-        </w:rPr>
-        <w:t xml:space="preserve"> demonstrate genuine algorithmic understanding.</w:t>
+        <w:t>Implement the full machine-learning pipeline in order to demonstrate genuine algorithmic understanding.</w:t>
       </w:r>
     </w:p>
     <w:p>
@@ -1318,25 +1288,7 @@
           <w:sz w:val="24"/>
           <w:szCs w:val="24"/>
         </w:rPr>
-        <w:t xml:space="preserve">k-Nearest Neighbors is a non-parametric, instance-based ("lazy") learning algorithm. Given a query point, it computes the distance to every point in the training set, retains the k closest neighbors, and assigns the majority class label among them. There is no explicit training step — the entire training set serves as the model. Strengths: simplicity, no assumptions about the underlying distribution, and naturally non-linear decision boundaries. Weaknesses: </w:t>
-      </w:r>
-      <w:proofErr w:type="gramStart"/>
-      <w:r>
-        <w:rPr>
-          <w:rFonts w:ascii="Arial" w:hAnsi="Arial" w:cs="Arial"/>
-          <w:sz w:val="24"/>
-          <w:szCs w:val="24"/>
-        </w:rPr>
-        <w:t>O(</w:t>
-      </w:r>
-      <w:proofErr w:type="gramEnd"/>
-      <w:r>
-        <w:rPr>
-          <w:rFonts w:ascii="Arial" w:hAnsi="Arial" w:cs="Arial"/>
-          <w:sz w:val="24"/>
-          <w:szCs w:val="24"/>
-        </w:rPr>
-        <w:t>n · d) prediction cost per query, sensitivity to feature scaling, the curse of dimensionality, and sensitivity to class imbalance.</w:t>
+        <w:t>k-Nearest Neighbors is a non-parametric, instance-based ("lazy") learning algorithm. Given a query point, it computes the distance to every point in the training set, retains the k closest neighbors, and assigns the majority class label among them. There is no explicit training step — the entire training set serves as the model. Strengths: simplicity, no assumptions about the underlying distribution, and naturally non-linear decision boundaries. Weaknesses: O(n · d) prediction cost per query, sensitivity to feature scaling, the curse of dimensionality, and sensitivity to class imbalance.</w:t>
       </w:r>
     </w:p>
     <w:p>
@@ -1581,19 +1533,8 @@
           <w:sz w:val="24"/>
           <w:szCs w:val="24"/>
         </w:rPr>
-        <w:t xml:space="preserve">The Dataset in </w:t>
-      </w:r>
-      <w:proofErr w:type="gramStart"/>
-      <w:r>
-        <w:rPr>
-          <w:rFonts w:ascii="Arial" w:hAnsi="Arial" w:cs="Arial"/>
-          <w:color w:val="auto"/>
-          <w:sz w:val="24"/>
-          <w:szCs w:val="24"/>
-        </w:rPr>
-        <w:t>the Literature</w:t>
-      </w:r>
-      <w:proofErr w:type="gramEnd"/>
+        <w:t>The Dataset in the Literature</w:t>
+      </w:r>
     </w:p>
     <w:p>
       <w:pPr>
@@ -1774,25 +1715,7 @@
           <w:sz w:val="24"/>
           <w:szCs w:val="24"/>
         </w:rPr>
-        <w:t>Target: Revenue (</w:t>
-      </w:r>
-      <w:proofErr w:type="gramStart"/>
-      <w:r>
-        <w:rPr>
-          <w:rFonts w:ascii="Arial" w:hAnsi="Arial" w:cs="Arial"/>
-          <w:sz w:val="24"/>
-          <w:szCs w:val="24"/>
-        </w:rPr>
-        <w:t>Boolean) —</w:t>
-      </w:r>
-      <w:proofErr w:type="gramEnd"/>
-      <w:r>
-        <w:rPr>
-          <w:rFonts w:ascii="Arial" w:hAnsi="Arial" w:cs="Arial"/>
-          <w:sz w:val="24"/>
-          <w:szCs w:val="24"/>
-        </w:rPr>
-        <w:t xml:space="preserve"> True if the session ended with a purchase.</w:t>
+        <w:t>Target: Revenue (Boolean) — True if the session ended with a purchase.</w:t>
       </w:r>
     </w:p>
     <w:p>
@@ -1812,25 +1735,7 @@
           <w:sz w:val="24"/>
           <w:szCs w:val="24"/>
         </w:rPr>
-        <w:t xml:space="preserve">Class distribution: 10,422 No-Purchase (84.53%) vs. 1,908 Purchase (15.47%) — a </w:t>
-      </w:r>
-      <w:proofErr w:type="gramStart"/>
-      <w:r>
-        <w:rPr>
-          <w:rFonts w:ascii="Arial" w:hAnsi="Arial" w:cs="Arial"/>
-          <w:sz w:val="24"/>
-          <w:szCs w:val="24"/>
-        </w:rPr>
-        <w:t>5.46 :</w:t>
-      </w:r>
-      <w:proofErr w:type="gramEnd"/>
-      <w:r>
-        <w:rPr>
-          <w:rFonts w:ascii="Arial" w:hAnsi="Arial" w:cs="Arial"/>
-          <w:sz w:val="24"/>
-          <w:szCs w:val="24"/>
-        </w:rPr>
-        <w:t xml:space="preserve"> 1 imbalance ratio.</w:t>
+        <w:t>Class distribution: 10,422 No-Purchase (84.53%) vs. 1,908 Purchase (15.47%) — a 5.46 : 1 imbalance ratio.</w:t>
       </w:r>
     </w:p>
     <w:p>
@@ -2405,7 +2310,6 @@
               </w:rPr>
             </w:pPr>
             <w:proofErr w:type="spellStart"/>
-            <w:proofErr w:type="gramStart"/>
             <w:r>
               <w:rPr>
                 <w:rFonts w:ascii="Arial" w:hAnsi="Arial" w:cs="Arial"/>
@@ -2415,7 +2319,6 @@
               <w:t>OperatingSystems</w:t>
             </w:r>
             <w:proofErr w:type="spellEnd"/>
-            <w:proofErr w:type="gramEnd"/>
             <w:r>
               <w:rPr>
                 <w:rFonts w:ascii="Arial" w:hAnsi="Arial" w:cs="Arial"/>
@@ -2899,25 +2802,7 @@
           <w:sz w:val="24"/>
           <w:szCs w:val="24"/>
         </w:rPr>
-        <w:t xml:space="preserve"> correlate at r = 0.861. These </w:t>
-      </w:r>
-      <w:proofErr w:type="gramStart"/>
-      <w:r>
-        <w:rPr>
-          <w:rFonts w:ascii="Arial" w:hAnsi="Arial" w:cs="Arial"/>
-          <w:sz w:val="24"/>
-          <w:szCs w:val="24"/>
-        </w:rPr>
-        <w:t>near-duplicates</w:t>
-      </w:r>
-      <w:proofErr w:type="gramEnd"/>
-      <w:r>
-        <w:rPr>
-          <w:rFonts w:ascii="Arial" w:hAnsi="Arial" w:cs="Arial"/>
-          <w:sz w:val="24"/>
-          <w:szCs w:val="24"/>
-        </w:rPr>
-        <w:t xml:space="preserve"> will give those behaviors double weight inside the </w:t>
+        <w:t xml:space="preserve"> correlate at r = 0.861. These near-duplicates will give those behaviors double weight inside the </w:t>
       </w:r>
       <w:proofErr w:type="spellStart"/>
       <w:r>
@@ -4292,25 +4177,7 @@
           <w:sz w:val="24"/>
           <w:szCs w:val="24"/>
         </w:rPr>
-        <w:t xml:space="preserve">Selects the indices of </w:t>
-      </w:r>
-      <w:proofErr w:type="gramStart"/>
-      <w:r>
-        <w:rPr>
-          <w:rFonts w:ascii="Arial" w:hAnsi="Arial" w:cs="Arial"/>
-          <w:sz w:val="24"/>
-          <w:szCs w:val="24"/>
-        </w:rPr>
-        <w:t>the k</w:t>
-      </w:r>
-      <w:proofErr w:type="gramEnd"/>
-      <w:r>
-        <w:rPr>
-          <w:rFonts w:ascii="Arial" w:hAnsi="Arial" w:cs="Arial"/>
-          <w:sz w:val="24"/>
-          <w:szCs w:val="24"/>
-        </w:rPr>
-        <w:t xml:space="preserve"> smallest distances using </w:t>
+        <w:t xml:space="preserve">Selects the indices of the k smallest distances using </w:t>
       </w:r>
       <w:proofErr w:type="spellStart"/>
       <w:r>
@@ -4410,43 +4277,7 @@
           <w:sz w:val="24"/>
           <w:szCs w:val="24"/>
         </w:rPr>
-        <w:t xml:space="preserve">Precision = TP / (TP + </w:t>
-      </w:r>
-      <w:proofErr w:type="gramStart"/>
-      <w:r>
-        <w:rPr>
-          <w:rFonts w:ascii="Arial" w:hAnsi="Arial" w:cs="Arial"/>
-          <w:sz w:val="24"/>
-          <w:szCs w:val="24"/>
-        </w:rPr>
-        <w:t>FP) —</w:t>
-      </w:r>
-      <w:proofErr w:type="gramEnd"/>
-      <w:r>
-        <w:rPr>
-          <w:rFonts w:ascii="Arial" w:hAnsi="Arial" w:cs="Arial"/>
-          <w:sz w:val="24"/>
-          <w:szCs w:val="24"/>
-        </w:rPr>
-        <w:t xml:space="preserve"> of predicted buyers, how many </w:t>
-      </w:r>
-      <w:proofErr w:type="gramStart"/>
-      <w:r>
-        <w:rPr>
-          <w:rFonts w:ascii="Arial" w:hAnsi="Arial" w:cs="Arial"/>
-          <w:sz w:val="24"/>
-          <w:szCs w:val="24"/>
-        </w:rPr>
-        <w:t>actually bought</w:t>
-      </w:r>
-      <w:proofErr w:type="gramEnd"/>
-      <w:r>
-        <w:rPr>
-          <w:rFonts w:ascii="Arial" w:hAnsi="Arial" w:cs="Arial"/>
-          <w:sz w:val="24"/>
-          <w:szCs w:val="24"/>
-        </w:rPr>
-        <w:t>.</w:t>
+        <w:t>Precision = TP / (TP + FP) — of predicted buyers, how many actually bought.</w:t>
       </w:r>
     </w:p>
     <w:p>
@@ -4460,41 +4291,13 @@
           <w:szCs w:val="24"/>
         </w:rPr>
       </w:pPr>
-      <w:proofErr w:type="gramStart"/>
-      <w:r>
-        <w:rPr>
-          <w:rFonts w:ascii="Arial" w:hAnsi="Arial" w:cs="Arial"/>
-          <w:sz w:val="24"/>
-          <w:szCs w:val="24"/>
-        </w:rPr>
-        <w:t>Recall</w:t>
-      </w:r>
-      <w:proofErr w:type="gramEnd"/>
-      <w:r>
-        <w:rPr>
-          <w:rFonts w:ascii="Arial" w:hAnsi="Arial" w:cs="Arial"/>
-          <w:sz w:val="24"/>
-          <w:szCs w:val="24"/>
-        </w:rPr>
-        <w:t xml:space="preserve"> (Sensitivity) = TP / (TP + </w:t>
-      </w:r>
-      <w:proofErr w:type="gramStart"/>
-      <w:r>
-        <w:rPr>
-          <w:rFonts w:ascii="Arial" w:hAnsi="Arial" w:cs="Arial"/>
-          <w:sz w:val="24"/>
-          <w:szCs w:val="24"/>
-        </w:rPr>
-        <w:t>FN) —</w:t>
-      </w:r>
-      <w:proofErr w:type="gramEnd"/>
-      <w:r>
-        <w:rPr>
-          <w:rFonts w:ascii="Arial" w:hAnsi="Arial" w:cs="Arial"/>
-          <w:sz w:val="24"/>
-          <w:szCs w:val="24"/>
-        </w:rPr>
-        <w:t xml:space="preserve"> of actual buyers, how many we</w:t>
+      <w:r>
+        <w:rPr>
+          <w:rFonts w:ascii="Arial" w:hAnsi="Arial" w:cs="Arial"/>
+          <w:sz w:val="24"/>
+          <w:szCs w:val="24"/>
+        </w:rPr>
+        <w:t>Recall (Sensitivity) = TP / (TP + FN) — of actual buyers, how many we</w:t>
       </w:r>
       <w:r>
         <w:rPr>
@@ -4530,43 +4333,7 @@
           <w:sz w:val="24"/>
           <w:szCs w:val="24"/>
         </w:rPr>
-        <w:t xml:space="preserve">F1 = 2 · Precision · Recall / (Precision + </w:t>
-      </w:r>
-      <w:proofErr w:type="gramStart"/>
-      <w:r>
-        <w:rPr>
-          <w:rFonts w:ascii="Arial" w:hAnsi="Arial" w:cs="Arial"/>
-          <w:sz w:val="24"/>
-          <w:szCs w:val="24"/>
-        </w:rPr>
-        <w:t>Recall) —</w:t>
-      </w:r>
-      <w:proofErr w:type="gramEnd"/>
-      <w:r>
-        <w:rPr>
-          <w:rFonts w:ascii="Arial" w:hAnsi="Arial" w:cs="Arial"/>
-          <w:sz w:val="24"/>
-          <w:szCs w:val="24"/>
-        </w:rPr>
-        <w:t xml:space="preserve"> harmonic </w:t>
-      </w:r>
-      <w:proofErr w:type="gramStart"/>
-      <w:r>
-        <w:rPr>
-          <w:rFonts w:ascii="Arial" w:hAnsi="Arial" w:cs="Arial"/>
-          <w:sz w:val="24"/>
-          <w:szCs w:val="24"/>
-        </w:rPr>
-        <w:t>mean</w:t>
-      </w:r>
-      <w:proofErr w:type="gramEnd"/>
-      <w:r>
-        <w:rPr>
-          <w:rFonts w:ascii="Arial" w:hAnsi="Arial" w:cs="Arial"/>
-          <w:sz w:val="24"/>
-          <w:szCs w:val="24"/>
-        </w:rPr>
-        <w:t xml:space="preserve"> of the two.</w:t>
+        <w:t>F1 = 2 · Precision · Recall / (Precision + Recall) — harmonic mean of the two.</w:t>
       </w:r>
     </w:p>
     <w:p>
@@ -4586,25 +4353,7 @@
           <w:sz w:val="24"/>
           <w:szCs w:val="24"/>
         </w:rPr>
-        <w:t xml:space="preserve">Specificity = TN / (TN + </w:t>
-      </w:r>
-      <w:proofErr w:type="gramStart"/>
-      <w:r>
-        <w:rPr>
-          <w:rFonts w:ascii="Arial" w:hAnsi="Arial" w:cs="Arial"/>
-          <w:sz w:val="24"/>
-          <w:szCs w:val="24"/>
-        </w:rPr>
-        <w:t>FP) —</w:t>
-      </w:r>
-      <w:proofErr w:type="gramEnd"/>
-      <w:r>
-        <w:rPr>
-          <w:rFonts w:ascii="Arial" w:hAnsi="Arial" w:cs="Arial"/>
-          <w:sz w:val="24"/>
-          <w:szCs w:val="24"/>
-        </w:rPr>
-        <w:t xml:space="preserve"> of non-buyers, how many we</w:t>
+        <w:t>Specificity = TN / (TN + FP) — of non-buyers, how many we</w:t>
       </w:r>
       <w:r>
         <w:rPr>
@@ -4773,7 +4522,23 @@
           <w:sz w:val="24"/>
           <w:szCs w:val="24"/>
         </w:rPr>
-        <w:t xml:space="preserve">k was swept from 1 to 30 and all four primary metrics recorded for each value. The best F1 occurred at k = 7. As expected, recall is highest at k = 1 (where the algorithm overfits to individual training points) and falls steadily </w:t>
+        <w:t xml:space="preserve">k was swept from 1 to 30 and all four primary metrics recorded for each value. </w:t>
+      </w:r>
+      <w:r>
+        <w:rPr>
+          <w:rFonts w:ascii="Arial" w:hAnsi="Arial" w:cs="Arial"/>
+          <w:sz w:val="24"/>
+          <w:szCs w:val="24"/>
+        </w:rPr>
+        <w:t>The best F1 occurred at k = 3 (0.4892); we nonetheless selected k = 7 (F1 0.4722) because it delivers substantially higher precision (0.697 vs 0.596) at only a marginal F1 cost — matching the high-precision use case this model targets</w:t>
+      </w:r>
+      <w:r>
+        <w:rPr>
+          <w:rFonts w:ascii="Arial" w:hAnsi="Arial" w:cs="Arial"/>
+          <w:sz w:val="24"/>
+          <w:szCs w:val="24"/>
+        </w:rPr>
+        <w:t xml:space="preserve">. As expected, recall is highest at k = 1 (where the algorithm overfits to individual training points) and falls steadily </w:t>
       </w:r>
       <w:proofErr w:type="spellStart"/>
       <w:r>
@@ -4797,7 +4562,7 @@
     <w:p>
       <w:pPr>
         <w:spacing w:line="480" w:lineRule="auto"/>
-        <w:jc w:val="both"/>
+        <w:jc w:val="center"/>
         <w:rPr>
           <w:rFonts w:ascii="Arial" w:hAnsi="Arial" w:cs="Arial"/>
           <w:sz w:val="24"/>
@@ -4812,9 +4577,9 @@
           <w:szCs w:val="24"/>
         </w:rPr>
         <w:drawing>
-          <wp:inline distT="0" distB="0" distL="0" distR="0" wp14:anchorId="44B2F5EA" wp14:editId="2090F2AB">
-            <wp:extent cx="5486400" cy="2961447"/>
-            <wp:effectExtent l="0" t="0" r="0" b="0"/>
+          <wp:inline distT="0" distB="0" distL="0" distR="0" wp14:anchorId="44B2F5EA" wp14:editId="5BAC0A84">
+            <wp:extent cx="5486399" cy="2961447"/>
+            <wp:effectExtent l="0" t="0" r="635" b="0"/>
             <wp:docPr id="7" name="Picture 7"/>
             <wp:cNvGraphicFramePr>
               <a:graphicFrameLocks xmlns:a="http://schemas.openxmlformats.org/drawingml/2006/main" noChangeAspect="1"/>
@@ -4823,7 +4588,7 @@
               <a:graphicData uri="http://schemas.openxmlformats.org/drawingml/2006/picture">
                 <pic:pic xmlns:pic="http://schemas.openxmlformats.org/drawingml/2006/picture">
                   <pic:nvPicPr>
-                    <pic:cNvPr id="0" name="fig7_k_tuning.png"/>
+                    <pic:cNvPr id="7" name="Picture 7"/>
                     <pic:cNvPicPr/>
                   </pic:nvPicPr>
                   <pic:blipFill>
@@ -4835,7 +4600,7 @@
                   <pic:spPr>
                     <a:xfrm>
                       <a:off x="0" y="0"/>
-                      <a:ext cx="5486400" cy="2961447"/>
+                      <a:ext cx="5486399" cy="2961447"/>
                     </a:xfrm>
                     <a:prstGeom prst="rect">
                       <a:avLst/>
@@ -4847,18 +4612,16 @@
           </wp:inline>
         </w:drawing>
       </w:r>
-    </w:p>
-    <w:p>
-      <w:pPr>
-        <w:spacing w:after="240" w:line="480" w:lineRule="auto"/>
-        <w:jc w:val="center"/>
+      <w:r>
         <w:rPr>
           <w:rFonts w:ascii="Arial" w:hAnsi="Arial" w:cs="Arial"/>
           <w:i/>
           <w:sz w:val="24"/>
           <w:szCs w:val="24"/>
         </w:rPr>
-      </w:pPr>
+        <w:t xml:space="preserve">Figure 7. </w:t>
+      </w:r>
+      <w:proofErr w:type="spellStart"/>
       <w:r>
         <w:rPr>
           <w:rFonts w:ascii="Arial" w:hAnsi="Arial" w:cs="Arial"/>
@@ -4866,9 +4629,9 @@
           <w:sz w:val="24"/>
           <w:szCs w:val="24"/>
         </w:rPr>
-        <w:t xml:space="preserve">Figure 7. </w:t>
-      </w:r>
-      <w:proofErr w:type="spellStart"/>
+        <w:t>kNN</w:t>
+      </w:r>
+      <w:proofErr w:type="spellEnd"/>
       <w:r>
         <w:rPr>
           <w:rFonts w:ascii="Arial" w:hAnsi="Arial" w:cs="Arial"/>
@@ -4876,35 +4639,26 @@
           <w:sz w:val="24"/>
           <w:szCs w:val="24"/>
         </w:rPr>
-        <w:t>kNN</w:t>
-      </w:r>
-      <w:proofErr w:type="spellEnd"/>
-      <w:r>
+        <w:t xml:space="preserve"> performance across values of k. F1 peaks at k = 3; k = 7 chosen for its higher precision.</w:t>
+      </w:r>
+    </w:p>
+    <w:p>
+      <w:pPr>
         <w:rPr>
           <w:rFonts w:ascii="Arial" w:hAnsi="Arial" w:cs="Arial"/>
           <w:i/>
           <w:sz w:val="24"/>
           <w:szCs w:val="24"/>
         </w:rPr>
-        <w:t xml:space="preserve"> performance across values of k. F1 peaks at k = 7.</w:t>
-      </w:r>
-    </w:p>
-    <w:p>
-      <w:pPr>
+      </w:pPr>
+      <w:r>
         <w:rPr>
           <w:rFonts w:ascii="Arial" w:hAnsi="Arial" w:cs="Arial"/>
           <w:i/>
           <w:sz w:val="24"/>
           <w:szCs w:val="24"/>
         </w:rPr>
-      </w:pPr>
-      <w:r>
-        <w:rPr>
-          <w:rFonts w:ascii="Arial" w:hAnsi="Arial" w:cs="Arial"/>
-          <w:i/>
-          <w:sz w:val="24"/>
-          <w:szCs w:val="24"/>
-        </w:rPr>
+        <w:lastRenderedPageBreak/>
         <w:br w:type="page"/>
       </w:r>
     </w:p>
@@ -5034,25 +4788,7 @@
                 <w:sz w:val="24"/>
                 <w:szCs w:val="24"/>
               </w:rPr>
-              <w:t xml:space="preserve">k = </w:t>
-            </w:r>
-            <w:proofErr w:type="gramStart"/>
-            <w:r>
-              <w:rPr>
-                <w:rFonts w:ascii="Arial" w:hAnsi="Arial" w:cs="Arial"/>
-                <w:sz w:val="24"/>
-                <w:szCs w:val="24"/>
-              </w:rPr>
-              <w:t>21  (</w:t>
-            </w:r>
-            <w:proofErr w:type="gramEnd"/>
-            <w:r>
-              <w:rPr>
-                <w:rFonts w:ascii="Arial" w:hAnsi="Arial" w:cs="Arial"/>
-                <w:sz w:val="24"/>
-                <w:szCs w:val="24"/>
-              </w:rPr>
-              <w:t>0.8787)</w:t>
+              <w:t>k = 21  (0.8787)</w:t>
             </w:r>
           </w:p>
         </w:tc>
@@ -5107,25 +4843,7 @@
                 <w:sz w:val="24"/>
                 <w:szCs w:val="24"/>
               </w:rPr>
-              <w:t xml:space="preserve">k = </w:t>
-            </w:r>
-            <w:proofErr w:type="gramStart"/>
-            <w:r>
-              <w:rPr>
-                <w:rFonts w:ascii="Arial" w:hAnsi="Arial" w:cs="Arial"/>
-                <w:sz w:val="24"/>
-                <w:szCs w:val="24"/>
-              </w:rPr>
-              <w:t>24  (</w:t>
-            </w:r>
-            <w:proofErr w:type="gramEnd"/>
-            <w:r>
-              <w:rPr>
-                <w:rFonts w:ascii="Arial" w:hAnsi="Arial" w:cs="Arial"/>
-                <w:sz w:val="24"/>
-                <w:szCs w:val="24"/>
-              </w:rPr>
-              <w:t>0.8115)</w:t>
+              <w:t>k = 24  (0.8115)</w:t>
             </w:r>
           </w:p>
         </w:tc>
@@ -5180,25 +4898,7 @@
                 <w:sz w:val="24"/>
                 <w:szCs w:val="24"/>
               </w:rPr>
-              <w:t>k = 1</w:t>
-            </w:r>
-            <w:proofErr w:type="gramStart"/>
-            <w:r>
-              <w:rPr>
-                <w:rFonts w:ascii="Arial" w:hAnsi="Arial" w:cs="Arial"/>
-                <w:sz w:val="24"/>
-                <w:szCs w:val="24"/>
-              </w:rPr>
-              <w:t xml:space="preserve">   (</w:t>
-            </w:r>
-            <w:proofErr w:type="gramEnd"/>
-            <w:r>
-              <w:rPr>
-                <w:rFonts w:ascii="Arial" w:hAnsi="Arial" w:cs="Arial"/>
-                <w:sz w:val="24"/>
-                <w:szCs w:val="24"/>
-              </w:rPr>
-              <w:t>0.4409)</w:t>
+              <w:t>k = 1   (0.4409)</w:t>
             </w:r>
           </w:p>
         </w:tc>
@@ -5253,43 +4953,7 @@
                 <w:sz w:val="24"/>
                 <w:szCs w:val="24"/>
               </w:rPr>
-              <w:t>k = 7</w:t>
-            </w:r>
-            <w:proofErr w:type="gramStart"/>
-            <w:r>
-              <w:rPr>
-                <w:rFonts w:ascii="Arial" w:hAnsi="Arial" w:cs="Arial"/>
-                <w:sz w:val="24"/>
-                <w:szCs w:val="24"/>
-              </w:rPr>
-              <w:t xml:space="preserve">   (</w:t>
-            </w:r>
-            <w:proofErr w:type="gramEnd"/>
-            <w:r>
-              <w:rPr>
-                <w:rFonts w:ascii="Arial" w:hAnsi="Arial" w:cs="Arial"/>
-                <w:sz w:val="24"/>
-                <w:szCs w:val="24"/>
-              </w:rPr>
-              <w:t>0.4722</w:t>
-            </w:r>
-            <w:proofErr w:type="gramStart"/>
-            <w:r>
-              <w:rPr>
-                <w:rFonts w:ascii="Arial" w:hAnsi="Arial" w:cs="Arial"/>
-                <w:sz w:val="24"/>
-                <w:szCs w:val="24"/>
-              </w:rPr>
-              <w:t>)  ←</w:t>
-            </w:r>
-            <w:proofErr w:type="gramEnd"/>
-            <w:r>
-              <w:rPr>
-                <w:rFonts w:ascii="Arial" w:hAnsi="Arial" w:cs="Arial"/>
-                <w:sz w:val="24"/>
-                <w:szCs w:val="24"/>
-              </w:rPr>
-              <w:t xml:space="preserve"> chosen</w:t>
+              <w:t>k = 7   (0.4722)  ← chosen</w:t>
             </w:r>
           </w:p>
         </w:tc>
@@ -5437,23 +5101,13 @@
                 <w:szCs w:val="24"/>
               </w:rPr>
             </w:pPr>
-            <w:proofErr w:type="gramStart"/>
             <w:r>
               <w:rPr>
                 <w:rFonts w:ascii="Arial" w:hAnsi="Arial" w:cs="Arial"/>
                 <w:sz w:val="24"/>
                 <w:szCs w:val="24"/>
               </w:rPr>
-              <w:t>0.8767  (</w:t>
-            </w:r>
-            <w:proofErr w:type="gramEnd"/>
-            <w:r>
-              <w:rPr>
-                <w:rFonts w:ascii="Arial" w:hAnsi="Arial" w:cs="Arial"/>
-                <w:sz w:val="24"/>
-                <w:szCs w:val="24"/>
-              </w:rPr>
-              <w:t>87.67%)</w:t>
+              <w:t>0.8767  (87.67%)</w:t>
             </w:r>
           </w:p>
         </w:tc>
@@ -5708,9 +5362,9 @@
           <w:szCs w:val="24"/>
         </w:rPr>
         <w:drawing>
-          <wp:inline distT="0" distB="0" distL="0" distR="0" wp14:anchorId="73BA49BB" wp14:editId="4CAB934D">
-            <wp:extent cx="5486400" cy="1924452"/>
-            <wp:effectExtent l="0" t="0" r="0" b="0"/>
+          <wp:inline distT="0" distB="0" distL="0" distR="0" wp14:anchorId="73BA49BB" wp14:editId="1014DECE">
+            <wp:extent cx="5486399" cy="1924452"/>
+            <wp:effectExtent l="0" t="0" r="635" b="0"/>
             <wp:docPr id="8" name="Picture 8"/>
             <wp:cNvGraphicFramePr>
               <a:graphicFrameLocks xmlns:a="http://schemas.openxmlformats.org/drawingml/2006/main" noChangeAspect="1"/>
@@ -5719,7 +5373,7 @@
               <a:graphicData uri="http://schemas.openxmlformats.org/drawingml/2006/picture">
                 <pic:pic xmlns:pic="http://schemas.openxmlformats.org/drawingml/2006/picture">
                   <pic:nvPicPr>
-                    <pic:cNvPr id="0" name="fig8_final_confusion_matrix.png"/>
+                    <pic:cNvPr id="8" name="Picture 8"/>
                     <pic:cNvPicPr/>
                   </pic:nvPicPr>
                   <pic:blipFill>
@@ -5731,7 +5385,7 @@
                   <pic:spPr>
                     <a:xfrm>
                       <a:off x="0" y="0"/>
-                      <a:ext cx="5486400" cy="1924452"/>
+                      <a:ext cx="5486399" cy="1924452"/>
                     </a:xfrm>
                     <a:prstGeom prst="rect">
                       <a:avLst/>
@@ -5805,25 +5459,7 @@
           <w:sz w:val="24"/>
           <w:szCs w:val="24"/>
         </w:rPr>
-        <w:t xml:space="preserve">To confirm that the test-set result is not the product of one lucky split, the full dataset was partitioned into five stratified folds, retraining and </w:t>
-      </w:r>
-      <w:proofErr w:type="gramStart"/>
-      <w:r>
-        <w:rPr>
-          <w:rFonts w:ascii="Arial" w:hAnsi="Arial" w:cs="Arial"/>
-          <w:sz w:val="24"/>
-          <w:szCs w:val="24"/>
-        </w:rPr>
-        <w:t>rescoring</w:t>
-      </w:r>
-      <w:proofErr w:type="gramEnd"/>
-      <w:r>
-        <w:rPr>
-          <w:rFonts w:ascii="Arial" w:hAnsi="Arial" w:cs="Arial"/>
-          <w:sz w:val="24"/>
-          <w:szCs w:val="24"/>
-        </w:rPr>
-        <w:t xml:space="preserve"> on each. The per-fold metrics are tightly clustered, indicating that the model’s behavior is stable across different data partitions and that the headline test-set numbers generalize.</w:t>
+        <w:t>To confirm that the test-set result is not the product of one lucky split, the full dataset was partitioned into five stratified folds, retraining and rescoring on each. The per-fold metrics are tightly clustered, indicating that the model’s behavior is stable across different data partitions and that the headline test-set numbers generalize.</w:t>
       </w:r>
     </w:p>
     <w:p>
@@ -6178,7 +5814,7 @@
                 <w:sz w:val="24"/>
                 <w:szCs w:val="24"/>
               </w:rPr>
-              <w:t>~0.86</w:t>
+              <w:t>0.8929</w:t>
             </w:r>
           </w:p>
         </w:tc>
@@ -6203,7 +5839,7 @@
                 <w:sz w:val="24"/>
                 <w:szCs w:val="24"/>
               </w:rPr>
-              <w:t>~0.55</w:t>
+              <w:t>0.6303</w:t>
             </w:r>
           </w:p>
         </w:tc>
@@ -6228,7 +5864,7 @@
                 <w:sz w:val="24"/>
                 <w:szCs w:val="24"/>
               </w:rPr>
-              <w:t>~0.40</w:t>
+              <w:t>0.7428</w:t>
             </w:r>
           </w:p>
         </w:tc>
@@ -6253,7 +5889,7 @@
                 <w:sz w:val="24"/>
                 <w:szCs w:val="24"/>
               </w:rPr>
-              <w:t>~0.46</w:t>
+              <w:t>0.6819</w:t>
             </w:r>
           </w:p>
         </w:tc>
@@ -6292,25 +5928,7 @@
                 <w:sz w:val="24"/>
                 <w:szCs w:val="24"/>
               </w:rPr>
-              <w:t xml:space="preserve"> (k = </w:t>
-            </w:r>
-            <w:proofErr w:type="gramStart"/>
-            <w:r>
-              <w:rPr>
-                <w:rFonts w:ascii="Arial" w:hAnsi="Arial" w:cs="Arial"/>
-                <w:sz w:val="24"/>
-                <w:szCs w:val="24"/>
-              </w:rPr>
-              <w:t>7) —</w:t>
-            </w:r>
-            <w:proofErr w:type="gramEnd"/>
-            <w:r>
-              <w:rPr>
-                <w:rFonts w:ascii="Arial" w:hAnsi="Arial" w:cs="Arial"/>
-                <w:sz w:val="24"/>
-                <w:szCs w:val="24"/>
-              </w:rPr>
-              <w:t xml:space="preserve"> the researchers' model</w:t>
+              <w:t xml:space="preserve"> (k = 7) — the researchers' model</w:t>
             </w:r>
           </w:p>
         </w:tc>
@@ -6429,6 +6047,161 @@
     </w:p>
     <w:p>
       <w:pPr>
+        <w:spacing w:line="480" w:lineRule="auto"/>
+        <w:ind w:firstLine="720"/>
+        <w:jc w:val="both"/>
+        <w:rPr>
+          <w:rFonts w:ascii="Arial" w:hAnsi="Arial" w:cs="Arial"/>
+          <w:sz w:val="24"/>
+          <w:szCs w:val="24"/>
+        </w:rPr>
+      </w:pPr>
+      <w:proofErr w:type="spellStart"/>
+      <w:r>
+        <w:rPr>
+          <w:rFonts w:ascii="Arial" w:hAnsi="Arial" w:cs="Arial"/>
+          <w:sz w:val="24"/>
+          <w:szCs w:val="24"/>
+        </w:rPr>
+        <w:t>kNN</w:t>
+      </w:r>
+      <w:proofErr w:type="spellEnd"/>
+      <w:r>
+        <w:rPr>
+          <w:rFonts w:ascii="Arial" w:hAnsi="Arial" w:cs="Arial"/>
+          <w:sz w:val="24"/>
+          <w:szCs w:val="24"/>
+        </w:rPr>
+        <w:t xml:space="preserve"> clearly outperforms the always-No-Purchase baseline (zero recall and F1 by construction). However, the single-feature </w:t>
+      </w:r>
+      <w:proofErr w:type="spellStart"/>
+      <w:r>
+        <w:rPr>
+          <w:rFonts w:ascii="Arial" w:hAnsi="Arial" w:cs="Arial"/>
+          <w:sz w:val="24"/>
+          <w:szCs w:val="24"/>
+        </w:rPr>
+        <w:t>PageValues</w:t>
+      </w:r>
+      <w:proofErr w:type="spellEnd"/>
+      <w:r>
+        <w:rPr>
+          <w:rFonts w:ascii="Arial" w:hAnsi="Arial" w:cs="Arial"/>
+          <w:sz w:val="24"/>
+          <w:szCs w:val="24"/>
+        </w:rPr>
+        <w:t xml:space="preserve"> rule outperforms </w:t>
+      </w:r>
+      <w:proofErr w:type="spellStart"/>
+      <w:r>
+        <w:rPr>
+          <w:rFonts w:ascii="Arial" w:hAnsi="Arial" w:cs="Arial"/>
+          <w:sz w:val="24"/>
+          <w:szCs w:val="24"/>
+        </w:rPr>
+        <w:t>kNN</w:t>
+      </w:r>
+      <w:proofErr w:type="spellEnd"/>
+      <w:r>
+        <w:rPr>
+          <w:rFonts w:ascii="Arial" w:hAnsi="Arial" w:cs="Arial"/>
+          <w:sz w:val="24"/>
+          <w:szCs w:val="24"/>
+        </w:rPr>
+        <w:t xml:space="preserve"> on F1 (0.682 vs 0.472) and recall (0.743 vs 0.357), trailing only on precision. Rather than combining signal to beat the simple rule, the </w:t>
+      </w:r>
+      <w:proofErr w:type="spellStart"/>
+      <w:r>
+        <w:rPr>
+          <w:rFonts w:ascii="Arial" w:hAnsi="Arial" w:cs="Arial"/>
+          <w:sz w:val="24"/>
+          <w:szCs w:val="24"/>
+        </w:rPr>
+        <w:t>kNN</w:t>
+      </w:r>
+      <w:proofErr w:type="spellEnd"/>
+      <w:r>
+        <w:rPr>
+          <w:rFonts w:ascii="Arial" w:hAnsi="Arial" w:cs="Arial"/>
+          <w:sz w:val="24"/>
+          <w:szCs w:val="24"/>
+        </w:rPr>
+        <w:t xml:space="preserve"> dilutes the dominant </w:t>
+      </w:r>
+      <w:proofErr w:type="spellStart"/>
+      <w:r>
+        <w:rPr>
+          <w:rFonts w:ascii="Arial" w:hAnsi="Arial" w:cs="Arial"/>
+          <w:sz w:val="24"/>
+          <w:szCs w:val="24"/>
+        </w:rPr>
+        <w:t>PageValues</w:t>
+      </w:r>
+      <w:proofErr w:type="spellEnd"/>
+      <w:r>
+        <w:rPr>
+          <w:rFonts w:ascii="Arial" w:hAnsi="Arial" w:cs="Arial"/>
+          <w:sz w:val="24"/>
+          <w:szCs w:val="24"/>
+        </w:rPr>
+        <w:t xml:space="preserve"> signal across 28 standardized features — many redundant or noisy — and underperforms it. We treat this as a key finding (see Discussion and Limitations).</w:t>
+      </w:r>
+      <w:r>
+        <w:rPr>
+          <w:rFonts w:ascii="Arial" w:hAnsi="Arial" w:cs="Arial"/>
+          <w:sz w:val="24"/>
+          <w:szCs w:val="24"/>
+        </w:rPr>
+        <w:br w:type="page"/>
+      </w:r>
+    </w:p>
+    <w:p>
+      <w:pPr>
+        <w:pStyle w:val="Heading1"/>
+        <w:spacing w:line="480" w:lineRule="auto"/>
+        <w:jc w:val="center"/>
+        <w:rPr>
+          <w:rFonts w:ascii="Arial" w:hAnsi="Arial" w:cs="Arial"/>
+          <w:color w:val="auto"/>
+          <w:sz w:val="24"/>
+          <w:szCs w:val="24"/>
+        </w:rPr>
+      </w:pPr>
+      <w:r>
+        <w:rPr>
+          <w:rFonts w:ascii="Arial" w:hAnsi="Arial" w:cs="Arial"/>
+          <w:color w:val="auto"/>
+          <w:sz w:val="24"/>
+          <w:szCs w:val="24"/>
+        </w:rPr>
+        <w:lastRenderedPageBreak/>
+        <w:t>DISCUSSION</w:t>
+      </w:r>
+    </w:p>
+    <w:p>
+      <w:pPr>
+        <w:pStyle w:val="Heading2"/>
+        <w:spacing w:line="480" w:lineRule="auto"/>
+        <w:jc w:val="both"/>
+        <w:rPr>
+          <w:rFonts w:ascii="Arial" w:hAnsi="Arial" w:cs="Arial"/>
+          <w:color w:val="auto"/>
+          <w:sz w:val="24"/>
+          <w:szCs w:val="24"/>
+        </w:rPr>
+      </w:pPr>
+      <w:r>
+        <w:rPr>
+          <w:rFonts w:ascii="Arial" w:hAnsi="Arial" w:cs="Arial"/>
+          <w:color w:val="auto"/>
+          <w:sz w:val="24"/>
+          <w:szCs w:val="24"/>
+        </w:rPr>
+        <w:t>What the Model Learned</w:t>
+      </w:r>
+    </w:p>
+    <w:p>
+      <w:pPr>
         <w:spacing w:after="120" w:line="480" w:lineRule="auto"/>
         <w:ind w:firstLine="720"/>
         <w:jc w:val="both"/>
@@ -6438,6 +6211,14 @@
           <w:szCs w:val="24"/>
         </w:rPr>
       </w:pPr>
+      <w:r>
+        <w:rPr>
+          <w:rFonts w:ascii="Arial" w:hAnsi="Arial" w:cs="Arial"/>
+          <w:sz w:val="24"/>
+          <w:szCs w:val="24"/>
+        </w:rPr>
+        <w:t xml:space="preserve">The classifier behaves consistently with the EDA. </w:t>
+      </w:r>
       <w:proofErr w:type="spellStart"/>
       <w:r>
         <w:rPr>
@@ -6445,6 +6226,96 @@
           <w:sz w:val="24"/>
           <w:szCs w:val="24"/>
         </w:rPr>
+        <w:t>PageValues</w:t>
+      </w:r>
+      <w:proofErr w:type="spellEnd"/>
+      <w:r>
+        <w:rPr>
+          <w:rFonts w:ascii="Arial" w:hAnsi="Arial" w:cs="Arial"/>
+          <w:sz w:val="24"/>
+          <w:szCs w:val="24"/>
+        </w:rPr>
+        <w:t xml:space="preserve">, </w:t>
+      </w:r>
+      <w:proofErr w:type="spellStart"/>
+      <w:r>
+        <w:rPr>
+          <w:rFonts w:ascii="Arial" w:hAnsi="Arial" w:cs="Arial"/>
+          <w:sz w:val="24"/>
+          <w:szCs w:val="24"/>
+        </w:rPr>
+        <w:t>BounceRates</w:t>
+      </w:r>
+      <w:proofErr w:type="spellEnd"/>
+      <w:r>
+        <w:rPr>
+          <w:rFonts w:ascii="Arial" w:hAnsi="Arial" w:cs="Arial"/>
+          <w:sz w:val="24"/>
+          <w:szCs w:val="24"/>
+        </w:rPr>
+        <w:t>, and the November one-hot indicator carry the heaviest signal because those are the features along which buyers and non-buyers separate most cleanly. The standardization step ensures none of these features is artificially dominant by virtue of its raw scale.</w:t>
+      </w:r>
+    </w:p>
+    <w:p>
+      <w:pPr>
+        <w:spacing w:after="120" w:line="480" w:lineRule="auto"/>
+        <w:ind w:firstLine="720"/>
+        <w:jc w:val="both"/>
+        <w:rPr>
+          <w:rFonts w:ascii="Arial" w:hAnsi="Arial" w:cs="Arial"/>
+          <w:sz w:val="24"/>
+          <w:szCs w:val="24"/>
+        </w:rPr>
+      </w:pPr>
+    </w:p>
+    <w:p>
+      <w:pPr>
+        <w:pStyle w:val="Heading2"/>
+        <w:spacing w:line="480" w:lineRule="auto"/>
+        <w:jc w:val="both"/>
+        <w:rPr>
+          <w:rFonts w:ascii="Arial" w:hAnsi="Arial" w:cs="Arial"/>
+          <w:color w:val="auto"/>
+          <w:sz w:val="24"/>
+          <w:szCs w:val="24"/>
+        </w:rPr>
+      </w:pPr>
+      <w:r>
+        <w:rPr>
+          <w:rFonts w:ascii="Arial" w:hAnsi="Arial" w:cs="Arial"/>
+          <w:color w:val="auto"/>
+          <w:sz w:val="24"/>
+          <w:szCs w:val="24"/>
+        </w:rPr>
+        <w:t>Why Recall Is Low</w:t>
+      </w:r>
+    </w:p>
+    <w:p>
+      <w:pPr>
+        <w:spacing w:after="120" w:line="480" w:lineRule="auto"/>
+        <w:ind w:firstLine="720"/>
+        <w:jc w:val="both"/>
+        <w:rPr>
+          <w:rFonts w:ascii="Arial" w:hAnsi="Arial" w:cs="Arial"/>
+          <w:sz w:val="24"/>
+          <w:szCs w:val="24"/>
+        </w:rPr>
+      </w:pPr>
+      <w:r>
+        <w:rPr>
+          <w:rFonts w:ascii="Arial" w:hAnsi="Arial" w:cs="Arial"/>
+          <w:sz w:val="24"/>
+          <w:szCs w:val="24"/>
+        </w:rPr>
+        <w:t xml:space="preserve">The most candid finding of the project is that recall sits at 0.357: the model identifies only about 36% of actual buyers. With 381 buyers in the test set, the model catches 136 and misses 245. This is not a coding bug but a structural consequence of two interacting facts: (1) buyers are a 15.47% minority, so for any test point the seven nearest neighbors are very likely to be majority-class; (2) plain majority-vote </w:t>
+      </w:r>
+      <w:proofErr w:type="spellStart"/>
+      <w:r>
+        <w:rPr>
+          <w:rFonts w:ascii="Arial" w:hAnsi="Arial" w:cs="Arial"/>
+          <w:sz w:val="24"/>
+          <w:szCs w:val="24"/>
+        </w:rPr>
         <w:t>kNN</w:t>
       </w:r>
       <w:proofErr w:type="spellEnd"/>
@@ -6454,25 +6325,67 @@
           <w:sz w:val="24"/>
           <w:szCs w:val="24"/>
         </w:rPr>
-        <w:t xml:space="preserve"> clearly outperforms the always-No-Purchase baseline (which has zero recall and zero F1 by construction) and modestly beats the single-feature </w:t>
-      </w:r>
-      <w:proofErr w:type="spellStart"/>
-      <w:r>
-        <w:rPr>
-          <w:rFonts w:ascii="Arial" w:hAnsi="Arial" w:cs="Arial"/>
-          <w:sz w:val="24"/>
-          <w:szCs w:val="24"/>
-        </w:rPr>
-        <w:t>PageValues</w:t>
-      </w:r>
-      <w:proofErr w:type="spellEnd"/>
-      <w:r>
-        <w:rPr>
-          <w:rFonts w:ascii="Arial" w:hAnsi="Arial" w:cs="Arial"/>
-          <w:sz w:val="24"/>
-          <w:szCs w:val="24"/>
-        </w:rPr>
-        <w:t xml:space="preserve"> rule, demonstrating that the classifier is genuinely combining signal across multiple features rather than re-deriving a simpler rule.</w:t>
+        <w:t xml:space="preserve"> therefore systematically biases toward predicting "No Purchase". For a business that is willing to chase each likely buyer with an intervention, this recall would be too low; for a business that wants to avoid wasting marketing on non-buyers, the high precision (0.697) is more attractive.</w:t>
+      </w:r>
+    </w:p>
+    <w:p>
+      <w:pPr>
+        <w:rPr>
+          <w:rFonts w:ascii="Arial" w:hAnsi="Arial" w:cs="Arial"/>
+          <w:sz w:val="24"/>
+          <w:szCs w:val="24"/>
+        </w:rPr>
+      </w:pPr>
+      <w:r>
+        <w:rPr>
+          <w:rFonts w:ascii="Arial" w:hAnsi="Arial" w:cs="Arial"/>
+          <w:sz w:val="24"/>
+          <w:szCs w:val="24"/>
+        </w:rPr>
+        <w:br w:type="page"/>
+      </w:r>
+    </w:p>
+    <w:p>
+      <w:pPr>
+        <w:pStyle w:val="Heading2"/>
+        <w:spacing w:line="480" w:lineRule="auto"/>
+        <w:jc w:val="both"/>
+        <w:rPr>
+          <w:rFonts w:ascii="Arial" w:hAnsi="Arial" w:cs="Arial"/>
+          <w:color w:val="auto"/>
+          <w:sz w:val="24"/>
+          <w:szCs w:val="24"/>
+        </w:rPr>
+      </w:pPr>
+      <w:r>
+        <w:rPr>
+          <w:rFonts w:ascii="Arial" w:hAnsi="Arial" w:cs="Arial"/>
+          <w:color w:val="auto"/>
+          <w:sz w:val="24"/>
+          <w:szCs w:val="24"/>
+        </w:rPr>
+        <w:lastRenderedPageBreak/>
+        <w:t>Practical Implications</w:t>
+      </w:r>
+    </w:p>
+    <w:p>
+      <w:pPr>
+        <w:spacing w:after="120" w:line="480" w:lineRule="auto"/>
+        <w:ind w:firstLine="720"/>
+        <w:jc w:val="both"/>
+        <w:rPr>
+          <w:rFonts w:ascii="Arial" w:hAnsi="Arial" w:cs="Arial"/>
+          <w:sz w:val="24"/>
+          <w:szCs w:val="24"/>
+        </w:rPr>
+      </w:pPr>
+      <w:r>
+        <w:rPr>
+          <w:rFonts w:ascii="Arial" w:hAnsi="Arial" w:cs="Arial"/>
+          <w:sz w:val="24"/>
+          <w:szCs w:val="24"/>
+        </w:rPr>
+        <w:t>A high-precision, lower-recall classifier of this kind is suitable for use cases where the cost of intervening on a non-buyer (e.g., a costly discount or live-agent contact) is noticeably greater than the cost of missing a buyer. It is less suitable when the cost of a missed buyer dominates, in which case threshold tuning, class weighting, or a different algorithm should be used.</w:t>
       </w:r>
     </w:p>
     <w:p>
@@ -6514,8 +6427,40 @@
           <w:szCs w:val="24"/>
         </w:rPr>
         <w:lastRenderedPageBreak/>
-        <w:t>DISCUSSION</w:t>
-      </w:r>
+        <w:t>LIMITATIONS</w:t>
+      </w:r>
+    </w:p>
+    <w:p>
+      <w:pPr>
+        <w:spacing w:after="120" w:line="480" w:lineRule="auto"/>
+        <w:ind w:firstLine="720"/>
+        <w:jc w:val="both"/>
+        <w:rPr>
+          <w:rFonts w:ascii="Arial" w:hAnsi="Arial" w:cs="Arial"/>
+          <w:sz w:val="24"/>
+          <w:szCs w:val="24"/>
+        </w:rPr>
+      </w:pPr>
+      <w:r>
+        <w:rPr>
+          <w:rFonts w:ascii="Arial" w:hAnsi="Arial" w:cs="Arial"/>
+          <w:sz w:val="24"/>
+          <w:szCs w:val="24"/>
+        </w:rPr>
+        <w:t>The following are real limitations of this work, not boilerplate.</w:t>
+      </w:r>
+    </w:p>
+    <w:p>
+      <w:pPr>
+        <w:spacing w:after="120" w:line="480" w:lineRule="auto"/>
+        <w:ind w:firstLine="720"/>
+        <w:jc w:val="both"/>
+        <w:rPr>
+          <w:rFonts w:ascii="Arial" w:hAnsi="Arial" w:cs="Arial"/>
+          <w:sz w:val="24"/>
+          <w:szCs w:val="24"/>
+        </w:rPr>
+      </w:pPr>
     </w:p>
     <w:p>
       <w:pPr>
@@ -6536,7 +6481,7 @@
           <w:sz w:val="24"/>
           <w:szCs w:val="24"/>
         </w:rPr>
-        <w:t>What the Model Learned</w:t>
+        <w:t>Class Imbalance Was Acknowledged but Not Treated</w:t>
       </w:r>
     </w:p>
     <w:p>
@@ -6556,43 +6501,7 @@
           <w:sz w:val="24"/>
           <w:szCs w:val="24"/>
         </w:rPr>
-        <w:t xml:space="preserve">The classifier behaves consistently with the EDA. </w:t>
-      </w:r>
-      <w:proofErr w:type="spellStart"/>
-      <w:r>
-        <w:rPr>
-          <w:rFonts w:ascii="Arial" w:hAnsi="Arial" w:cs="Arial"/>
-          <w:sz w:val="24"/>
-          <w:szCs w:val="24"/>
-        </w:rPr>
-        <w:t>PageValues</w:t>
-      </w:r>
-      <w:proofErr w:type="spellEnd"/>
-      <w:r>
-        <w:rPr>
-          <w:rFonts w:ascii="Arial" w:hAnsi="Arial" w:cs="Arial"/>
-          <w:sz w:val="24"/>
-          <w:szCs w:val="24"/>
-        </w:rPr>
-        <w:t xml:space="preserve">, </w:t>
-      </w:r>
-      <w:proofErr w:type="spellStart"/>
-      <w:r>
-        <w:rPr>
-          <w:rFonts w:ascii="Arial" w:hAnsi="Arial" w:cs="Arial"/>
-          <w:sz w:val="24"/>
-          <w:szCs w:val="24"/>
-        </w:rPr>
-        <w:t>BounceRates</w:t>
-      </w:r>
-      <w:proofErr w:type="spellEnd"/>
-      <w:r>
-        <w:rPr>
-          <w:rFonts w:ascii="Arial" w:hAnsi="Arial" w:cs="Arial"/>
-          <w:sz w:val="24"/>
-          <w:szCs w:val="24"/>
-        </w:rPr>
-        <w:t>, and the November one-hot indicator carry the heaviest signal because those are the features along which buyers and non-buyers separate most cleanly. The standardization step ensures none of these features is artificially dominant by virtue of its raw scale.</w:t>
+        <w:t>The model uses the raw 84.5 / 15.5 distribution. Standard remedies — SMOTE oversampling, random under-sampling, distance-weighted voting, class-prior re-weighting, or moving the decision threshold — would likely shift the precision-recall trade-off and probably raise F1. None of those was implemented. This is the single largest improvement opportunity.</w:t>
       </w:r>
     </w:p>
     <w:p>
@@ -6626,7 +6535,7 @@
           <w:sz w:val="24"/>
           <w:szCs w:val="24"/>
         </w:rPr>
-        <w:t>Why Recall Is Low</w:t>
+        <w:t>Multicollinear Features Were Not Removed</w:t>
       </w:r>
     </w:p>
     <w:p>
@@ -6640,14 +6549,6 @@
           <w:szCs w:val="24"/>
         </w:rPr>
       </w:pPr>
-      <w:r>
-        <w:rPr>
-          <w:rFonts w:ascii="Arial" w:hAnsi="Arial" w:cs="Arial"/>
-          <w:sz w:val="24"/>
-          <w:szCs w:val="24"/>
-        </w:rPr>
-        <w:t xml:space="preserve">The most candid finding of the project is that recall sits at 0.357: the model identifies only about 36% of actual buyers. With 381 buyers in the test set, the model catches 136 and misses 245. This is not a coding bug but a structural consequence of two interacting facts: (1) buyers are a 15.47% minority, so for any test point the seven nearest neighbors are very likely to be majority-class; (2) plain majority-vote </w:t>
-      </w:r>
       <w:proofErr w:type="spellStart"/>
       <w:r>
         <w:rPr>
@@ -6655,7 +6556,7 @@
           <w:sz w:val="24"/>
           <w:szCs w:val="24"/>
         </w:rPr>
-        <w:t>kNN</w:t>
+        <w:t>BounceRates</w:t>
       </w:r>
       <w:proofErr w:type="spellEnd"/>
       <w:r>
@@ -6664,25 +6565,38 @@
           <w:sz w:val="24"/>
           <w:szCs w:val="24"/>
         </w:rPr>
-        <w:t xml:space="preserve"> therefore systematically biases toward predicting "No Purchase". For a business that is willing to chase each likely buyer with an intervention, this recall would be too low; for a business that wants to avoid wasting marketing on non-buyers, the high precision (0.697) is more attractive.</w:t>
-      </w:r>
-    </w:p>
-    <w:p>
-      <w:pPr>
-        <w:rPr>
-          <w:rFonts w:ascii="Arial" w:hAnsi="Arial" w:cs="Arial"/>
-          <w:sz w:val="24"/>
-          <w:szCs w:val="24"/>
-        </w:rPr>
-      </w:pPr>
-      <w:r>
-        <w:rPr>
-          <w:rFonts w:ascii="Arial" w:hAnsi="Arial" w:cs="Arial"/>
-          <w:sz w:val="24"/>
-          <w:szCs w:val="24"/>
-        </w:rPr>
-        <w:br w:type="page"/>
-      </w:r>
+        <w:t xml:space="preserve"> and </w:t>
+      </w:r>
+      <w:proofErr w:type="spellStart"/>
+      <w:r>
+        <w:rPr>
+          <w:rFonts w:ascii="Arial" w:hAnsi="Arial" w:cs="Arial"/>
+          <w:sz w:val="24"/>
+          <w:szCs w:val="24"/>
+        </w:rPr>
+        <w:t>ExitRates</w:t>
+      </w:r>
+      <w:proofErr w:type="spellEnd"/>
+      <w:r>
+        <w:rPr>
+          <w:rFonts w:ascii="Arial" w:hAnsi="Arial" w:cs="Arial"/>
+          <w:sz w:val="24"/>
+          <w:szCs w:val="24"/>
+        </w:rPr>
+        <w:t xml:space="preserve"> correlate at 0.913 and effectively contribute the same signal twice inside the Euclidean distance. Dropping one or applying PCA would reduce this redundancy.</w:t>
+      </w:r>
+    </w:p>
+    <w:p>
+      <w:pPr>
+        <w:spacing w:after="120" w:line="480" w:lineRule="auto"/>
+        <w:ind w:firstLine="720"/>
+        <w:jc w:val="both"/>
+        <w:rPr>
+          <w:rFonts w:ascii="Arial" w:hAnsi="Arial" w:cs="Arial"/>
+          <w:sz w:val="24"/>
+          <w:szCs w:val="24"/>
+        </w:rPr>
+      </w:pPr>
     </w:p>
     <w:p>
       <w:pPr>
@@ -6703,8 +6617,7 @@
           <w:sz w:val="24"/>
           <w:szCs w:val="24"/>
         </w:rPr>
-        <w:lastRenderedPageBreak/>
-        <w:t>Practical Implications</w:t>
+        <w:t>One-Hot Encoding Inflates the Distance Space</w:t>
       </w:r>
     </w:p>
     <w:p>
@@ -6724,25 +6637,212 @@
           <w:sz w:val="24"/>
           <w:szCs w:val="24"/>
         </w:rPr>
-        <w:t xml:space="preserve">A high-precision, lower-recall classifier of this kind is suitable for use cases where the cost of intervening </w:t>
-      </w:r>
-      <w:proofErr w:type="gramStart"/>
-      <w:r>
-        <w:rPr>
-          <w:rFonts w:ascii="Arial" w:hAnsi="Arial" w:cs="Arial"/>
-          <w:sz w:val="24"/>
-          <w:szCs w:val="24"/>
-        </w:rPr>
-        <w:t>on</w:t>
-      </w:r>
-      <w:proofErr w:type="gramEnd"/>
-      <w:r>
-        <w:rPr>
-          <w:rFonts w:ascii="Arial" w:hAnsi="Arial" w:cs="Arial"/>
-          <w:sz w:val="24"/>
-          <w:szCs w:val="24"/>
-        </w:rPr>
-        <w:t xml:space="preserve"> a non-buyer (e.g., a costly discount or live-agent contact) is noticeably greater than the cost of missing a buyer. It is less suitable when the cost of a missed buyer dominates, in which case threshold tuning, class weighting, or a different algorithm should be used.</w:t>
+        <w:t xml:space="preserve">The 13 binary one-hot columns (10 for Month, 3 for </w:t>
+      </w:r>
+      <w:proofErr w:type="spellStart"/>
+      <w:r>
+        <w:rPr>
+          <w:rFonts w:ascii="Arial" w:hAnsi="Arial" w:cs="Arial"/>
+          <w:sz w:val="24"/>
+          <w:szCs w:val="24"/>
+        </w:rPr>
+        <w:t>VisitorType</w:t>
+      </w:r>
+      <w:proofErr w:type="spellEnd"/>
+      <w:r>
+        <w:rPr>
+          <w:rFonts w:ascii="Arial" w:hAnsi="Arial" w:cs="Arial"/>
+          <w:sz w:val="24"/>
+          <w:szCs w:val="24"/>
+        </w:rPr>
+        <w:t>) sit alongside 14 continuous features in the same Euclidean space. Even after standardization, this geometry is not inherently faithful to the underlying categorical relationships and may slightly distort neighbor selection.</w:t>
+      </w:r>
+    </w:p>
+    <w:p>
+      <w:pPr>
+        <w:pStyle w:val="Heading2"/>
+        <w:spacing w:line="480" w:lineRule="auto"/>
+        <w:jc w:val="both"/>
+        <w:rPr>
+          <w:rFonts w:ascii="Arial" w:hAnsi="Arial" w:cs="Arial"/>
+          <w:color w:val="auto"/>
+          <w:sz w:val="24"/>
+          <w:szCs w:val="24"/>
+        </w:rPr>
+      </w:pPr>
+      <w:r>
+        <w:rPr>
+          <w:rFonts w:ascii="Arial" w:hAnsi="Arial" w:cs="Arial"/>
+          <w:color w:val="auto"/>
+          <w:sz w:val="24"/>
+          <w:szCs w:val="24"/>
+        </w:rPr>
+        <w:t>k Was Tuned on the Test Set</w:t>
+      </w:r>
+    </w:p>
+    <w:p>
+      <w:pPr>
+        <w:spacing w:after="120" w:line="480" w:lineRule="auto"/>
+        <w:ind w:firstLine="720"/>
+        <w:jc w:val="both"/>
+        <w:rPr>
+          <w:rFonts w:ascii="Arial" w:hAnsi="Arial" w:cs="Arial"/>
+          <w:sz w:val="24"/>
+          <w:szCs w:val="24"/>
+        </w:rPr>
+      </w:pPr>
+      <w:r>
+        <w:rPr>
+          <w:rFonts w:ascii="Arial" w:hAnsi="Arial" w:cs="Arial"/>
+          <w:sz w:val="24"/>
+          <w:szCs w:val="24"/>
+        </w:rPr>
+        <w:t xml:space="preserve">The hyperparameter sweep selected k = 7 by directly evaluating F1 on the held-out test set. A more rigorous protocol would use a separate validation </w:t>
+      </w:r>
+      <w:r>
+        <w:rPr>
+          <w:rFonts w:ascii="Arial" w:hAnsi="Arial" w:cs="Arial"/>
+          <w:sz w:val="24"/>
+          <w:szCs w:val="24"/>
+        </w:rPr>
+        <w:lastRenderedPageBreak/>
+        <w:t>split (or nested cross-validation) so that the test set is touched only once at the very end. The 5-fold cross-validation in final_evaluation.py partially mitigates this, but the tuning itself was not blinded.</w:t>
+      </w:r>
+    </w:p>
+    <w:p>
+      <w:pPr>
+        <w:spacing w:after="120" w:line="480" w:lineRule="auto"/>
+        <w:ind w:firstLine="720"/>
+        <w:jc w:val="both"/>
+        <w:rPr>
+          <w:rFonts w:ascii="Arial" w:hAnsi="Arial" w:cs="Arial"/>
+          <w:sz w:val="24"/>
+          <w:szCs w:val="24"/>
+        </w:rPr>
+      </w:pPr>
+    </w:p>
+    <w:p>
+      <w:pPr>
+        <w:pStyle w:val="Heading2"/>
+        <w:spacing w:line="480" w:lineRule="auto"/>
+        <w:jc w:val="both"/>
+        <w:rPr>
+          <w:rFonts w:ascii="Arial" w:hAnsi="Arial" w:cs="Arial"/>
+          <w:color w:val="auto"/>
+          <w:sz w:val="24"/>
+          <w:szCs w:val="24"/>
+        </w:rPr>
+      </w:pPr>
+      <w:r>
+        <w:rPr>
+          <w:rFonts w:ascii="Arial" w:hAnsi="Arial" w:cs="Arial"/>
+          <w:color w:val="auto"/>
+          <w:sz w:val="24"/>
+          <w:szCs w:val="24"/>
+        </w:rPr>
+        <w:t>Only Euclidean Distance and Uniform Voting</w:t>
+      </w:r>
+    </w:p>
+    <w:p>
+      <w:pPr>
+        <w:spacing w:after="120" w:line="480" w:lineRule="auto"/>
+        <w:ind w:firstLine="720"/>
+        <w:jc w:val="both"/>
+        <w:rPr>
+          <w:rFonts w:ascii="Arial" w:hAnsi="Arial" w:cs="Arial"/>
+          <w:sz w:val="24"/>
+          <w:szCs w:val="24"/>
+        </w:rPr>
+      </w:pPr>
+      <w:r>
+        <w:rPr>
+          <w:rFonts w:ascii="Arial" w:hAnsi="Arial" w:cs="Arial"/>
+          <w:sz w:val="24"/>
+          <w:szCs w:val="24"/>
+        </w:rPr>
+        <w:t xml:space="preserve">Manhattan, Chebyshev, and </w:t>
+      </w:r>
+      <w:proofErr w:type="spellStart"/>
+      <w:r>
+        <w:rPr>
+          <w:rFonts w:ascii="Arial" w:hAnsi="Arial" w:cs="Arial"/>
+          <w:sz w:val="24"/>
+          <w:szCs w:val="24"/>
+        </w:rPr>
+        <w:t>Mahalanobis</w:t>
+      </w:r>
+      <w:proofErr w:type="spellEnd"/>
+      <w:r>
+        <w:rPr>
+          <w:rFonts w:ascii="Arial" w:hAnsi="Arial" w:cs="Arial"/>
+          <w:sz w:val="24"/>
+          <w:szCs w:val="24"/>
+        </w:rPr>
+        <w:t xml:space="preserve"> distance metrics, plus distance-weighted (rather than majority-vote) neighbor aggregation, were not explored. Distance-weighted voting in particular is known to help on imbalanced data and would have been a worthwhile addition.</w:t>
+      </w:r>
+    </w:p>
+    <w:p>
+      <w:pPr>
+        <w:spacing w:after="120" w:line="480" w:lineRule="auto"/>
+        <w:ind w:firstLine="720"/>
+        <w:jc w:val="both"/>
+        <w:rPr>
+          <w:rFonts w:ascii="Arial" w:hAnsi="Arial" w:cs="Arial"/>
+          <w:sz w:val="24"/>
+          <w:szCs w:val="24"/>
+        </w:rPr>
+      </w:pPr>
+    </w:p>
+    <w:p>
+      <w:pPr>
+        <w:pStyle w:val="Heading2"/>
+        <w:spacing w:line="480" w:lineRule="auto"/>
+        <w:jc w:val="both"/>
+        <w:rPr>
+          <w:rFonts w:ascii="Arial" w:hAnsi="Arial" w:cs="Arial"/>
+          <w:color w:val="auto"/>
+          <w:sz w:val="24"/>
+          <w:szCs w:val="24"/>
+        </w:rPr>
+      </w:pPr>
+      <w:r>
+        <w:rPr>
+          <w:rFonts w:ascii="Arial" w:hAnsi="Arial" w:cs="Arial"/>
+          <w:color w:val="auto"/>
+          <w:sz w:val="24"/>
+          <w:szCs w:val="24"/>
+        </w:rPr>
+        <w:t>No Probabilistic Output / ROC Analysis</w:t>
+      </w:r>
+    </w:p>
+    <w:p>
+      <w:pPr>
+        <w:spacing w:after="120" w:line="480" w:lineRule="auto"/>
+        <w:ind w:firstLine="720"/>
+        <w:jc w:val="both"/>
+        <w:rPr>
+          <w:rFonts w:ascii="Arial" w:hAnsi="Arial" w:cs="Arial"/>
+          <w:sz w:val="24"/>
+          <w:szCs w:val="24"/>
+        </w:rPr>
+      </w:pPr>
+      <w:proofErr w:type="spellStart"/>
+      <w:r>
+        <w:rPr>
+          <w:rFonts w:ascii="Arial" w:hAnsi="Arial" w:cs="Arial"/>
+          <w:sz w:val="24"/>
+          <w:szCs w:val="24"/>
+        </w:rPr>
+        <w:t>kNN</w:t>
+      </w:r>
+      <w:proofErr w:type="spellEnd"/>
+      <w:r>
+        <w:rPr>
+          <w:rFonts w:ascii="Arial" w:hAnsi="Arial" w:cs="Arial"/>
+          <w:sz w:val="24"/>
+          <w:szCs w:val="24"/>
+        </w:rPr>
+        <w:t xml:space="preserve"> can produce a soft score equal to the proportion of positive neighbors among the k. Plotting an ROC curve and reporting AUC would visualize the full precision-recall trade-off rather than a single operating point. This was outside the scope of the implementation but would belong in any follow-up.</w:t>
       </w:r>
     </w:p>
     <w:p>
@@ -6784,7 +6884,7 @@
           <w:szCs w:val="24"/>
         </w:rPr>
         <w:lastRenderedPageBreak/>
-        <w:t>LIMITATIONS</w:t>
+        <w:t>CONCLUSION AND FUTURE WORK</w:t>
       </w:r>
     </w:p>
     <w:p>
@@ -6804,126 +6904,8 @@
           <w:sz w:val="24"/>
           <w:szCs w:val="24"/>
         </w:rPr>
-        <w:t>The following are real limitations of this work, not boilerplate.</w:t>
-      </w:r>
-    </w:p>
-    <w:p>
-      <w:pPr>
-        <w:spacing w:after="120" w:line="480" w:lineRule="auto"/>
-        <w:ind w:firstLine="720"/>
-        <w:jc w:val="both"/>
-        <w:rPr>
-          <w:rFonts w:ascii="Arial" w:hAnsi="Arial" w:cs="Arial"/>
-          <w:sz w:val="24"/>
-          <w:szCs w:val="24"/>
-        </w:rPr>
-      </w:pPr>
-    </w:p>
-    <w:p>
-      <w:pPr>
-        <w:pStyle w:val="Heading2"/>
-        <w:spacing w:line="480" w:lineRule="auto"/>
-        <w:jc w:val="both"/>
-        <w:rPr>
-          <w:rFonts w:ascii="Arial" w:hAnsi="Arial" w:cs="Arial"/>
-          <w:color w:val="auto"/>
-          <w:sz w:val="24"/>
-          <w:szCs w:val="24"/>
-        </w:rPr>
-      </w:pPr>
-      <w:r>
-        <w:rPr>
-          <w:rFonts w:ascii="Arial" w:hAnsi="Arial" w:cs="Arial"/>
-          <w:color w:val="auto"/>
-          <w:sz w:val="24"/>
-          <w:szCs w:val="24"/>
-        </w:rPr>
-        <w:t>Class Imbalance Was Acknowledged but Not Treated</w:t>
-      </w:r>
-    </w:p>
-    <w:p>
-      <w:pPr>
-        <w:spacing w:after="120" w:line="480" w:lineRule="auto"/>
-        <w:ind w:firstLine="720"/>
-        <w:jc w:val="both"/>
-        <w:rPr>
-          <w:rFonts w:ascii="Arial" w:hAnsi="Arial" w:cs="Arial"/>
-          <w:sz w:val="24"/>
-          <w:szCs w:val="24"/>
-        </w:rPr>
-      </w:pPr>
-      <w:r>
-        <w:rPr>
-          <w:rFonts w:ascii="Arial" w:hAnsi="Arial" w:cs="Arial"/>
-          <w:sz w:val="24"/>
-          <w:szCs w:val="24"/>
-        </w:rPr>
-        <w:t xml:space="preserve">The model uses the raw 84.5 / 15.5 distribution. Standard remedies — SMOTE oversampling, random under-sampling, distance-weighted voting, class-prior re-weighting, or moving the decision threshold — would likely shift the precision-recall trade-off and probably raise F1. None of those </w:t>
-      </w:r>
-      <w:proofErr w:type="gramStart"/>
-      <w:r>
-        <w:rPr>
-          <w:rFonts w:ascii="Arial" w:hAnsi="Arial" w:cs="Arial"/>
-          <w:sz w:val="24"/>
-          <w:szCs w:val="24"/>
-        </w:rPr>
-        <w:t>was</w:t>
-      </w:r>
-      <w:proofErr w:type="gramEnd"/>
-      <w:r>
-        <w:rPr>
-          <w:rFonts w:ascii="Arial" w:hAnsi="Arial" w:cs="Arial"/>
-          <w:sz w:val="24"/>
-          <w:szCs w:val="24"/>
-        </w:rPr>
-        <w:t xml:space="preserve"> implemented. This is the single largest improvement opportunity.</w:t>
-      </w:r>
-    </w:p>
-    <w:p>
-      <w:pPr>
-        <w:spacing w:after="120" w:line="480" w:lineRule="auto"/>
-        <w:ind w:firstLine="720"/>
-        <w:jc w:val="both"/>
-        <w:rPr>
-          <w:rFonts w:ascii="Arial" w:hAnsi="Arial" w:cs="Arial"/>
-          <w:sz w:val="24"/>
-          <w:szCs w:val="24"/>
-        </w:rPr>
-      </w:pPr>
-    </w:p>
-    <w:p>
-      <w:pPr>
-        <w:pStyle w:val="Heading2"/>
-        <w:spacing w:line="480" w:lineRule="auto"/>
-        <w:jc w:val="both"/>
-        <w:rPr>
-          <w:rFonts w:ascii="Arial" w:hAnsi="Arial" w:cs="Arial"/>
-          <w:color w:val="auto"/>
-          <w:sz w:val="24"/>
-          <w:szCs w:val="24"/>
-        </w:rPr>
-      </w:pPr>
-      <w:r>
-        <w:rPr>
-          <w:rFonts w:ascii="Arial" w:hAnsi="Arial" w:cs="Arial"/>
-          <w:color w:val="auto"/>
-          <w:sz w:val="24"/>
-          <w:szCs w:val="24"/>
-        </w:rPr>
-        <w:t>Multicollinear Features Were Not Removed</w:t>
-      </w:r>
-    </w:p>
-    <w:p>
-      <w:pPr>
-        <w:spacing w:after="120" w:line="480" w:lineRule="auto"/>
-        <w:ind w:firstLine="720"/>
-        <w:jc w:val="both"/>
-        <w:rPr>
-          <w:rFonts w:ascii="Arial" w:hAnsi="Arial" w:cs="Arial"/>
-          <w:sz w:val="24"/>
-          <w:szCs w:val="24"/>
-        </w:rPr>
-      </w:pPr>
+        <w:t xml:space="preserve">This capstone implemented a complete </w:t>
+      </w:r>
       <w:proofErr w:type="spellStart"/>
       <w:r>
         <w:rPr>
@@ -6931,7 +6913,7 @@
           <w:sz w:val="24"/>
           <w:szCs w:val="24"/>
         </w:rPr>
-        <w:t>BounceRates</w:t>
+        <w:t>kNN</w:t>
       </w:r>
       <w:proofErr w:type="spellEnd"/>
       <w:r>
@@ -6940,7 +6922,31 @@
           <w:sz w:val="24"/>
           <w:szCs w:val="24"/>
         </w:rPr>
-        <w:t xml:space="preserve"> and </w:t>
+        <w:t xml:space="preserve"> classification pipeline</w:t>
+      </w:r>
+      <w:r>
+        <w:rPr>
+          <w:rFonts w:ascii="Arial" w:hAnsi="Arial" w:cs="Arial"/>
+          <w:sz w:val="24"/>
+          <w:szCs w:val="24"/>
+        </w:rPr>
+        <w:t xml:space="preserve"> </w:t>
+      </w:r>
+      <w:r>
+        <w:rPr>
+          <w:rFonts w:ascii="Arial" w:hAnsi="Arial" w:cs="Arial"/>
+          <w:sz w:val="24"/>
+          <w:szCs w:val="24"/>
+        </w:rPr>
+        <w:t xml:space="preserve">and applied it to the UCI Online Shoppers Purchasing Intention dataset. The final model (k = 7, Euclidean distance, train-only standardized features) achieves 87.67% accuracy, precision 0.697, recall 0.357, and F1 0.472 on a held-out test set. Cross-validation confirms the result is stable across folds. </w:t>
+      </w:r>
+      <w:r>
+        <w:rPr>
+          <w:rFonts w:ascii="Arial" w:hAnsi="Arial" w:cs="Arial"/>
+          <w:sz w:val="24"/>
+          <w:szCs w:val="24"/>
+        </w:rPr>
+        <w:t xml:space="preserve">The model decisively beats a majority-class baseline, but is itself beaten by a single-feature </w:t>
       </w:r>
       <w:proofErr w:type="spellStart"/>
       <w:r>
@@ -6949,7 +6955,7 @@
           <w:sz w:val="24"/>
           <w:szCs w:val="24"/>
         </w:rPr>
-        <w:t>ExitRates</w:t>
+        <w:t>PageValues</w:t>
       </w:r>
       <w:proofErr w:type="spellEnd"/>
       <w:r>
@@ -6958,320 +6964,7 @@
           <w:sz w:val="24"/>
           <w:szCs w:val="24"/>
         </w:rPr>
-        <w:t xml:space="preserve"> correlate at 0.913 and effectively contribute the same signal twice inside the Euclidean distance. Dropping one or applying PCA would reduce this redundancy.</w:t>
-      </w:r>
-    </w:p>
-    <w:p>
-      <w:pPr>
-        <w:spacing w:after="120" w:line="480" w:lineRule="auto"/>
-        <w:ind w:firstLine="720"/>
-        <w:jc w:val="both"/>
-        <w:rPr>
-          <w:rFonts w:ascii="Arial" w:hAnsi="Arial" w:cs="Arial"/>
-          <w:sz w:val="24"/>
-          <w:szCs w:val="24"/>
-        </w:rPr>
-      </w:pPr>
-    </w:p>
-    <w:p>
-      <w:pPr>
-        <w:pStyle w:val="Heading2"/>
-        <w:spacing w:line="480" w:lineRule="auto"/>
-        <w:jc w:val="both"/>
-        <w:rPr>
-          <w:rFonts w:ascii="Arial" w:hAnsi="Arial" w:cs="Arial"/>
-          <w:color w:val="auto"/>
-          <w:sz w:val="24"/>
-          <w:szCs w:val="24"/>
-        </w:rPr>
-      </w:pPr>
-      <w:r>
-        <w:rPr>
-          <w:rFonts w:ascii="Arial" w:hAnsi="Arial" w:cs="Arial"/>
-          <w:color w:val="auto"/>
-          <w:sz w:val="24"/>
-          <w:szCs w:val="24"/>
-        </w:rPr>
-        <w:t>One-Hot Encoding Inflates the Distance Space</w:t>
-      </w:r>
-    </w:p>
-    <w:p>
-      <w:pPr>
-        <w:spacing w:after="120" w:line="480" w:lineRule="auto"/>
-        <w:ind w:firstLine="720"/>
-        <w:jc w:val="both"/>
-        <w:rPr>
-          <w:rFonts w:ascii="Arial" w:hAnsi="Arial" w:cs="Arial"/>
-          <w:sz w:val="24"/>
-          <w:szCs w:val="24"/>
-        </w:rPr>
-      </w:pPr>
-      <w:r>
-        <w:rPr>
-          <w:rFonts w:ascii="Arial" w:hAnsi="Arial" w:cs="Arial"/>
-          <w:sz w:val="24"/>
-          <w:szCs w:val="24"/>
-        </w:rPr>
-        <w:t xml:space="preserve">The 13 binary one-hot columns (10 for Month, 3 for </w:t>
-      </w:r>
-      <w:proofErr w:type="spellStart"/>
-      <w:r>
-        <w:rPr>
-          <w:rFonts w:ascii="Arial" w:hAnsi="Arial" w:cs="Arial"/>
-          <w:sz w:val="24"/>
-          <w:szCs w:val="24"/>
-        </w:rPr>
-        <w:t>VisitorType</w:t>
-      </w:r>
-      <w:proofErr w:type="spellEnd"/>
-      <w:r>
-        <w:rPr>
-          <w:rFonts w:ascii="Arial" w:hAnsi="Arial" w:cs="Arial"/>
-          <w:sz w:val="24"/>
-          <w:szCs w:val="24"/>
-        </w:rPr>
-        <w:t>) sit alongside 14 continuous features in the same Euclidean space. Even after standardization, this geometry is not inherently faithful to the underlying categorical relationships and may slightly distort neighbor selection.</w:t>
-      </w:r>
-    </w:p>
-    <w:p>
-      <w:pPr>
-        <w:pStyle w:val="Heading2"/>
-        <w:spacing w:line="480" w:lineRule="auto"/>
-        <w:jc w:val="both"/>
-        <w:rPr>
-          <w:rFonts w:ascii="Arial" w:hAnsi="Arial" w:cs="Arial"/>
-          <w:color w:val="auto"/>
-          <w:sz w:val="24"/>
-          <w:szCs w:val="24"/>
-        </w:rPr>
-      </w:pPr>
-      <w:r>
-        <w:rPr>
-          <w:rFonts w:ascii="Arial" w:hAnsi="Arial" w:cs="Arial"/>
-          <w:color w:val="auto"/>
-          <w:sz w:val="24"/>
-          <w:szCs w:val="24"/>
-        </w:rPr>
-        <w:t>k Was Tuned on the Test Set</w:t>
-      </w:r>
-    </w:p>
-    <w:p>
-      <w:pPr>
-        <w:spacing w:after="120" w:line="480" w:lineRule="auto"/>
-        <w:ind w:firstLine="720"/>
-        <w:jc w:val="both"/>
-        <w:rPr>
-          <w:rFonts w:ascii="Arial" w:hAnsi="Arial" w:cs="Arial"/>
-          <w:sz w:val="24"/>
-          <w:szCs w:val="24"/>
-        </w:rPr>
-      </w:pPr>
-      <w:r>
-        <w:rPr>
-          <w:rFonts w:ascii="Arial" w:hAnsi="Arial" w:cs="Arial"/>
-          <w:sz w:val="24"/>
-          <w:szCs w:val="24"/>
-        </w:rPr>
-        <w:t xml:space="preserve">The hyperparameter </w:t>
-      </w:r>
-      <w:proofErr w:type="gramStart"/>
-      <w:r>
-        <w:rPr>
-          <w:rFonts w:ascii="Arial" w:hAnsi="Arial" w:cs="Arial"/>
-          <w:sz w:val="24"/>
-          <w:szCs w:val="24"/>
-        </w:rPr>
-        <w:t>sweep</w:t>
-      </w:r>
-      <w:proofErr w:type="gramEnd"/>
-      <w:r>
-        <w:rPr>
-          <w:rFonts w:ascii="Arial" w:hAnsi="Arial" w:cs="Arial"/>
-          <w:sz w:val="24"/>
-          <w:szCs w:val="24"/>
-        </w:rPr>
-        <w:t xml:space="preserve"> selected k = 7 by directly evaluating F1 on the held-out test set. A more rigorous protocol would use a separate validation </w:t>
-      </w:r>
-      <w:r>
-        <w:rPr>
-          <w:rFonts w:ascii="Arial" w:hAnsi="Arial" w:cs="Arial"/>
-          <w:sz w:val="24"/>
-          <w:szCs w:val="24"/>
-        </w:rPr>
-        <w:lastRenderedPageBreak/>
-        <w:t>split (or nested cross-validation) so that the test set is touched only once at the very end. The 5-fold cross-validation in final_evaluation.py partially mitigates this, but the tuning itself was not blinded.</w:t>
-      </w:r>
-    </w:p>
-    <w:p>
-      <w:pPr>
-        <w:spacing w:after="120" w:line="480" w:lineRule="auto"/>
-        <w:ind w:firstLine="720"/>
-        <w:jc w:val="both"/>
-        <w:rPr>
-          <w:rFonts w:ascii="Arial" w:hAnsi="Arial" w:cs="Arial"/>
-          <w:sz w:val="24"/>
-          <w:szCs w:val="24"/>
-        </w:rPr>
-      </w:pPr>
-    </w:p>
-    <w:p>
-      <w:pPr>
-        <w:pStyle w:val="Heading2"/>
-        <w:spacing w:line="480" w:lineRule="auto"/>
-        <w:jc w:val="both"/>
-        <w:rPr>
-          <w:rFonts w:ascii="Arial" w:hAnsi="Arial" w:cs="Arial"/>
-          <w:color w:val="auto"/>
-          <w:sz w:val="24"/>
-          <w:szCs w:val="24"/>
-        </w:rPr>
-      </w:pPr>
-      <w:r>
-        <w:rPr>
-          <w:rFonts w:ascii="Arial" w:hAnsi="Arial" w:cs="Arial"/>
-          <w:color w:val="auto"/>
-          <w:sz w:val="24"/>
-          <w:szCs w:val="24"/>
-        </w:rPr>
-        <w:t>Only Euclidean Distance and Uniform Voting</w:t>
-      </w:r>
-    </w:p>
-    <w:p>
-      <w:pPr>
-        <w:spacing w:after="120" w:line="480" w:lineRule="auto"/>
-        <w:ind w:firstLine="720"/>
-        <w:jc w:val="both"/>
-        <w:rPr>
-          <w:rFonts w:ascii="Arial" w:hAnsi="Arial" w:cs="Arial"/>
-          <w:sz w:val="24"/>
-          <w:szCs w:val="24"/>
-        </w:rPr>
-      </w:pPr>
-      <w:r>
-        <w:rPr>
-          <w:rFonts w:ascii="Arial" w:hAnsi="Arial" w:cs="Arial"/>
-          <w:sz w:val="24"/>
-          <w:szCs w:val="24"/>
-        </w:rPr>
-        <w:t xml:space="preserve">Manhattan, Chebyshev, and </w:t>
-      </w:r>
-      <w:proofErr w:type="spellStart"/>
-      <w:r>
-        <w:rPr>
-          <w:rFonts w:ascii="Arial" w:hAnsi="Arial" w:cs="Arial"/>
-          <w:sz w:val="24"/>
-          <w:szCs w:val="24"/>
-        </w:rPr>
-        <w:t>Mahalanobis</w:t>
-      </w:r>
-      <w:proofErr w:type="spellEnd"/>
-      <w:r>
-        <w:rPr>
-          <w:rFonts w:ascii="Arial" w:hAnsi="Arial" w:cs="Arial"/>
-          <w:sz w:val="24"/>
-          <w:szCs w:val="24"/>
-        </w:rPr>
-        <w:t xml:space="preserve"> distance metrics, plus distance-weighted (rather than majority-vote) neighbor aggregation, were not explored. Distance-weighted voting </w:t>
-      </w:r>
-      <w:proofErr w:type="gramStart"/>
-      <w:r>
-        <w:rPr>
-          <w:rFonts w:ascii="Arial" w:hAnsi="Arial" w:cs="Arial"/>
-          <w:sz w:val="24"/>
-          <w:szCs w:val="24"/>
-        </w:rPr>
-        <w:t>in particular is</w:t>
-      </w:r>
-      <w:proofErr w:type="gramEnd"/>
-      <w:r>
-        <w:rPr>
-          <w:rFonts w:ascii="Arial" w:hAnsi="Arial" w:cs="Arial"/>
-          <w:sz w:val="24"/>
-          <w:szCs w:val="24"/>
-        </w:rPr>
-        <w:t xml:space="preserve"> known to help </w:t>
-      </w:r>
-      <w:proofErr w:type="gramStart"/>
-      <w:r>
-        <w:rPr>
-          <w:rFonts w:ascii="Arial" w:hAnsi="Arial" w:cs="Arial"/>
-          <w:sz w:val="24"/>
-          <w:szCs w:val="24"/>
-        </w:rPr>
-        <w:t>on</w:t>
-      </w:r>
-      <w:proofErr w:type="gramEnd"/>
-      <w:r>
-        <w:rPr>
-          <w:rFonts w:ascii="Arial" w:hAnsi="Arial" w:cs="Arial"/>
-          <w:sz w:val="24"/>
-          <w:szCs w:val="24"/>
-        </w:rPr>
-        <w:t xml:space="preserve"> imbalanced data and would have been a worthwhile addition.</w:t>
-      </w:r>
-    </w:p>
-    <w:p>
-      <w:pPr>
-        <w:spacing w:after="120" w:line="480" w:lineRule="auto"/>
-        <w:ind w:firstLine="720"/>
-        <w:jc w:val="both"/>
-        <w:rPr>
-          <w:rFonts w:ascii="Arial" w:hAnsi="Arial" w:cs="Arial"/>
-          <w:sz w:val="24"/>
-          <w:szCs w:val="24"/>
-        </w:rPr>
-      </w:pPr>
-    </w:p>
-    <w:p>
-      <w:pPr>
-        <w:pStyle w:val="Heading2"/>
-        <w:spacing w:line="480" w:lineRule="auto"/>
-        <w:jc w:val="both"/>
-        <w:rPr>
-          <w:rFonts w:ascii="Arial" w:hAnsi="Arial" w:cs="Arial"/>
-          <w:color w:val="auto"/>
-          <w:sz w:val="24"/>
-          <w:szCs w:val="24"/>
-        </w:rPr>
-      </w:pPr>
-      <w:r>
-        <w:rPr>
-          <w:rFonts w:ascii="Arial" w:hAnsi="Arial" w:cs="Arial"/>
-          <w:color w:val="auto"/>
-          <w:sz w:val="24"/>
-          <w:szCs w:val="24"/>
-        </w:rPr>
-        <w:t>No Probabilistic Output / ROC Analysis</w:t>
-      </w:r>
-    </w:p>
-    <w:p>
-      <w:pPr>
-        <w:spacing w:after="120" w:line="480" w:lineRule="auto"/>
-        <w:ind w:firstLine="720"/>
-        <w:jc w:val="both"/>
-        <w:rPr>
-          <w:rFonts w:ascii="Arial" w:hAnsi="Arial" w:cs="Arial"/>
-          <w:sz w:val="24"/>
-          <w:szCs w:val="24"/>
-        </w:rPr>
-      </w:pPr>
-      <w:proofErr w:type="spellStart"/>
-      <w:r>
-        <w:rPr>
-          <w:rFonts w:ascii="Arial" w:hAnsi="Arial" w:cs="Arial"/>
-          <w:sz w:val="24"/>
-          <w:szCs w:val="24"/>
-        </w:rPr>
-        <w:t>kNN</w:t>
-      </w:r>
-      <w:proofErr w:type="spellEnd"/>
-      <w:r>
-        <w:rPr>
-          <w:rFonts w:ascii="Arial" w:hAnsi="Arial" w:cs="Arial"/>
-          <w:sz w:val="24"/>
-          <w:szCs w:val="24"/>
-        </w:rPr>
-        <w:t xml:space="preserve"> can produce a soft score equal to the proportion of positive neighbors among the k. Plotting an ROC curve and reporting AUC would visualize the full precision-recall trade-off rather than a single operating point. This was outside the scope of the implementation but would belong in any follow-up.</w:t>
+        <w:t xml:space="preserve"> rule on F1 and recall — and its low recall on the minority class is a real structural limitation rather than a presentation flaw.</w:t>
       </w:r>
     </w:p>
     <w:p>
@@ -7313,102 +7006,6 @@
           <w:szCs w:val="24"/>
         </w:rPr>
         <w:lastRenderedPageBreak/>
-        <w:t>CONCLUSION AND FUTURE WORK</w:t>
-      </w:r>
-    </w:p>
-    <w:p>
-      <w:pPr>
-        <w:spacing w:after="120" w:line="480" w:lineRule="auto"/>
-        <w:ind w:firstLine="720"/>
-        <w:jc w:val="both"/>
-        <w:rPr>
-          <w:rFonts w:ascii="Arial" w:hAnsi="Arial" w:cs="Arial"/>
-          <w:sz w:val="24"/>
-          <w:szCs w:val="24"/>
-        </w:rPr>
-      </w:pPr>
-      <w:r>
-        <w:rPr>
-          <w:rFonts w:ascii="Arial" w:hAnsi="Arial" w:cs="Arial"/>
-          <w:sz w:val="24"/>
-          <w:szCs w:val="24"/>
-        </w:rPr>
-        <w:t xml:space="preserve">This capstone implemented a complete </w:t>
-      </w:r>
-      <w:proofErr w:type="spellStart"/>
-      <w:r>
-        <w:rPr>
-          <w:rFonts w:ascii="Arial" w:hAnsi="Arial" w:cs="Arial"/>
-          <w:sz w:val="24"/>
-          <w:szCs w:val="24"/>
-        </w:rPr>
-        <w:t>kNN</w:t>
-      </w:r>
-      <w:proofErr w:type="spellEnd"/>
-      <w:r>
-        <w:rPr>
-          <w:rFonts w:ascii="Arial" w:hAnsi="Arial" w:cs="Arial"/>
-          <w:sz w:val="24"/>
-          <w:szCs w:val="24"/>
-        </w:rPr>
-        <w:t xml:space="preserve"> classification pipeline</w:t>
-      </w:r>
-      <w:r>
-        <w:rPr>
-          <w:rFonts w:ascii="Arial" w:hAnsi="Arial" w:cs="Arial"/>
-          <w:sz w:val="24"/>
-          <w:szCs w:val="24"/>
-        </w:rPr>
-        <w:t xml:space="preserve"> </w:t>
-      </w:r>
-      <w:r>
-        <w:rPr>
-          <w:rFonts w:ascii="Arial" w:hAnsi="Arial" w:cs="Arial"/>
-          <w:sz w:val="24"/>
-          <w:szCs w:val="24"/>
-        </w:rPr>
-        <w:t>and applied it to the UCI Online Shoppers Purchasing Intention dataset. The final model (k = 7, Euclidean distance, train-only standardized features) achieves 87.67% accuracy, precision 0.697, recall 0.357, and F1 0.472 on a held-out test set. Cross-validation confirms the result is stable across folds. The model decisively beats a majority-class baseline and a single-feature rule, but its low recall on the minority class is a real structural limitation rather than a presentation flaw.</w:t>
-      </w:r>
-    </w:p>
-    <w:p>
-      <w:pPr>
-        <w:spacing w:line="480" w:lineRule="auto"/>
-        <w:jc w:val="both"/>
-        <w:rPr>
-          <w:rFonts w:ascii="Arial" w:hAnsi="Arial" w:cs="Arial"/>
-          <w:sz w:val="24"/>
-          <w:szCs w:val="24"/>
-        </w:rPr>
-      </w:pPr>
-      <w:r>
-        <w:rPr>
-          <w:rFonts w:ascii="Arial" w:hAnsi="Arial" w:cs="Arial"/>
-          <w:sz w:val="24"/>
-          <w:szCs w:val="24"/>
-        </w:rPr>
-        <w:br w:type="page"/>
-      </w:r>
-    </w:p>
-    <w:p>
-      <w:pPr>
-        <w:pStyle w:val="Heading1"/>
-        <w:spacing w:line="480" w:lineRule="auto"/>
-        <w:jc w:val="center"/>
-        <w:rPr>
-          <w:rFonts w:ascii="Arial" w:hAnsi="Arial" w:cs="Arial"/>
-          <w:color w:val="auto"/>
-          <w:sz w:val="24"/>
-          <w:szCs w:val="24"/>
-        </w:rPr>
-      </w:pPr>
-      <w:r>
-        <w:rPr>
-          <w:rFonts w:ascii="Arial" w:hAnsi="Arial" w:cs="Arial"/>
-          <w:color w:val="auto"/>
-          <w:sz w:val="24"/>
-          <w:szCs w:val="24"/>
-        </w:rPr>
-        <w:lastRenderedPageBreak/>
         <w:t>REFERENCES</w:t>
       </w:r>
     </w:p>
@@ -7478,25 +7075,7 @@
           <w:sz w:val="24"/>
           <w:szCs w:val="24"/>
         </w:rPr>
-        <w:t xml:space="preserve"> Real-time prediction of online shoppers’ purchasing intention using multilayer </w:t>
-      </w:r>
-      <w:proofErr w:type="gramStart"/>
-      <w:r>
-        <w:rPr>
-          <w:rFonts w:ascii="Arial" w:hAnsi="Arial" w:cs="Arial"/>
-          <w:sz w:val="24"/>
-          <w:szCs w:val="24"/>
-        </w:rPr>
-        <w:t>perceptron</w:t>
-      </w:r>
-      <w:proofErr w:type="gramEnd"/>
-      <w:r>
-        <w:rPr>
-          <w:rFonts w:ascii="Arial" w:hAnsi="Arial" w:cs="Arial"/>
-          <w:sz w:val="24"/>
-          <w:szCs w:val="24"/>
-        </w:rPr>
-        <w:t xml:space="preserve"> and LSTM recurrent neural networks. Neural Computing and Applications, 31(10), 6893–6908.</w:t>
+        <w:t xml:space="preserve"> Real-time prediction of online shoppers’ purchasing intention using multilayer perceptron and LSTM recurrent neural networks. Neural Computing and Applications, 31(10), 6893–6908.</w:t>
       </w:r>
     </w:p>
     <w:p>
@@ -9275,7 +8854,6 @@
   <w:style w:type="character" w:default="1" w:styleId="DefaultParagraphFont">
     <w:name w:val="Default Paragraph Font"/>
     <w:uiPriority w:val="1"/>
-    <w:semiHidden/>
     <w:unhideWhenUsed/>
   </w:style>
   <w:style w:type="table" w:default="1" w:styleId="TableNormal">

</xml_diff>

<commit_message>
Update capstone presentation and report
Replace updated Capstone_Presentation.pptx and Capstone_Report.docx with revised content and formatting for the final submission. These binary updates include edits to slides and the project report (content/structure/formatting improvements).
</commit_message>
<xml_diff>
--- a/Capstone_Report.docx
+++ b/Capstone_Report.docx
@@ -683,25 +683,7 @@
           <w:sz w:val="24"/>
           <w:szCs w:val="24"/>
         </w:rPr>
-        <w:t>This capstone investigates whether a k-Nearest Neighbors (</w:t>
-      </w:r>
-      <w:proofErr w:type="spellStart"/>
-      <w:r>
-        <w:rPr>
-          <w:rFonts w:ascii="Arial" w:hAnsi="Arial" w:cs="Arial"/>
-          <w:sz w:val="24"/>
-          <w:szCs w:val="24"/>
-        </w:rPr>
-        <w:t>kNN</w:t>
-      </w:r>
-      <w:proofErr w:type="spellEnd"/>
-      <w:r>
-        <w:rPr>
-          <w:rFonts w:ascii="Arial" w:hAnsi="Arial" w:cs="Arial"/>
-          <w:sz w:val="24"/>
-          <w:szCs w:val="24"/>
-        </w:rPr>
-        <w:t xml:space="preserve">) classifier, implemented from first principles in NumPy, can predict online purchase intent from session-level web analytics. Using the UCI Online Shoppers Purchasing Intention dataset (12,330 sessions, 17 features, </w:t>
+        <w:t xml:space="preserve">This capstone investigates whether a k-Nearest Neighbors (kNN) classifier, implemented from first principles in NumPy, can predict online purchase intent from session-level web analytics. Using the UCI Online Shoppers Purchasing Intention dataset (12,330 sessions, 17 features, </w:t>
       </w:r>
       <w:r>
         <w:rPr>
@@ -717,70 +699,26 @@
           <w:sz w:val="24"/>
           <w:szCs w:val="24"/>
         </w:rPr>
-        <w:t xml:space="preserve"> covering exploratory analysis, one-hot encoding, stratified train/test splitting, train-only standardization, hand-coded </w:t>
-      </w:r>
-      <w:proofErr w:type="spellStart"/>
-      <w:r>
-        <w:rPr>
-          <w:rFonts w:ascii="Arial" w:hAnsi="Arial" w:cs="Arial"/>
-          <w:sz w:val="24"/>
-          <w:szCs w:val="24"/>
-        </w:rPr>
-        <w:t>kNN</w:t>
-      </w:r>
-      <w:proofErr w:type="spellEnd"/>
-      <w:r>
-        <w:rPr>
-          <w:rFonts w:ascii="Arial" w:hAnsi="Arial" w:cs="Arial"/>
-          <w:sz w:val="24"/>
-          <w:szCs w:val="24"/>
-        </w:rPr>
-        <w:t xml:space="preserve"> with majority-vote prediction, and exhaustive tuning of k from 1 to 30. The final model (k = 7, Euclidean distance) achieved 87.67% accuracy, 0.6974 precision, 0.3570 recall, and 0.4722 F1 on a held-out test set, validated by 5-fold stratified cross-validation. </w:t>
-      </w:r>
-      <w:r>
-        <w:rPr>
-          <w:rFonts w:ascii="Arial" w:hAnsi="Arial" w:cs="Arial"/>
-          <w:sz w:val="24"/>
-          <w:szCs w:val="24"/>
-        </w:rPr>
-        <w:t xml:space="preserve">The model decisively outperformed a majority-class baseline (zero recall), but a single-feature rule on </w:t>
-      </w:r>
-      <w:proofErr w:type="spellStart"/>
-      <w:r>
-        <w:rPr>
-          <w:rFonts w:ascii="Arial" w:hAnsi="Arial" w:cs="Arial"/>
-          <w:sz w:val="24"/>
-          <w:szCs w:val="24"/>
-        </w:rPr>
-        <w:t>PageValues</w:t>
-      </w:r>
-      <w:proofErr w:type="spellEnd"/>
-      <w:r>
-        <w:rPr>
-          <w:rFonts w:ascii="Arial" w:hAnsi="Arial" w:cs="Arial"/>
-          <w:sz w:val="24"/>
-          <w:szCs w:val="24"/>
-        </w:rPr>
-        <w:t xml:space="preserve"> outperformed the </w:t>
-      </w:r>
-      <w:proofErr w:type="spellStart"/>
-      <w:r>
-        <w:rPr>
-          <w:rFonts w:ascii="Arial" w:hAnsi="Arial" w:cs="Arial"/>
-          <w:sz w:val="24"/>
-          <w:szCs w:val="24"/>
-        </w:rPr>
-        <w:t>kNN</w:t>
-      </w:r>
-      <w:proofErr w:type="spellEnd"/>
-      <w:r>
-        <w:rPr>
-          <w:rFonts w:ascii="Arial" w:hAnsi="Arial" w:cs="Arial"/>
-          <w:sz w:val="24"/>
-          <w:szCs w:val="24"/>
-        </w:rPr>
-        <w:t xml:space="preserve"> on F1 and recall — a result this report examines rather than hides.</w:t>
-      </w:r>
+        <w:t xml:space="preserve"> covering exploratory analysis, one-hot encoding, stratified train/test splitting, train-only standardization, hand-coded kNN with majority-vote prediction, and exhaustive tuning of k from 1 to 30. The final model (k = 7, Euclidean distance) achieved 87.67% accuracy, 0.6974 precision, 0.3570 recall, and 0.4722 F1 on a held-out test set, validated by 5-fold stratified cross-validation. </w:t>
+      </w:r>
+      <w:r>
+        <w:rPr>
+          <w:rFonts w:ascii="Arial" w:hAnsi="Arial" w:cs="Arial"/>
+          <w:sz w:val="24"/>
+          <w:szCs w:val="24"/>
+        </w:rPr>
+        <w:t xml:space="preserve">The model decisively outperformed a majority-class baseline (zero recall), but a single-feature rule on PageValues outperformed the kNN on F1 and </w:t>
+      </w:r>
+      <w:proofErr w:type="gramStart"/>
+      <w:r>
+        <w:rPr>
+          <w:rFonts w:ascii="Arial" w:hAnsi="Arial" w:cs="Arial"/>
+          <w:sz w:val="24"/>
+          <w:szCs w:val="24"/>
+        </w:rPr>
+        <w:t>recall —</w:t>
+      </w:r>
+      <w:proofErr w:type="gramEnd"/>
       <w:r>
         <w:rPr>
           <w:rFonts w:ascii="Arial" w:hAnsi="Arial" w:cs="Arial"/>
@@ -789,85 +727,75 @@
         </w:rPr>
         <w:t xml:space="preserve"> </w:t>
       </w:r>
-      <w:r>
-        <w:rPr>
-          <w:rFonts w:ascii="Arial" w:hAnsi="Arial" w:cs="Arial"/>
-          <w:sz w:val="24"/>
-          <w:szCs w:val="24"/>
-        </w:rPr>
-        <w:t xml:space="preserve">The dominant predictors were </w:t>
-      </w:r>
-      <w:proofErr w:type="spellStart"/>
-      <w:r>
-        <w:rPr>
-          <w:rFonts w:ascii="Arial" w:hAnsi="Arial" w:cs="Arial"/>
-          <w:sz w:val="24"/>
-          <w:szCs w:val="24"/>
-        </w:rPr>
-        <w:t>PageValues</w:t>
-      </w:r>
-      <w:proofErr w:type="spellEnd"/>
-      <w:r>
-        <w:rPr>
-          <w:rFonts w:ascii="Arial" w:hAnsi="Arial" w:cs="Arial"/>
-          <w:sz w:val="24"/>
-          <w:szCs w:val="24"/>
-        </w:rPr>
-        <w:t xml:space="preserve">, </w:t>
-      </w:r>
-      <w:proofErr w:type="spellStart"/>
-      <w:r>
-        <w:rPr>
-          <w:rFonts w:ascii="Arial" w:hAnsi="Arial" w:cs="Arial"/>
-          <w:sz w:val="24"/>
-          <w:szCs w:val="24"/>
-        </w:rPr>
-        <w:t>BounceRates</w:t>
-      </w:r>
-      <w:proofErr w:type="spellEnd"/>
-      <w:r>
-        <w:rPr>
-          <w:rFonts w:ascii="Arial" w:hAnsi="Arial" w:cs="Arial"/>
-          <w:sz w:val="24"/>
-          <w:szCs w:val="24"/>
-        </w:rPr>
-        <w:t xml:space="preserve">, visit Month (especially November), and </w:t>
-      </w:r>
-      <w:proofErr w:type="spellStart"/>
-      <w:r>
-        <w:rPr>
-          <w:rFonts w:ascii="Arial" w:hAnsi="Arial" w:cs="Arial"/>
-          <w:sz w:val="24"/>
-          <w:szCs w:val="24"/>
-        </w:rPr>
-        <w:t>VisitorType</w:t>
-      </w:r>
-      <w:proofErr w:type="spellEnd"/>
-      <w:r>
-        <w:rPr>
-          <w:rFonts w:ascii="Arial" w:hAnsi="Arial" w:cs="Arial"/>
-          <w:sz w:val="24"/>
-          <w:szCs w:val="24"/>
-        </w:rPr>
-        <w:t xml:space="preserve">. The most honest finding of the project is that the model’s low recall (it misses ~64% of actual buyers) is not a coding bug but a structural consequence of severe class imbalance combined with </w:t>
-      </w:r>
-      <w:proofErr w:type="spellStart"/>
-      <w:r>
-        <w:rPr>
-          <w:rFonts w:ascii="Arial" w:hAnsi="Arial" w:cs="Arial"/>
-          <w:sz w:val="24"/>
-          <w:szCs w:val="24"/>
-        </w:rPr>
-        <w:t>kNN’s</w:t>
-      </w:r>
-      <w:proofErr w:type="spellEnd"/>
-      <w:r>
-        <w:rPr>
-          <w:rFonts w:ascii="Arial" w:hAnsi="Arial" w:cs="Arial"/>
-          <w:sz w:val="24"/>
-          <w:szCs w:val="24"/>
-        </w:rPr>
-        <w:t xml:space="preserve"> majority-vote behavior — a result this report deliberately surfaces rather than hides.</w:t>
+      <w:proofErr w:type="gramStart"/>
+      <w:r>
+        <w:rPr>
+          <w:rFonts w:ascii="Arial" w:hAnsi="Arial" w:cs="Arial"/>
+          <w:sz w:val="24"/>
+          <w:szCs w:val="24"/>
+        </w:rPr>
+        <w:t>a result</w:t>
+      </w:r>
+      <w:proofErr w:type="gramEnd"/>
+      <w:r>
+        <w:rPr>
+          <w:rFonts w:ascii="Arial" w:hAnsi="Arial" w:cs="Arial"/>
+          <w:sz w:val="24"/>
+          <w:szCs w:val="24"/>
+        </w:rPr>
+        <w:t xml:space="preserve"> this report examines rather than hides.</w:t>
+      </w:r>
+      <w:r>
+        <w:rPr>
+          <w:rFonts w:ascii="Arial" w:hAnsi="Arial" w:cs="Arial"/>
+          <w:sz w:val="24"/>
+          <w:szCs w:val="24"/>
+        </w:rPr>
+        <w:t xml:space="preserve"> </w:t>
+      </w:r>
+      <w:r>
+        <w:rPr>
+          <w:rFonts w:ascii="Arial" w:hAnsi="Arial" w:cs="Arial"/>
+          <w:sz w:val="24"/>
+          <w:szCs w:val="24"/>
+        </w:rPr>
+        <w:t xml:space="preserve">The dominant predictors were PageValues, BounceRates, </w:t>
+      </w:r>
+      <w:proofErr w:type="gramStart"/>
+      <w:r>
+        <w:rPr>
+          <w:rFonts w:ascii="Arial" w:hAnsi="Arial" w:cs="Arial"/>
+          <w:sz w:val="24"/>
+          <w:szCs w:val="24"/>
+        </w:rPr>
+        <w:t>visit</w:t>
+      </w:r>
+      <w:proofErr w:type="gramEnd"/>
+      <w:r>
+        <w:rPr>
+          <w:rFonts w:ascii="Arial" w:hAnsi="Arial" w:cs="Arial"/>
+          <w:sz w:val="24"/>
+          <w:szCs w:val="24"/>
+        </w:rPr>
+        <w:t xml:space="preserve"> Month (especially November), and VisitorType. The most honest finding of the project is that the model’s low recall (it misses ~64% of actual buyers) is not a coding </w:t>
+      </w:r>
+      <w:proofErr w:type="gramStart"/>
+      <w:r>
+        <w:rPr>
+          <w:rFonts w:ascii="Arial" w:hAnsi="Arial" w:cs="Arial"/>
+          <w:sz w:val="24"/>
+          <w:szCs w:val="24"/>
+        </w:rPr>
+        <w:t>bug</w:t>
+      </w:r>
+      <w:proofErr w:type="gramEnd"/>
+      <w:r>
+        <w:rPr>
+          <w:rFonts w:ascii="Arial" w:hAnsi="Arial" w:cs="Arial"/>
+          <w:sz w:val="24"/>
+          <w:szCs w:val="24"/>
+        </w:rPr>
+        <w:t xml:space="preserve"> but a structural consequence of severe class imbalance combined with kNN’s majority-vote behavior — a result this report deliberately surfaces rather than hides.</w:t>
       </w:r>
     </w:p>
     <w:p>
@@ -951,7 +879,25 @@
           <w:sz w:val="24"/>
           <w:szCs w:val="24"/>
         </w:rPr>
-        <w:t>E-commerce platforms generate millions of clickstream sessions per day, yet only a small fraction culminate in a purchase. Understanding which sessions are likely to convert allows merchants to allocate marketing spend, personalize on-site interventions (pop-ups, discounts, live-chat invitations), and forecast revenue. Machine learning offers a tractable way to model this behavior from observable session attributes such as page visit counts, durations, bounce rates, and Google Analytics-derived metrics.</w:t>
+        <w:t xml:space="preserve">E-commerce platforms generate millions of clickstream sessions per day, yet only a small fraction culminate in a purchase. Understanding which sessions are likely to convert allows merchants to allocate marketing </w:t>
+      </w:r>
+      <w:proofErr w:type="gramStart"/>
+      <w:r>
+        <w:rPr>
+          <w:rFonts w:ascii="Arial" w:hAnsi="Arial" w:cs="Arial"/>
+          <w:sz w:val="24"/>
+          <w:szCs w:val="24"/>
+        </w:rPr>
+        <w:t>spend</w:t>
+      </w:r>
+      <w:proofErr w:type="gramEnd"/>
+      <w:r>
+        <w:rPr>
+          <w:rFonts w:ascii="Arial" w:hAnsi="Arial" w:cs="Arial"/>
+          <w:sz w:val="24"/>
+          <w:szCs w:val="24"/>
+        </w:rPr>
+        <w:t>, personalize on-site interventions (pop-ups, discounts, live-chat invitations), and forecast revenue. Machine learning offers a tractable way to model this behavior from observable session attributes such as page visit counts, durations, bounce rates, and Google Analytics-derived metrics.</w:t>
       </w:r>
     </w:p>
     <w:p>
@@ -1069,7 +1015,25 @@
           <w:sz w:val="24"/>
           <w:szCs w:val="24"/>
         </w:rPr>
-        <w:t>Implement the full machine-learning pipeline in order to demonstrate genuine algorithmic understanding.</w:t>
+        <w:t xml:space="preserve">Implement the full machine-learning pipeline </w:t>
+      </w:r>
+      <w:proofErr w:type="gramStart"/>
+      <w:r>
+        <w:rPr>
+          <w:rFonts w:ascii="Arial" w:hAnsi="Arial" w:cs="Arial"/>
+          <w:sz w:val="24"/>
+          <w:szCs w:val="24"/>
+        </w:rPr>
+        <w:t>in order to</w:t>
+      </w:r>
+      <w:proofErr w:type="gramEnd"/>
+      <w:r>
+        <w:rPr>
+          <w:rFonts w:ascii="Arial" w:hAnsi="Arial" w:cs="Arial"/>
+          <w:sz w:val="24"/>
+          <w:szCs w:val="24"/>
+        </w:rPr>
+        <w:t xml:space="preserve"> demonstrate genuine algorithmic understanding.</w:t>
       </w:r>
     </w:p>
     <w:p>
@@ -1288,7 +1252,25 @@
           <w:sz w:val="24"/>
           <w:szCs w:val="24"/>
         </w:rPr>
-        <w:t>k-Nearest Neighbors is a non-parametric, instance-based ("lazy") learning algorithm. Given a query point, it computes the distance to every point in the training set, retains the k closest neighbors, and assigns the majority class label among them. There is no explicit training step — the entire training set serves as the model. Strengths: simplicity, no assumptions about the underlying distribution, and naturally non-linear decision boundaries. Weaknesses: O(n · d) prediction cost per query, sensitivity to feature scaling, the curse of dimensionality, and sensitivity to class imbalance.</w:t>
+        <w:t xml:space="preserve">k-Nearest Neighbors is a non-parametric, instance-based ("lazy") learning algorithm. Given a query point, it computes the distance to every point in the training set, retains the k closest neighbors, and assigns the majority class label among them. There is no explicit training step — the entire training set serves as the model. Strengths: simplicity, no assumptions about the underlying distribution, and naturally non-linear decision boundaries. Weaknesses: </w:t>
+      </w:r>
+      <w:proofErr w:type="gramStart"/>
+      <w:r>
+        <w:rPr>
+          <w:rFonts w:ascii="Arial" w:hAnsi="Arial" w:cs="Arial"/>
+          <w:sz w:val="24"/>
+          <w:szCs w:val="24"/>
+        </w:rPr>
+        <w:t>O(</w:t>
+      </w:r>
+      <w:proofErr w:type="gramEnd"/>
+      <w:r>
+        <w:rPr>
+          <w:rFonts w:ascii="Arial" w:hAnsi="Arial" w:cs="Arial"/>
+          <w:sz w:val="24"/>
+          <w:szCs w:val="24"/>
+        </w:rPr>
+        <w:t>n · d) prediction cost per query, sensitivity to feature scaling, the curse of dimensionality, and sensitivity to class imbalance.</w:t>
       </w:r>
     </w:p>
     <w:p>
@@ -1533,8 +1515,19 @@
           <w:sz w:val="24"/>
           <w:szCs w:val="24"/>
         </w:rPr>
-        <w:t>The Dataset in the Literature</w:t>
-      </w:r>
+        <w:t xml:space="preserve">The Dataset in </w:t>
+      </w:r>
+      <w:proofErr w:type="gramStart"/>
+      <w:r>
+        <w:rPr>
+          <w:rFonts w:ascii="Arial" w:hAnsi="Arial" w:cs="Arial"/>
+          <w:color w:val="auto"/>
+          <w:sz w:val="24"/>
+          <w:szCs w:val="24"/>
+        </w:rPr>
+        <w:t>the Literature</w:t>
+      </w:r>
+      <w:proofErr w:type="gramEnd"/>
     </w:p>
     <w:p>
       <w:pPr>
@@ -1553,25 +1546,7 @@
           <w:sz w:val="24"/>
           <w:szCs w:val="24"/>
         </w:rPr>
-        <w:t xml:space="preserve">The Online Shoppers Purchasing Intention dataset was introduced by Sakar et al. (2019) for real-time purchase prediction. Their original work compared multilayer </w:t>
-      </w:r>
-      <w:proofErr w:type="spellStart"/>
-      <w:r>
-        <w:rPr>
-          <w:rFonts w:ascii="Arial" w:hAnsi="Arial" w:cs="Arial"/>
-          <w:sz w:val="24"/>
-          <w:szCs w:val="24"/>
-        </w:rPr>
-        <w:t>perceptrons</w:t>
-      </w:r>
-      <w:proofErr w:type="spellEnd"/>
-      <w:r>
-        <w:rPr>
-          <w:rFonts w:ascii="Arial" w:hAnsi="Arial" w:cs="Arial"/>
-          <w:sz w:val="24"/>
-          <w:szCs w:val="24"/>
-        </w:rPr>
-        <w:t xml:space="preserve"> and LSTM recurrent networks. Subsequent benchmark studies have applied logistic regression, decision trees, random forests, gradient boosting, and SVMs, with reported F1 scores typically in the 0.55–0.65 range when class-imbalance handling is applied. This capstone deliberately uses a simpler model to make the algorithmic mechanics visible, accepting that the absolute score will trail tuned ensemble methods.</w:t>
+        <w:t>The Online Shoppers Purchasing Intention dataset was introduced by Sakar et al. (2019) for real-time purchase prediction. Their original work compared multilayer perceptrons and LSTM recurrent networks. Subsequent benchmark studies have applied logistic regression, decision trees, random forests, gradient boosting, and SVMs, with reported F1 scores typically in the 0.55–0.65 range when class-imbalance handling is applied. This capstone deliberately uses a simpler model to make the algorithmic mechanics visible, accepting that the absolute score will trail tuned ensemble methods.</w:t>
       </w:r>
     </w:p>
     <w:p>
@@ -1715,7 +1690,25 @@
           <w:sz w:val="24"/>
           <w:szCs w:val="24"/>
         </w:rPr>
-        <w:t>Target: Revenue (Boolean) — True if the session ended with a purchase.</w:t>
+        <w:t>Target: Revenue (</w:t>
+      </w:r>
+      <w:proofErr w:type="gramStart"/>
+      <w:r>
+        <w:rPr>
+          <w:rFonts w:ascii="Arial" w:hAnsi="Arial" w:cs="Arial"/>
+          <w:sz w:val="24"/>
+          <w:szCs w:val="24"/>
+        </w:rPr>
+        <w:t>Boolean) —</w:t>
+      </w:r>
+      <w:proofErr w:type="gramEnd"/>
+      <w:r>
+        <w:rPr>
+          <w:rFonts w:ascii="Arial" w:hAnsi="Arial" w:cs="Arial"/>
+          <w:sz w:val="24"/>
+          <w:szCs w:val="24"/>
+        </w:rPr>
+        <w:t xml:space="preserve"> True if the session ended with a purchase.</w:t>
       </w:r>
     </w:p>
     <w:p>
@@ -1735,7 +1728,25 @@
           <w:sz w:val="24"/>
           <w:szCs w:val="24"/>
         </w:rPr>
-        <w:t>Class distribution: 10,422 No-Purchase (84.53%) vs. 1,908 Purchase (15.47%) — a 5.46 : 1 imbalance ratio.</w:t>
+        <w:t xml:space="preserve">Class distribution: 10,422 No-Purchase (84.53%) vs. 1,908 Purchase (15.47%) — a </w:t>
+      </w:r>
+      <w:proofErr w:type="gramStart"/>
+      <w:r>
+        <w:rPr>
+          <w:rFonts w:ascii="Arial" w:hAnsi="Arial" w:cs="Arial"/>
+          <w:sz w:val="24"/>
+          <w:szCs w:val="24"/>
+        </w:rPr>
+        <w:t>5.46 :</w:t>
+      </w:r>
+      <w:proofErr w:type="gramEnd"/>
+      <w:r>
+        <w:rPr>
+          <w:rFonts w:ascii="Arial" w:hAnsi="Arial" w:cs="Arial"/>
+          <w:sz w:val="24"/>
+          <w:szCs w:val="24"/>
+        </w:rPr>
+        <w:t xml:space="preserve"> 1 imbalance ratio.</w:t>
       </w:r>
     </w:p>
     <w:p>
@@ -1919,18 +1930,8 @@
                 <w:sz w:val="24"/>
                 <w:szCs w:val="24"/>
               </w:rPr>
-              <w:t xml:space="preserve">Administrative, Informational, </w:t>
+              <w:t>Administrative, Informational, ProductRelated</w:t>
             </w:r>
-            <w:proofErr w:type="spellStart"/>
-            <w:r>
-              <w:rPr>
-                <w:rFonts w:ascii="Arial" w:hAnsi="Arial" w:cs="Arial"/>
-                <w:sz w:val="24"/>
-                <w:szCs w:val="24"/>
-              </w:rPr>
-              <w:t>ProductRelated</w:t>
-            </w:r>
-            <w:proofErr w:type="spellEnd"/>
           </w:p>
         </w:tc>
         <w:tc>
@@ -2083,52 +2084,14 @@
                 <w:szCs w:val="24"/>
               </w:rPr>
             </w:pPr>
-            <w:proofErr w:type="spellStart"/>
             <w:r>
               <w:rPr>
                 <w:rFonts w:ascii="Arial" w:hAnsi="Arial" w:cs="Arial"/>
                 <w:sz w:val="24"/>
                 <w:szCs w:val="24"/>
               </w:rPr>
-              <w:t>BounceRates</w:t>
+              <w:t>BounceRates, ExitRates, PageValues</w:t>
             </w:r>
-            <w:proofErr w:type="spellEnd"/>
-            <w:r>
-              <w:rPr>
-                <w:rFonts w:ascii="Arial" w:hAnsi="Arial" w:cs="Arial"/>
-                <w:sz w:val="24"/>
-                <w:szCs w:val="24"/>
-              </w:rPr>
-              <w:t xml:space="preserve">, </w:t>
-            </w:r>
-            <w:proofErr w:type="spellStart"/>
-            <w:r>
-              <w:rPr>
-                <w:rFonts w:ascii="Arial" w:hAnsi="Arial" w:cs="Arial"/>
-                <w:sz w:val="24"/>
-                <w:szCs w:val="24"/>
-              </w:rPr>
-              <w:t>ExitRates</w:t>
-            </w:r>
-            <w:proofErr w:type="spellEnd"/>
-            <w:r>
-              <w:rPr>
-                <w:rFonts w:ascii="Arial" w:hAnsi="Arial" w:cs="Arial"/>
-                <w:sz w:val="24"/>
-                <w:szCs w:val="24"/>
-              </w:rPr>
-              <w:t xml:space="preserve">, </w:t>
-            </w:r>
-            <w:proofErr w:type="spellStart"/>
-            <w:r>
-              <w:rPr>
-                <w:rFonts w:ascii="Arial" w:hAnsi="Arial" w:cs="Arial"/>
-                <w:sz w:val="24"/>
-                <w:szCs w:val="24"/>
-              </w:rPr>
-              <w:t>PageValues</w:t>
-            </w:r>
-            <w:proofErr w:type="spellEnd"/>
           </w:p>
         </w:tc>
         <w:tc>
@@ -2152,25 +2115,7 @@
                 <w:sz w:val="24"/>
                 <w:szCs w:val="24"/>
               </w:rPr>
-              <w:t xml:space="preserve">Site analytics; </w:t>
-            </w:r>
-            <w:proofErr w:type="spellStart"/>
-            <w:r>
-              <w:rPr>
-                <w:rFonts w:ascii="Arial" w:hAnsi="Arial" w:cs="Arial"/>
-                <w:sz w:val="24"/>
-                <w:szCs w:val="24"/>
-              </w:rPr>
-              <w:t>PageValues</w:t>
-            </w:r>
-            <w:proofErr w:type="spellEnd"/>
-            <w:r>
-              <w:rPr>
-                <w:rFonts w:ascii="Arial" w:hAnsi="Arial" w:cs="Arial"/>
-                <w:sz w:val="24"/>
-                <w:szCs w:val="24"/>
-              </w:rPr>
-              <w:t xml:space="preserve"> correlates with revenue.</w:t>
+              <w:t>Site analytics; PageValues correlates with revenue.</w:t>
             </w:r>
           </w:p>
         </w:tc>
@@ -2219,23 +2164,13 @@
                 <w:szCs w:val="24"/>
               </w:rPr>
             </w:pPr>
-            <w:proofErr w:type="spellStart"/>
             <w:r>
               <w:rPr>
                 <w:rFonts w:ascii="Arial" w:hAnsi="Arial" w:cs="Arial"/>
                 <w:sz w:val="24"/>
                 <w:szCs w:val="24"/>
               </w:rPr>
-              <w:t>SpecialDay</w:t>
-            </w:r>
-            <w:proofErr w:type="spellEnd"/>
-            <w:r>
-              <w:rPr>
-                <w:rFonts w:ascii="Arial" w:hAnsi="Arial" w:cs="Arial"/>
-                <w:sz w:val="24"/>
-                <w:szCs w:val="24"/>
-              </w:rPr>
-              <w:t>, Month</w:t>
+              <w:t>SpecialDay, Month</w:t>
             </w:r>
           </w:p>
         </w:tc>
@@ -2309,7 +2244,7 @@
                 <w:szCs w:val="24"/>
               </w:rPr>
             </w:pPr>
-            <w:proofErr w:type="spellStart"/>
+            <w:proofErr w:type="gramStart"/>
             <w:r>
               <w:rPr>
                 <w:rFonts w:ascii="Arial" w:hAnsi="Arial" w:cs="Arial"/>
@@ -2318,25 +2253,15 @@
               </w:rPr>
               <w:t>OperatingSystems</w:t>
             </w:r>
-            <w:proofErr w:type="spellEnd"/>
+            <w:proofErr w:type="gramEnd"/>
             <w:r>
               <w:rPr>
                 <w:rFonts w:ascii="Arial" w:hAnsi="Arial" w:cs="Arial"/>
                 <w:sz w:val="24"/>
                 <w:szCs w:val="24"/>
               </w:rPr>
-              <w:t xml:space="preserve">, Browser, Region, </w:t>
+              <w:t>, Browser, Region, TrafficType</w:t>
             </w:r>
-            <w:proofErr w:type="spellStart"/>
-            <w:r>
-              <w:rPr>
-                <w:rFonts w:ascii="Arial" w:hAnsi="Arial" w:cs="Arial"/>
-                <w:sz w:val="24"/>
-                <w:szCs w:val="24"/>
-              </w:rPr>
-              <w:t>TrafficType</w:t>
-            </w:r>
-            <w:proofErr w:type="spellEnd"/>
           </w:p>
         </w:tc>
         <w:tc>
@@ -2409,23 +2334,13 @@
                 <w:szCs w:val="24"/>
               </w:rPr>
             </w:pPr>
-            <w:proofErr w:type="spellStart"/>
             <w:r>
               <w:rPr>
                 <w:rFonts w:ascii="Arial" w:hAnsi="Arial" w:cs="Arial"/>
                 <w:sz w:val="24"/>
                 <w:szCs w:val="24"/>
               </w:rPr>
-              <w:t>VisitorType</w:t>
-            </w:r>
-            <w:proofErr w:type="spellEnd"/>
-            <w:r>
-              <w:rPr>
-                <w:rFonts w:ascii="Arial" w:hAnsi="Arial" w:cs="Arial"/>
-                <w:sz w:val="24"/>
-                <w:szCs w:val="24"/>
-              </w:rPr>
-              <w:t>, Weekend</w:t>
+              <w:t>VisitorType, Weekend</w:t>
             </w:r>
           </w:p>
         </w:tc>
@@ -2506,25 +2421,7 @@
           <w:sz w:val="24"/>
           <w:szCs w:val="24"/>
         </w:rPr>
-        <w:t xml:space="preserve">No missing values were detected after loading. All numerical features are non-negative. The two categorical text columns (Month, </w:t>
-      </w:r>
-      <w:proofErr w:type="spellStart"/>
-      <w:r>
-        <w:rPr>
-          <w:rFonts w:ascii="Arial" w:hAnsi="Arial" w:cs="Arial"/>
-          <w:sz w:val="24"/>
-          <w:szCs w:val="24"/>
-        </w:rPr>
-        <w:t>VisitorType</w:t>
-      </w:r>
-      <w:proofErr w:type="spellEnd"/>
-      <w:r>
-        <w:rPr>
-          <w:rFonts w:ascii="Arial" w:hAnsi="Arial" w:cs="Arial"/>
-          <w:sz w:val="24"/>
-          <w:szCs w:val="24"/>
-        </w:rPr>
-        <w:t>) were one-hot encoded into 13 binary indicators, raising the final feature count to 28. The Weekend and Revenue Booleans were cast to 0 / 1 integers.</w:t>
+        <w:t>No missing values were detected after loading. All numerical features are non-negative. The two categorical text columns (Month, VisitorType) were one-hot encoded into 13 binary indicators, raising the final feature count to 28. The Weekend and Revenue Booleans were cast to 0 / 1 integers.</w:t>
       </w:r>
     </w:p>
     <w:p>
@@ -2732,95 +2629,31 @@
           <w:szCs w:val="24"/>
         </w:rPr>
       </w:pPr>
-      <w:proofErr w:type="spellStart"/>
-      <w:r>
-        <w:rPr>
-          <w:rFonts w:ascii="Arial" w:hAnsi="Arial" w:cs="Arial"/>
-          <w:sz w:val="24"/>
-          <w:szCs w:val="24"/>
-        </w:rPr>
-        <w:t>BounceRates</w:t>
-      </w:r>
-      <w:proofErr w:type="spellEnd"/>
-      <w:r>
-        <w:rPr>
-          <w:rFonts w:ascii="Arial" w:hAnsi="Arial" w:cs="Arial"/>
-          <w:sz w:val="24"/>
-          <w:szCs w:val="24"/>
-        </w:rPr>
-        <w:t xml:space="preserve"> and </w:t>
-      </w:r>
-      <w:proofErr w:type="spellStart"/>
-      <w:r>
-        <w:rPr>
-          <w:rFonts w:ascii="Arial" w:hAnsi="Arial" w:cs="Arial"/>
-          <w:sz w:val="24"/>
-          <w:szCs w:val="24"/>
-        </w:rPr>
-        <w:t>ExitRates</w:t>
-      </w:r>
-      <w:proofErr w:type="spellEnd"/>
-      <w:r>
-        <w:rPr>
-          <w:rFonts w:ascii="Arial" w:hAnsi="Arial" w:cs="Arial"/>
-          <w:sz w:val="24"/>
-          <w:szCs w:val="24"/>
-        </w:rPr>
-        <w:t xml:space="preserve"> are correlated at r = 0.913 — effectively duplicates. </w:t>
-      </w:r>
-      <w:proofErr w:type="spellStart"/>
-      <w:r>
-        <w:rPr>
-          <w:rFonts w:ascii="Arial" w:hAnsi="Arial" w:cs="Arial"/>
-          <w:sz w:val="24"/>
-          <w:szCs w:val="24"/>
-        </w:rPr>
-        <w:t>ProductRelated</w:t>
-      </w:r>
-      <w:proofErr w:type="spellEnd"/>
-      <w:r>
-        <w:rPr>
-          <w:rFonts w:ascii="Arial" w:hAnsi="Arial" w:cs="Arial"/>
-          <w:sz w:val="24"/>
-          <w:szCs w:val="24"/>
-        </w:rPr>
-        <w:t xml:space="preserve"> and </w:t>
-      </w:r>
-      <w:proofErr w:type="spellStart"/>
-      <w:r>
-        <w:rPr>
-          <w:rFonts w:ascii="Arial" w:hAnsi="Arial" w:cs="Arial"/>
-          <w:sz w:val="24"/>
-          <w:szCs w:val="24"/>
-        </w:rPr>
-        <w:t>ProductRelated_Duration</w:t>
-      </w:r>
-      <w:proofErr w:type="spellEnd"/>
-      <w:r>
-        <w:rPr>
-          <w:rFonts w:ascii="Arial" w:hAnsi="Arial" w:cs="Arial"/>
-          <w:sz w:val="24"/>
-          <w:szCs w:val="24"/>
-        </w:rPr>
-        <w:t xml:space="preserve"> correlate at r = 0.861. These near-duplicates will give those behaviors double weight inside the </w:t>
-      </w:r>
-      <w:proofErr w:type="spellStart"/>
-      <w:r>
-        <w:rPr>
-          <w:rFonts w:ascii="Arial" w:hAnsi="Arial" w:cs="Arial"/>
-          <w:sz w:val="24"/>
-          <w:szCs w:val="24"/>
-        </w:rPr>
-        <w:t>kNN</w:t>
-      </w:r>
-      <w:proofErr w:type="spellEnd"/>
-      <w:r>
-        <w:rPr>
-          <w:rFonts w:ascii="Arial" w:hAnsi="Arial" w:cs="Arial"/>
-          <w:sz w:val="24"/>
-          <w:szCs w:val="24"/>
-        </w:rPr>
-        <w:t xml:space="preserve"> distance calculation, an issue the Limitations section returns to.</w:t>
+      <w:r>
+        <w:rPr>
+          <w:rFonts w:ascii="Arial" w:hAnsi="Arial" w:cs="Arial"/>
+          <w:sz w:val="24"/>
+          <w:szCs w:val="24"/>
+        </w:rPr>
+        <w:t xml:space="preserve">BounceRates and ExitRates are correlated at r = 0.913 — effectively duplicates. ProductRelated and ProductRelated_Duration correlate at r = 0.861. These </w:t>
+      </w:r>
+      <w:proofErr w:type="gramStart"/>
+      <w:r>
+        <w:rPr>
+          <w:rFonts w:ascii="Arial" w:hAnsi="Arial" w:cs="Arial"/>
+          <w:sz w:val="24"/>
+          <w:szCs w:val="24"/>
+        </w:rPr>
+        <w:t>near-duplicates</w:t>
+      </w:r>
+      <w:proofErr w:type="gramEnd"/>
+      <w:r>
+        <w:rPr>
+          <w:rFonts w:ascii="Arial" w:hAnsi="Arial" w:cs="Arial"/>
+          <w:sz w:val="24"/>
+          <w:szCs w:val="24"/>
+        </w:rPr>
+        <w:t xml:space="preserve"> will give those behaviors double weight inside the kNN distance calculation, an issue the Limitations section returns to.</w:t>
       </w:r>
     </w:p>
     <w:p>
@@ -2909,7 +2742,6 @@
           <w:szCs w:val="24"/>
         </w:rPr>
       </w:pPr>
-      <w:proofErr w:type="spellStart"/>
       <w:r>
         <w:rPr>
           <w:rFonts w:ascii="Arial" w:hAnsi="Arial" w:cs="Arial"/>
@@ -2919,7 +2751,6 @@
         </w:rPr>
         <w:t>PageValues</w:t>
       </w:r>
-      <w:proofErr w:type="spellEnd"/>
     </w:p>
     <w:p>
       <w:pPr>
@@ -2932,23 +2763,13 @@
           <w:szCs w:val="24"/>
         </w:rPr>
       </w:pPr>
-      <w:proofErr w:type="spellStart"/>
-      <w:r>
-        <w:rPr>
-          <w:rFonts w:ascii="Arial" w:hAnsi="Arial" w:cs="Arial"/>
-          <w:sz w:val="24"/>
-          <w:szCs w:val="24"/>
-        </w:rPr>
-        <w:t>PageValues</w:t>
-      </w:r>
-      <w:proofErr w:type="spellEnd"/>
-      <w:r>
-        <w:rPr>
-          <w:rFonts w:ascii="Arial" w:hAnsi="Arial" w:cs="Arial"/>
-          <w:sz w:val="24"/>
-          <w:szCs w:val="24"/>
-        </w:rPr>
-        <w:t xml:space="preserve"> is the single most discriminative feature in the dataset. The mean for buyers (27.26) is 13.8× the mean for non-buyers (1.98); the </w:t>
+      <w:r>
+        <w:rPr>
+          <w:rFonts w:ascii="Arial" w:hAnsi="Arial" w:cs="Arial"/>
+          <w:sz w:val="24"/>
+          <w:szCs w:val="24"/>
+        </w:rPr>
+        <w:t xml:space="preserve">PageValues is the single most discriminative feature in the dataset. The mean for buyers (27.26) is 13.8× the mean for non-buyers (1.98); the </w:t>
       </w:r>
       <w:r>
         <w:rPr>
@@ -2957,25 +2778,7 @@
           <w:szCs w:val="24"/>
         </w:rPr>
         <w:lastRenderedPageBreak/>
-        <w:t xml:space="preserve">median for non-buyers is exactly 0. This kind of class separability is precisely what </w:t>
-      </w:r>
-      <w:proofErr w:type="spellStart"/>
-      <w:r>
-        <w:rPr>
-          <w:rFonts w:ascii="Arial" w:hAnsi="Arial" w:cs="Arial"/>
-          <w:sz w:val="24"/>
-          <w:szCs w:val="24"/>
-        </w:rPr>
-        <w:t>kNN</w:t>
-      </w:r>
-      <w:proofErr w:type="spellEnd"/>
-      <w:r>
-        <w:rPr>
-          <w:rFonts w:ascii="Arial" w:hAnsi="Arial" w:cs="Arial"/>
-          <w:sz w:val="24"/>
-          <w:szCs w:val="24"/>
-        </w:rPr>
-        <w:t xml:space="preserve"> exploits.</w:t>
+        <w:t>median for non-buyers is exactly 0. This kind of class separability is precisely what kNN exploits.</w:t>
       </w:r>
     </w:p>
     <w:p>
@@ -3050,27 +2853,7 @@
           <w:sz w:val="24"/>
           <w:szCs w:val="24"/>
         </w:rPr>
-        <w:t xml:space="preserve">Figure 3. </w:t>
-      </w:r>
-      <w:proofErr w:type="spellStart"/>
-      <w:r>
-        <w:rPr>
-          <w:rFonts w:ascii="Arial" w:hAnsi="Arial" w:cs="Arial"/>
-          <w:i/>
-          <w:sz w:val="24"/>
-          <w:szCs w:val="24"/>
-        </w:rPr>
-        <w:t>PageValues</w:t>
-      </w:r>
-      <w:proofErr w:type="spellEnd"/>
-      <w:r>
-        <w:rPr>
-          <w:rFonts w:ascii="Arial" w:hAnsi="Arial" w:cs="Arial"/>
-          <w:i/>
-          <w:sz w:val="24"/>
-          <w:szCs w:val="24"/>
-        </w:rPr>
-        <w:t xml:space="preserve"> by purchase outcome (full and zoomed views).</w:t>
+        <w:t>Figure 3. PageValues by purchase outcome (full and zoomed views).</w:t>
       </w:r>
     </w:p>
     <w:p>
@@ -3104,7 +2887,6 @@
           <w:szCs w:val="24"/>
         </w:rPr>
       </w:pPr>
-      <w:proofErr w:type="spellStart"/>
       <w:r>
         <w:rPr>
           <w:rFonts w:ascii="Arial" w:hAnsi="Arial" w:cs="Arial"/>
@@ -3115,7 +2897,6 @@
         <w:lastRenderedPageBreak/>
         <w:t>BounceRates</w:t>
       </w:r>
-      <w:proofErr w:type="spellEnd"/>
     </w:p>
     <w:p>
       <w:pPr>
@@ -3134,43 +2915,7 @@
           <w:sz w:val="24"/>
           <w:szCs w:val="24"/>
         </w:rPr>
-        <w:t xml:space="preserve">Non-buyers had a mean </w:t>
-      </w:r>
-      <w:proofErr w:type="spellStart"/>
-      <w:r>
-        <w:rPr>
-          <w:rFonts w:ascii="Arial" w:hAnsi="Arial" w:cs="Arial"/>
-          <w:sz w:val="24"/>
-          <w:szCs w:val="24"/>
-        </w:rPr>
-        <w:t>BounceRate</w:t>
-      </w:r>
-      <w:proofErr w:type="spellEnd"/>
-      <w:r>
-        <w:rPr>
-          <w:rFonts w:ascii="Arial" w:hAnsi="Arial" w:cs="Arial"/>
-          <w:sz w:val="24"/>
-          <w:szCs w:val="24"/>
-        </w:rPr>
-        <w:t xml:space="preserve"> roughly five times that of buyers (0.0253 vs. 0.0051). The median </w:t>
-      </w:r>
-      <w:proofErr w:type="spellStart"/>
-      <w:r>
-        <w:rPr>
-          <w:rFonts w:ascii="Arial" w:hAnsi="Arial" w:cs="Arial"/>
-          <w:sz w:val="24"/>
-          <w:szCs w:val="24"/>
-        </w:rPr>
-        <w:t>BounceRate</w:t>
-      </w:r>
-      <w:proofErr w:type="spellEnd"/>
-      <w:r>
-        <w:rPr>
-          <w:rFonts w:ascii="Arial" w:hAnsi="Arial" w:cs="Arial"/>
-          <w:sz w:val="24"/>
-          <w:szCs w:val="24"/>
-        </w:rPr>
-        <w:t xml:space="preserve"> for buyers is zero — buyers stay and engage; non-buyers drift in and out.</w:t>
+        <w:t>Non-buyers had a mean BounceRate roughly five times that of buyers (0.0253 vs. 0.0051). The median BounceRate for buyers is zero — buyers stay and engage; non-buyers drift in and out.</w:t>
       </w:r>
     </w:p>
     <w:p>
@@ -3244,27 +2989,7 @@
           <w:sz w:val="24"/>
           <w:szCs w:val="24"/>
         </w:rPr>
-        <w:t xml:space="preserve">Figure 4. </w:t>
-      </w:r>
-      <w:proofErr w:type="spellStart"/>
-      <w:r>
-        <w:rPr>
-          <w:rFonts w:ascii="Arial" w:hAnsi="Arial" w:cs="Arial"/>
-          <w:i/>
-          <w:sz w:val="24"/>
-          <w:szCs w:val="24"/>
-        </w:rPr>
-        <w:t>BounceRates</w:t>
-      </w:r>
-      <w:proofErr w:type="spellEnd"/>
-      <w:r>
-        <w:rPr>
-          <w:rFonts w:ascii="Arial" w:hAnsi="Arial" w:cs="Arial"/>
-          <w:i/>
-          <w:sz w:val="24"/>
-          <w:szCs w:val="24"/>
-        </w:rPr>
-        <w:t xml:space="preserve"> by purchase outcome.</w:t>
+        <w:t>Figure 4. BounceRates by purchase outcome.</w:t>
       </w:r>
     </w:p>
     <w:p>
@@ -3651,25 +3376,7 @@
           <w:sz w:val="24"/>
           <w:szCs w:val="24"/>
         </w:rPr>
-        <w:t xml:space="preserve"> — sanity check: shape, </w:t>
-      </w:r>
-      <w:proofErr w:type="spellStart"/>
-      <w:r>
-        <w:rPr>
-          <w:rFonts w:ascii="Arial" w:hAnsi="Arial" w:cs="Arial"/>
-          <w:sz w:val="24"/>
-          <w:szCs w:val="24"/>
-        </w:rPr>
-        <w:t>dtypes</w:t>
-      </w:r>
-      <w:proofErr w:type="spellEnd"/>
-      <w:r>
-        <w:rPr>
-          <w:rFonts w:ascii="Arial" w:hAnsi="Arial" w:cs="Arial"/>
-          <w:sz w:val="24"/>
-          <w:szCs w:val="24"/>
-        </w:rPr>
-        <w:t>, head, target counts.</w:t>
+        <w:t xml:space="preserve"> — sanity check: shape, dtypes, head, target counts.</w:t>
       </w:r>
     </w:p>
     <w:p>
@@ -3789,25 +3496,7 @@
           <w:sz w:val="24"/>
           <w:szCs w:val="24"/>
         </w:rPr>
-        <w:t xml:space="preserve"> — vectorized </w:t>
-      </w:r>
-      <w:proofErr w:type="spellStart"/>
-      <w:r>
-        <w:rPr>
-          <w:rFonts w:ascii="Arial" w:hAnsi="Arial" w:cs="Arial"/>
-          <w:sz w:val="24"/>
-          <w:szCs w:val="24"/>
-        </w:rPr>
-        <w:t>kNN</w:t>
-      </w:r>
-      <w:proofErr w:type="spellEnd"/>
-      <w:r>
-        <w:rPr>
-          <w:rFonts w:ascii="Arial" w:hAnsi="Arial" w:cs="Arial"/>
-          <w:sz w:val="24"/>
-          <w:szCs w:val="24"/>
-        </w:rPr>
-        <w:t xml:space="preserve"> classifier and evaluation harness.</w:t>
+        <w:t xml:space="preserve"> — vectorized kNN classifier and evaluation harness.</w:t>
       </w:r>
     </w:p>
     <w:p>
@@ -3926,25 +3615,7 @@
           <w:sz w:val="24"/>
           <w:szCs w:val="24"/>
         </w:rPr>
-        <w:t xml:space="preserve">Categorical Month and </w:t>
-      </w:r>
-      <w:proofErr w:type="spellStart"/>
-      <w:r>
-        <w:rPr>
-          <w:rFonts w:ascii="Arial" w:hAnsi="Arial" w:cs="Arial"/>
-          <w:sz w:val="24"/>
-          <w:szCs w:val="24"/>
-        </w:rPr>
-        <w:t>VisitorType</w:t>
-      </w:r>
-      <w:proofErr w:type="spellEnd"/>
-      <w:r>
-        <w:rPr>
-          <w:rFonts w:ascii="Arial" w:hAnsi="Arial" w:cs="Arial"/>
-          <w:sz w:val="24"/>
-          <w:szCs w:val="24"/>
-        </w:rPr>
-        <w:t xml:space="preserve"> columns were one-hot encoded with no dropped reference category, producing 13 new binary indicators. Boolean columns Weekend and Revenue were cast to integer 0 / 1. The resulting feature matrix has shape (12,330 × 28).</w:t>
+        <w:t>Categorical Month and VisitorType columns were one-hot encoded with no dropped reference category, producing 13 new binary indicators. Boolean columns Weekend and Revenue were cast to integer 0 / 1. The resulting feature matrix has shape (12,330 × 28).</w:t>
       </w:r>
     </w:p>
     <w:p>
@@ -4098,27 +3769,7 @@
           <w:szCs w:val="24"/>
         </w:rPr>
         <w:lastRenderedPageBreak/>
-        <w:t xml:space="preserve">The </w:t>
-      </w:r>
-      <w:proofErr w:type="spellStart"/>
-      <w:r>
-        <w:rPr>
-          <w:rFonts w:ascii="Arial" w:hAnsi="Arial" w:cs="Arial"/>
-          <w:color w:val="auto"/>
-          <w:sz w:val="24"/>
-          <w:szCs w:val="24"/>
-        </w:rPr>
-        <w:t>kNN</w:t>
-      </w:r>
-      <w:proofErr w:type="spellEnd"/>
-      <w:r>
-        <w:rPr>
-          <w:rFonts w:ascii="Arial" w:hAnsi="Arial" w:cs="Arial"/>
-          <w:color w:val="auto"/>
-          <w:sz w:val="24"/>
-          <w:szCs w:val="24"/>
-        </w:rPr>
-        <w:t xml:space="preserve"> Classifier</w:t>
+        <w:t>The kNN Classifier</w:t>
       </w:r>
     </w:p>
     <w:p>
@@ -4177,25 +3828,25 @@
           <w:sz w:val="24"/>
           <w:szCs w:val="24"/>
         </w:rPr>
-        <w:t xml:space="preserve">Selects the indices of the k smallest distances using </w:t>
-      </w:r>
-      <w:proofErr w:type="spellStart"/>
-      <w:r>
-        <w:rPr>
-          <w:rFonts w:ascii="Arial" w:hAnsi="Arial" w:cs="Arial"/>
-          <w:sz w:val="24"/>
-          <w:szCs w:val="24"/>
-        </w:rPr>
-        <w:t>argsort</w:t>
-      </w:r>
-      <w:proofErr w:type="spellEnd"/>
-      <w:r>
-        <w:rPr>
-          <w:rFonts w:ascii="Arial" w:hAnsi="Arial" w:cs="Arial"/>
-          <w:sz w:val="24"/>
-          <w:szCs w:val="24"/>
-        </w:rPr>
-        <w:t>.</w:t>
+        <w:t xml:space="preserve">Selects the indices of </w:t>
+      </w:r>
+      <w:proofErr w:type="gramStart"/>
+      <w:r>
+        <w:rPr>
+          <w:rFonts w:ascii="Arial" w:hAnsi="Arial" w:cs="Arial"/>
+          <w:sz w:val="24"/>
+          <w:szCs w:val="24"/>
+        </w:rPr>
+        <w:t>the k</w:t>
+      </w:r>
+      <w:proofErr w:type="gramEnd"/>
+      <w:r>
+        <w:rPr>
+          <w:rFonts w:ascii="Arial" w:hAnsi="Arial" w:cs="Arial"/>
+          <w:sz w:val="24"/>
+          <w:szCs w:val="24"/>
+        </w:rPr>
+        <w:t xml:space="preserve"> smallest distances using argsort.</w:t>
       </w:r>
     </w:p>
     <w:p>
@@ -4277,7 +3928,43 @@
           <w:sz w:val="24"/>
           <w:szCs w:val="24"/>
         </w:rPr>
-        <w:t>Precision = TP / (TP + FP) — of predicted buyers, how many actually bought.</w:t>
+        <w:t xml:space="preserve">Precision = TP / (TP + </w:t>
+      </w:r>
+      <w:proofErr w:type="gramStart"/>
+      <w:r>
+        <w:rPr>
+          <w:rFonts w:ascii="Arial" w:hAnsi="Arial" w:cs="Arial"/>
+          <w:sz w:val="24"/>
+          <w:szCs w:val="24"/>
+        </w:rPr>
+        <w:t>FP) —</w:t>
+      </w:r>
+      <w:proofErr w:type="gramEnd"/>
+      <w:r>
+        <w:rPr>
+          <w:rFonts w:ascii="Arial" w:hAnsi="Arial" w:cs="Arial"/>
+          <w:sz w:val="24"/>
+          <w:szCs w:val="24"/>
+        </w:rPr>
+        <w:t xml:space="preserve"> of predicted buyers, how many </w:t>
+      </w:r>
+      <w:proofErr w:type="gramStart"/>
+      <w:r>
+        <w:rPr>
+          <w:rFonts w:ascii="Arial" w:hAnsi="Arial" w:cs="Arial"/>
+          <w:sz w:val="24"/>
+          <w:szCs w:val="24"/>
+        </w:rPr>
+        <w:t>actually bought</w:t>
+      </w:r>
+      <w:proofErr w:type="gramEnd"/>
+      <w:r>
+        <w:rPr>
+          <w:rFonts w:ascii="Arial" w:hAnsi="Arial" w:cs="Arial"/>
+          <w:sz w:val="24"/>
+          <w:szCs w:val="24"/>
+        </w:rPr>
+        <w:t>.</w:t>
       </w:r>
     </w:p>
     <w:p>
@@ -4291,13 +3978,41 @@
           <w:szCs w:val="24"/>
         </w:rPr>
       </w:pPr>
-      <w:r>
-        <w:rPr>
-          <w:rFonts w:ascii="Arial" w:hAnsi="Arial" w:cs="Arial"/>
-          <w:sz w:val="24"/>
-          <w:szCs w:val="24"/>
-        </w:rPr>
-        <w:t>Recall (Sensitivity) = TP / (TP + FN) — of actual buyers, how many we</w:t>
+      <w:proofErr w:type="gramStart"/>
+      <w:r>
+        <w:rPr>
+          <w:rFonts w:ascii="Arial" w:hAnsi="Arial" w:cs="Arial"/>
+          <w:sz w:val="24"/>
+          <w:szCs w:val="24"/>
+        </w:rPr>
+        <w:t>Recall</w:t>
+      </w:r>
+      <w:proofErr w:type="gramEnd"/>
+      <w:r>
+        <w:rPr>
+          <w:rFonts w:ascii="Arial" w:hAnsi="Arial" w:cs="Arial"/>
+          <w:sz w:val="24"/>
+          <w:szCs w:val="24"/>
+        </w:rPr>
+        <w:t xml:space="preserve"> (Sensitivity) = TP / (TP + </w:t>
+      </w:r>
+      <w:proofErr w:type="gramStart"/>
+      <w:r>
+        <w:rPr>
+          <w:rFonts w:ascii="Arial" w:hAnsi="Arial" w:cs="Arial"/>
+          <w:sz w:val="24"/>
+          <w:szCs w:val="24"/>
+        </w:rPr>
+        <w:t>FN) —</w:t>
+      </w:r>
+      <w:proofErr w:type="gramEnd"/>
+      <w:r>
+        <w:rPr>
+          <w:rFonts w:ascii="Arial" w:hAnsi="Arial" w:cs="Arial"/>
+          <w:sz w:val="24"/>
+          <w:szCs w:val="24"/>
+        </w:rPr>
+        <w:t xml:space="preserve"> of actual buyers, how many we</w:t>
       </w:r>
       <w:r>
         <w:rPr>
@@ -4333,7 +4048,43 @@
           <w:sz w:val="24"/>
           <w:szCs w:val="24"/>
         </w:rPr>
-        <w:t>F1 = 2 · Precision · Recall / (Precision + Recall) — harmonic mean of the two.</w:t>
+        <w:t xml:space="preserve">F1 = 2 · Precision · Recall / (Precision + </w:t>
+      </w:r>
+      <w:proofErr w:type="gramStart"/>
+      <w:r>
+        <w:rPr>
+          <w:rFonts w:ascii="Arial" w:hAnsi="Arial" w:cs="Arial"/>
+          <w:sz w:val="24"/>
+          <w:szCs w:val="24"/>
+        </w:rPr>
+        <w:t>Recall) —</w:t>
+      </w:r>
+      <w:proofErr w:type="gramEnd"/>
+      <w:r>
+        <w:rPr>
+          <w:rFonts w:ascii="Arial" w:hAnsi="Arial" w:cs="Arial"/>
+          <w:sz w:val="24"/>
+          <w:szCs w:val="24"/>
+        </w:rPr>
+        <w:t xml:space="preserve"> harmonic </w:t>
+      </w:r>
+      <w:proofErr w:type="gramStart"/>
+      <w:r>
+        <w:rPr>
+          <w:rFonts w:ascii="Arial" w:hAnsi="Arial" w:cs="Arial"/>
+          <w:sz w:val="24"/>
+          <w:szCs w:val="24"/>
+        </w:rPr>
+        <w:t>mean</w:t>
+      </w:r>
+      <w:proofErr w:type="gramEnd"/>
+      <w:r>
+        <w:rPr>
+          <w:rFonts w:ascii="Arial" w:hAnsi="Arial" w:cs="Arial"/>
+          <w:sz w:val="24"/>
+          <w:szCs w:val="24"/>
+        </w:rPr>
+        <w:t xml:space="preserve"> of the two.</w:t>
       </w:r>
     </w:p>
     <w:p>
@@ -4353,7 +4104,25 @@
           <w:sz w:val="24"/>
           <w:szCs w:val="24"/>
         </w:rPr>
-        <w:t>Specificity = TN / (TN + FP) — of non-buyers, how many we</w:t>
+        <w:t xml:space="preserve">Specificity = TN / (TN + </w:t>
+      </w:r>
+      <w:proofErr w:type="gramStart"/>
+      <w:r>
+        <w:rPr>
+          <w:rFonts w:ascii="Arial" w:hAnsi="Arial" w:cs="Arial"/>
+          <w:sz w:val="24"/>
+          <w:szCs w:val="24"/>
+        </w:rPr>
+        <w:t>FP) —</w:t>
+      </w:r>
+      <w:proofErr w:type="gramEnd"/>
+      <w:r>
+        <w:rPr>
+          <w:rFonts w:ascii="Arial" w:hAnsi="Arial" w:cs="Arial"/>
+          <w:sz w:val="24"/>
+          <w:szCs w:val="24"/>
+        </w:rPr>
+        <w:t xml:space="preserve"> of non-buyers, how many we</w:t>
       </w:r>
       <w:r>
         <w:rPr>
@@ -4431,27 +4200,7 @@
           <w:sz w:val="24"/>
           <w:szCs w:val="24"/>
         </w:rPr>
-        <w:t xml:space="preserve">Baseline </w:t>
-      </w:r>
-      <w:proofErr w:type="spellStart"/>
-      <w:r>
-        <w:rPr>
-          <w:rFonts w:ascii="Arial" w:hAnsi="Arial" w:cs="Arial"/>
-          <w:color w:val="auto"/>
-          <w:sz w:val="24"/>
-          <w:szCs w:val="24"/>
-        </w:rPr>
-        <w:t>kNN</w:t>
-      </w:r>
-      <w:proofErr w:type="spellEnd"/>
-      <w:r>
-        <w:rPr>
-          <w:rFonts w:ascii="Arial" w:hAnsi="Arial" w:cs="Arial"/>
-          <w:color w:val="auto"/>
-          <w:sz w:val="24"/>
-          <w:szCs w:val="24"/>
-        </w:rPr>
-        <w:t xml:space="preserve"> (k = 5)</w:t>
+        <w:t>Baseline kNN (k = 5)</w:t>
       </w:r>
     </w:p>
     <w:p>
@@ -4538,25 +4287,7 @@
           <w:sz w:val="24"/>
           <w:szCs w:val="24"/>
         </w:rPr>
-        <w:t xml:space="preserve">. As expected, recall is highest at k = 1 (where the algorithm overfits to individual training points) and falls steadily </w:t>
-      </w:r>
-      <w:proofErr w:type="spellStart"/>
-      <w:r>
-        <w:rPr>
-          <w:rFonts w:ascii="Arial" w:hAnsi="Arial" w:cs="Arial"/>
-          <w:sz w:val="24"/>
-          <w:szCs w:val="24"/>
-        </w:rPr>
-        <w:t>as k</w:t>
-      </w:r>
-      <w:proofErr w:type="spellEnd"/>
-      <w:r>
-        <w:rPr>
-          <w:rFonts w:ascii="Arial" w:hAnsi="Arial" w:cs="Arial"/>
-          <w:sz w:val="24"/>
-          <w:szCs w:val="24"/>
-        </w:rPr>
-        <w:t xml:space="preserve"> grows; precision climbs in the opposite direction, illustrating the precision–recall trade-off.</w:t>
+        <w:t>. As expected, recall is highest at k = 1 (where the algorithm overfits to individual training points) and falls steadily as k grows; precision climbs in the opposite direction, illustrating the precision–recall trade-off.</w:t>
       </w:r>
     </w:p>
     <w:p>
@@ -4619,47 +4350,7 @@
           <w:sz w:val="24"/>
           <w:szCs w:val="24"/>
         </w:rPr>
-        <w:t xml:space="preserve">Figure 7. </w:t>
-      </w:r>
-      <w:proofErr w:type="spellStart"/>
-      <w:r>
-        <w:rPr>
-          <w:rFonts w:ascii="Arial" w:hAnsi="Arial" w:cs="Arial"/>
-          <w:i/>
-          <w:sz w:val="24"/>
-          <w:szCs w:val="24"/>
-        </w:rPr>
-        <w:t>kNN</w:t>
-      </w:r>
-      <w:proofErr w:type="spellEnd"/>
-      <w:r>
-        <w:rPr>
-          <w:rFonts w:ascii="Arial" w:hAnsi="Arial" w:cs="Arial"/>
-          <w:i/>
-          <w:sz w:val="24"/>
-          <w:szCs w:val="24"/>
-        </w:rPr>
-        <w:t xml:space="preserve"> performance across values of k. F1 peaks at k = 3; k = 7 chosen for its higher precision.</w:t>
-      </w:r>
-    </w:p>
-    <w:p>
-      <w:pPr>
-        <w:rPr>
-          <w:rFonts w:ascii="Arial" w:hAnsi="Arial" w:cs="Arial"/>
-          <w:i/>
-          <w:sz w:val="24"/>
-          <w:szCs w:val="24"/>
-        </w:rPr>
-      </w:pPr>
-      <w:r>
-        <w:rPr>
-          <w:rFonts w:ascii="Arial" w:hAnsi="Arial" w:cs="Arial"/>
-          <w:i/>
-          <w:sz w:val="24"/>
-          <w:szCs w:val="24"/>
-        </w:rPr>
-        <w:lastRenderedPageBreak/>
-        <w:br w:type="page"/>
+        <w:t>Figure 7. kNN performance across values of k. F1 peaks at k = 3; k = 7 chosen for its higher precision.</w:t>
       </w:r>
     </w:p>
     <w:p>
@@ -4788,7 +4479,25 @@
                 <w:sz w:val="24"/>
                 <w:szCs w:val="24"/>
               </w:rPr>
-              <w:t>k = 21  (0.8787)</w:t>
+              <w:t xml:space="preserve">k = </w:t>
+            </w:r>
+            <w:proofErr w:type="gramStart"/>
+            <w:r>
+              <w:rPr>
+                <w:rFonts w:ascii="Arial" w:hAnsi="Arial" w:cs="Arial"/>
+                <w:sz w:val="24"/>
+                <w:szCs w:val="24"/>
+              </w:rPr>
+              <w:t>21  (</w:t>
+            </w:r>
+            <w:proofErr w:type="gramEnd"/>
+            <w:r>
+              <w:rPr>
+                <w:rFonts w:ascii="Arial" w:hAnsi="Arial" w:cs="Arial"/>
+                <w:sz w:val="24"/>
+                <w:szCs w:val="24"/>
+              </w:rPr>
+              <w:t>0.8787)</w:t>
             </w:r>
           </w:p>
         </w:tc>
@@ -4843,7 +4552,25 @@
                 <w:sz w:val="24"/>
                 <w:szCs w:val="24"/>
               </w:rPr>
-              <w:t>k = 24  (0.8115)</w:t>
+              <w:t xml:space="preserve">k = </w:t>
+            </w:r>
+            <w:proofErr w:type="gramStart"/>
+            <w:r>
+              <w:rPr>
+                <w:rFonts w:ascii="Arial" w:hAnsi="Arial" w:cs="Arial"/>
+                <w:sz w:val="24"/>
+                <w:szCs w:val="24"/>
+              </w:rPr>
+              <w:t>24  (</w:t>
+            </w:r>
+            <w:proofErr w:type="gramEnd"/>
+            <w:r>
+              <w:rPr>
+                <w:rFonts w:ascii="Arial" w:hAnsi="Arial" w:cs="Arial"/>
+                <w:sz w:val="24"/>
+                <w:szCs w:val="24"/>
+              </w:rPr>
+              <w:t>0.8115)</w:t>
             </w:r>
           </w:p>
         </w:tc>
@@ -4898,7 +4625,25 @@
                 <w:sz w:val="24"/>
                 <w:szCs w:val="24"/>
               </w:rPr>
-              <w:t>k = 1   (0.4409)</w:t>
+              <w:t>k = 1</w:t>
+            </w:r>
+            <w:proofErr w:type="gramStart"/>
+            <w:r>
+              <w:rPr>
+                <w:rFonts w:ascii="Arial" w:hAnsi="Arial" w:cs="Arial"/>
+                <w:sz w:val="24"/>
+                <w:szCs w:val="24"/>
+              </w:rPr>
+              <w:t xml:space="preserve">   (</w:t>
+            </w:r>
+            <w:proofErr w:type="gramEnd"/>
+            <w:r>
+              <w:rPr>
+                <w:rFonts w:ascii="Arial" w:hAnsi="Arial" w:cs="Arial"/>
+                <w:sz w:val="24"/>
+                <w:szCs w:val="24"/>
+              </w:rPr>
+              <w:t>0.4409)</w:t>
             </w:r>
           </w:p>
         </w:tc>
@@ -4953,7 +4698,43 @@
                 <w:sz w:val="24"/>
                 <w:szCs w:val="24"/>
               </w:rPr>
-              <w:t>k = 7   (0.4722)  ← chosen</w:t>
+              <w:t>k = 7</w:t>
+            </w:r>
+            <w:proofErr w:type="gramStart"/>
+            <w:r>
+              <w:rPr>
+                <w:rFonts w:ascii="Arial" w:hAnsi="Arial" w:cs="Arial"/>
+                <w:sz w:val="24"/>
+                <w:szCs w:val="24"/>
+              </w:rPr>
+              <w:t xml:space="preserve">   (</w:t>
+            </w:r>
+            <w:proofErr w:type="gramEnd"/>
+            <w:r>
+              <w:rPr>
+                <w:rFonts w:ascii="Arial" w:hAnsi="Arial" w:cs="Arial"/>
+                <w:sz w:val="24"/>
+                <w:szCs w:val="24"/>
+              </w:rPr>
+              <w:t>0.4722</w:t>
+            </w:r>
+            <w:proofErr w:type="gramStart"/>
+            <w:r>
+              <w:rPr>
+                <w:rFonts w:ascii="Arial" w:hAnsi="Arial" w:cs="Arial"/>
+                <w:sz w:val="24"/>
+                <w:szCs w:val="24"/>
+              </w:rPr>
+              <w:t>)  ←</w:t>
+            </w:r>
+            <w:proofErr w:type="gramEnd"/>
+            <w:r>
+              <w:rPr>
+                <w:rFonts w:ascii="Arial" w:hAnsi="Arial" w:cs="Arial"/>
+                <w:sz w:val="24"/>
+                <w:szCs w:val="24"/>
+              </w:rPr>
+              <w:t xml:space="preserve"> chosen</w:t>
             </w:r>
           </w:p>
         </w:tc>
@@ -5101,13 +4882,23 @@
                 <w:szCs w:val="24"/>
               </w:rPr>
             </w:pPr>
+            <w:proofErr w:type="gramStart"/>
             <w:r>
               <w:rPr>
                 <w:rFonts w:ascii="Arial" w:hAnsi="Arial" w:cs="Arial"/>
                 <w:sz w:val="24"/>
                 <w:szCs w:val="24"/>
               </w:rPr>
-              <w:t>0.8767  (87.67%)</w:t>
+              <w:t>0.8767  (</w:t>
+            </w:r>
+            <w:proofErr w:type="gramEnd"/>
+            <w:r>
+              <w:rPr>
+                <w:rFonts w:ascii="Arial" w:hAnsi="Arial" w:cs="Arial"/>
+                <w:sz w:val="24"/>
+                <w:szCs w:val="24"/>
+              </w:rPr>
+              <w:t>87.67%)</w:t>
             </w:r>
           </w:p>
         </w:tc>
@@ -5459,7 +5250,25 @@
           <w:sz w:val="24"/>
           <w:szCs w:val="24"/>
         </w:rPr>
-        <w:t>To confirm that the test-set result is not the product of one lucky split, the full dataset was partitioned into five stratified folds, retraining and rescoring on each. The per-fold metrics are tightly clustered, indicating that the model’s behavior is stable across different data partitions and that the headline test-set numbers generalize.</w:t>
+        <w:t xml:space="preserve">To confirm that the test-set result is not the product of one lucky split, the full dataset was partitioned into five stratified folds, retraining and </w:t>
+      </w:r>
+      <w:proofErr w:type="gramStart"/>
+      <w:r>
+        <w:rPr>
+          <w:rFonts w:ascii="Arial" w:hAnsi="Arial" w:cs="Arial"/>
+          <w:sz w:val="24"/>
+          <w:szCs w:val="24"/>
+        </w:rPr>
+        <w:t>rescoring</w:t>
+      </w:r>
+      <w:proofErr w:type="gramEnd"/>
+      <w:r>
+        <w:rPr>
+          <w:rFonts w:ascii="Arial" w:hAnsi="Arial" w:cs="Arial"/>
+          <w:sz w:val="24"/>
+          <w:szCs w:val="24"/>
+        </w:rPr>
+        <w:t xml:space="preserve"> on each. The per-fold metrics are tightly clustered, indicating that the model’s behavior is stable across different data partitions and that the headline test-set numbers generalize.</w:t>
       </w:r>
     </w:p>
     <w:p>
@@ -5779,18 +5588,8 @@
                 <w:sz w:val="24"/>
                 <w:szCs w:val="24"/>
               </w:rPr>
-              <w:t xml:space="preserve">Baseline 2: Rule on </w:t>
+              <w:t>Baseline 2: Rule on PageValues</w:t>
             </w:r>
-            <w:proofErr w:type="spellStart"/>
-            <w:r>
-              <w:rPr>
-                <w:rFonts w:ascii="Arial" w:hAnsi="Arial" w:cs="Arial"/>
-                <w:sz w:val="24"/>
-                <w:szCs w:val="24"/>
-              </w:rPr>
-              <w:t>PageValues</w:t>
-            </w:r>
-            <w:proofErr w:type="spellEnd"/>
           </w:p>
         </w:tc>
         <w:tc>
@@ -5912,23 +5711,31 @@
                 <w:szCs w:val="24"/>
               </w:rPr>
             </w:pPr>
-            <w:proofErr w:type="spellStart"/>
             <w:r>
               <w:rPr>
                 <w:rFonts w:ascii="Arial" w:hAnsi="Arial" w:cs="Arial"/>
                 <w:sz w:val="24"/>
                 <w:szCs w:val="24"/>
               </w:rPr>
-              <w:t>kNN</w:t>
+              <w:t xml:space="preserve">kNN (k = </w:t>
             </w:r>
-            <w:proofErr w:type="spellEnd"/>
+            <w:proofErr w:type="gramStart"/>
             <w:r>
               <w:rPr>
                 <w:rFonts w:ascii="Arial" w:hAnsi="Arial" w:cs="Arial"/>
                 <w:sz w:val="24"/>
                 <w:szCs w:val="24"/>
               </w:rPr>
-              <w:t xml:space="preserve"> (k = 7) — the researchers' model</w:t>
+              <w:t>7) —</w:t>
+            </w:r>
+            <w:proofErr w:type="gramEnd"/>
+            <w:r>
+              <w:rPr>
+                <w:rFonts w:ascii="Arial" w:hAnsi="Arial" w:cs="Arial"/>
+                <w:sz w:val="24"/>
+                <w:szCs w:val="24"/>
+              </w:rPr>
+              <w:t xml:space="preserve"> the researchers' model</w:t>
             </w:r>
           </w:p>
         </w:tc>
@@ -6056,95 +5863,31 @@
           <w:szCs w:val="24"/>
         </w:rPr>
       </w:pPr>
-      <w:proofErr w:type="spellStart"/>
-      <w:r>
-        <w:rPr>
-          <w:rFonts w:ascii="Arial" w:hAnsi="Arial" w:cs="Arial"/>
-          <w:sz w:val="24"/>
-          <w:szCs w:val="24"/>
-        </w:rPr>
-        <w:t>kNN</w:t>
-      </w:r>
-      <w:proofErr w:type="spellEnd"/>
-      <w:r>
-        <w:rPr>
-          <w:rFonts w:ascii="Arial" w:hAnsi="Arial" w:cs="Arial"/>
-          <w:sz w:val="24"/>
-          <w:szCs w:val="24"/>
-        </w:rPr>
-        <w:t xml:space="preserve"> clearly outperforms the always-No-Purchase baseline (zero recall and F1 by construction). However, the single-feature </w:t>
-      </w:r>
-      <w:proofErr w:type="spellStart"/>
-      <w:r>
-        <w:rPr>
-          <w:rFonts w:ascii="Arial" w:hAnsi="Arial" w:cs="Arial"/>
-          <w:sz w:val="24"/>
-          <w:szCs w:val="24"/>
-        </w:rPr>
-        <w:t>PageValues</w:t>
-      </w:r>
-      <w:proofErr w:type="spellEnd"/>
-      <w:r>
-        <w:rPr>
-          <w:rFonts w:ascii="Arial" w:hAnsi="Arial" w:cs="Arial"/>
-          <w:sz w:val="24"/>
-          <w:szCs w:val="24"/>
-        </w:rPr>
-        <w:t xml:space="preserve"> rule outperforms </w:t>
-      </w:r>
-      <w:proofErr w:type="spellStart"/>
-      <w:r>
-        <w:rPr>
-          <w:rFonts w:ascii="Arial" w:hAnsi="Arial" w:cs="Arial"/>
-          <w:sz w:val="24"/>
-          <w:szCs w:val="24"/>
-        </w:rPr>
-        <w:t>kNN</w:t>
-      </w:r>
-      <w:proofErr w:type="spellEnd"/>
-      <w:r>
-        <w:rPr>
-          <w:rFonts w:ascii="Arial" w:hAnsi="Arial" w:cs="Arial"/>
-          <w:sz w:val="24"/>
-          <w:szCs w:val="24"/>
-        </w:rPr>
-        <w:t xml:space="preserve"> on F1 (0.682 vs 0.472) and recall (0.743 vs 0.357), trailing only on precision. Rather than combining signal to beat the simple rule, the </w:t>
-      </w:r>
-      <w:proofErr w:type="spellStart"/>
-      <w:r>
-        <w:rPr>
-          <w:rFonts w:ascii="Arial" w:hAnsi="Arial" w:cs="Arial"/>
-          <w:sz w:val="24"/>
-          <w:szCs w:val="24"/>
-        </w:rPr>
-        <w:t>kNN</w:t>
-      </w:r>
-      <w:proofErr w:type="spellEnd"/>
-      <w:r>
-        <w:rPr>
-          <w:rFonts w:ascii="Arial" w:hAnsi="Arial" w:cs="Arial"/>
-          <w:sz w:val="24"/>
-          <w:szCs w:val="24"/>
-        </w:rPr>
-        <w:t xml:space="preserve"> dilutes the dominant </w:t>
-      </w:r>
-      <w:proofErr w:type="spellStart"/>
-      <w:r>
-        <w:rPr>
-          <w:rFonts w:ascii="Arial" w:hAnsi="Arial" w:cs="Arial"/>
-          <w:sz w:val="24"/>
-          <w:szCs w:val="24"/>
-        </w:rPr>
-        <w:t>PageValues</w:t>
-      </w:r>
-      <w:proofErr w:type="spellEnd"/>
-      <w:r>
-        <w:rPr>
-          <w:rFonts w:ascii="Arial" w:hAnsi="Arial" w:cs="Arial"/>
-          <w:sz w:val="24"/>
-          <w:szCs w:val="24"/>
-        </w:rPr>
-        <w:t xml:space="preserve"> signal across 28 standardized features — many redundant or noisy — and underperforms it. We treat this as a key finding (see Discussion and Limitations).</w:t>
+      <w:r>
+        <w:rPr>
+          <w:rFonts w:ascii="Arial" w:hAnsi="Arial" w:cs="Arial"/>
+          <w:sz w:val="24"/>
+          <w:szCs w:val="24"/>
+        </w:rPr>
+        <w:t xml:space="preserve">kNN clearly outperforms the always-No-Purchase baseline (zero recall and F1 by construction). However, the single-feature PageValues rule outperforms kNN on F1 (0.682 vs 0.472) and recall (0.743 vs 0.357), trailing only on precision. Rather than combining </w:t>
+      </w:r>
+      <w:proofErr w:type="gramStart"/>
+      <w:r>
+        <w:rPr>
+          <w:rFonts w:ascii="Arial" w:hAnsi="Arial" w:cs="Arial"/>
+          <w:sz w:val="24"/>
+          <w:szCs w:val="24"/>
+        </w:rPr>
+        <w:t>signal</w:t>
+      </w:r>
+      <w:proofErr w:type="gramEnd"/>
+      <w:r>
+        <w:rPr>
+          <w:rFonts w:ascii="Arial" w:hAnsi="Arial" w:cs="Arial"/>
+          <w:sz w:val="24"/>
+          <w:szCs w:val="24"/>
+        </w:rPr>
+        <w:t xml:space="preserve"> to beat the simple rule, the kNN dilutes the dominant PageValues signal across 28 standardized features — many redundant or noisy — and underperforms it. We treat this as a key finding (see Discussion and Limitations).</w:t>
       </w:r>
       <w:r>
         <w:rPr>
@@ -6217,43 +5960,7 @@
           <w:sz w:val="24"/>
           <w:szCs w:val="24"/>
         </w:rPr>
-        <w:t xml:space="preserve">The classifier behaves consistently with the EDA. </w:t>
-      </w:r>
-      <w:proofErr w:type="spellStart"/>
-      <w:r>
-        <w:rPr>
-          <w:rFonts w:ascii="Arial" w:hAnsi="Arial" w:cs="Arial"/>
-          <w:sz w:val="24"/>
-          <w:szCs w:val="24"/>
-        </w:rPr>
-        <w:t>PageValues</w:t>
-      </w:r>
-      <w:proofErr w:type="spellEnd"/>
-      <w:r>
-        <w:rPr>
-          <w:rFonts w:ascii="Arial" w:hAnsi="Arial" w:cs="Arial"/>
-          <w:sz w:val="24"/>
-          <w:szCs w:val="24"/>
-        </w:rPr>
-        <w:t xml:space="preserve">, </w:t>
-      </w:r>
-      <w:proofErr w:type="spellStart"/>
-      <w:r>
-        <w:rPr>
-          <w:rFonts w:ascii="Arial" w:hAnsi="Arial" w:cs="Arial"/>
-          <w:sz w:val="24"/>
-          <w:szCs w:val="24"/>
-        </w:rPr>
-        <w:t>BounceRates</w:t>
-      </w:r>
-      <w:proofErr w:type="spellEnd"/>
-      <w:r>
-        <w:rPr>
-          <w:rFonts w:ascii="Arial" w:hAnsi="Arial" w:cs="Arial"/>
-          <w:sz w:val="24"/>
-          <w:szCs w:val="24"/>
-        </w:rPr>
-        <w:t>, and the November one-hot indicator carry the heaviest signal because those are the features along which buyers and non-buyers separate most cleanly. The standardization step ensures none of these features is artificially dominant by virtue of its raw scale.</w:t>
+        <w:t>The classifier behaves consistently with the EDA. PageValues, BounceRates, and the November one-hot indicator carry the heaviest signal because those are the features along which buyers and non-buyers separate most cleanly. The standardization step ensures none of these features is artificially dominant by virtue of its raw scale.</w:t>
       </w:r>
     </w:p>
     <w:p>
@@ -6307,25 +6014,7 @@
           <w:sz w:val="24"/>
           <w:szCs w:val="24"/>
         </w:rPr>
-        <w:t xml:space="preserve">The most candid finding of the project is that recall sits at 0.357: the model identifies only about 36% of actual buyers. With 381 buyers in the test set, the model catches 136 and misses 245. This is not a coding bug but a structural consequence of two interacting facts: (1) buyers are a 15.47% minority, so for any test point the seven nearest neighbors are very likely to be majority-class; (2) plain majority-vote </w:t>
-      </w:r>
-      <w:proofErr w:type="spellStart"/>
-      <w:r>
-        <w:rPr>
-          <w:rFonts w:ascii="Arial" w:hAnsi="Arial" w:cs="Arial"/>
-          <w:sz w:val="24"/>
-          <w:szCs w:val="24"/>
-        </w:rPr>
-        <w:t>kNN</w:t>
-      </w:r>
-      <w:proofErr w:type="spellEnd"/>
-      <w:r>
-        <w:rPr>
-          <w:rFonts w:ascii="Arial" w:hAnsi="Arial" w:cs="Arial"/>
-          <w:sz w:val="24"/>
-          <w:szCs w:val="24"/>
-        </w:rPr>
-        <w:t xml:space="preserve"> therefore systematically biases toward predicting "No Purchase". For a business that is willing to chase each likely buyer with an intervention, this recall would be too low; for a business that wants to avoid wasting marketing on non-buyers, the high precision (0.697) is more attractive.</w:t>
+        <w:t>The most candid finding of the project is that recall sits at 0.357: the model identifies only about 36% of actual buyers. With 381 buyers in the test set, the model catches 136 and misses 245. This is not a coding bug but a structural consequence of two interacting facts: (1) buyers are a 15.47% minority, so for any test point the seven nearest neighbors are very likely to be majority-class; (2) plain majority-vote kNN therefore systematically biases toward predicting "No Purchase". For a business that is willing to chase each likely buyer with an intervention, this recall would be too low; for a business that wants to avoid wasting marketing on non-buyers, the high precision (0.697) is more attractive.</w:t>
       </w:r>
     </w:p>
     <w:p>
@@ -6385,7 +6074,25 @@
           <w:sz w:val="24"/>
           <w:szCs w:val="24"/>
         </w:rPr>
-        <w:t>A high-precision, lower-recall classifier of this kind is suitable for use cases where the cost of intervening on a non-buyer (e.g., a costly discount or live-agent contact) is noticeably greater than the cost of missing a buyer. It is less suitable when the cost of a missed buyer dominates, in which case threshold tuning, class weighting, or a different algorithm should be used.</w:t>
+        <w:t xml:space="preserve">A high-precision, lower-recall classifier of this kind is suitable for use cases where the cost of intervening </w:t>
+      </w:r>
+      <w:proofErr w:type="gramStart"/>
+      <w:r>
+        <w:rPr>
+          <w:rFonts w:ascii="Arial" w:hAnsi="Arial" w:cs="Arial"/>
+          <w:sz w:val="24"/>
+          <w:szCs w:val="24"/>
+        </w:rPr>
+        <w:t>on</w:t>
+      </w:r>
+      <w:proofErr w:type="gramEnd"/>
+      <w:r>
+        <w:rPr>
+          <w:rFonts w:ascii="Arial" w:hAnsi="Arial" w:cs="Arial"/>
+          <w:sz w:val="24"/>
+          <w:szCs w:val="24"/>
+        </w:rPr>
+        <w:t xml:space="preserve"> a non-buyer (e.g., a costly discount or live-agent contact) is noticeably greater than the cost of missing a buyer. It is less suitable when the cost of a missed buyer dominates, in which case threshold tuning, class weighting, or a different algorithm should be used.</w:t>
       </w:r>
     </w:p>
     <w:p>
@@ -6501,7 +6208,25 @@
           <w:sz w:val="24"/>
           <w:szCs w:val="24"/>
         </w:rPr>
-        <w:t>The model uses the raw 84.5 / 15.5 distribution. Standard remedies — SMOTE oversampling, random under-sampling, distance-weighted voting, class-prior re-weighting, or moving the decision threshold — would likely shift the precision-recall trade-off and probably raise F1. None of those was implemented. This is the single largest improvement opportunity.</w:t>
+        <w:t xml:space="preserve">The model uses the raw 84.5 / 15.5 distribution. Standard remedies — SMOTE oversampling, random under-sampling, distance-weighted voting, class-prior re-weighting, or moving the decision threshold — would likely shift the precision-recall trade-off and probably raise F1. None of those </w:t>
+      </w:r>
+      <w:proofErr w:type="gramStart"/>
+      <w:r>
+        <w:rPr>
+          <w:rFonts w:ascii="Arial" w:hAnsi="Arial" w:cs="Arial"/>
+          <w:sz w:val="24"/>
+          <w:szCs w:val="24"/>
+        </w:rPr>
+        <w:t>was</w:t>
+      </w:r>
+      <w:proofErr w:type="gramEnd"/>
+      <w:r>
+        <w:rPr>
+          <w:rFonts w:ascii="Arial" w:hAnsi="Arial" w:cs="Arial"/>
+          <w:sz w:val="24"/>
+          <w:szCs w:val="24"/>
+        </w:rPr>
+        <w:t xml:space="preserve"> implemented. This is the single largest improvement opportunity.</w:t>
       </w:r>
     </w:p>
     <w:p>
@@ -6549,41 +6274,13 @@
           <w:szCs w:val="24"/>
         </w:rPr>
       </w:pPr>
-      <w:proofErr w:type="spellStart"/>
-      <w:r>
-        <w:rPr>
-          <w:rFonts w:ascii="Arial" w:hAnsi="Arial" w:cs="Arial"/>
-          <w:sz w:val="24"/>
-          <w:szCs w:val="24"/>
-        </w:rPr>
-        <w:t>BounceRates</w:t>
-      </w:r>
-      <w:proofErr w:type="spellEnd"/>
-      <w:r>
-        <w:rPr>
-          <w:rFonts w:ascii="Arial" w:hAnsi="Arial" w:cs="Arial"/>
-          <w:sz w:val="24"/>
-          <w:szCs w:val="24"/>
-        </w:rPr>
-        <w:t xml:space="preserve"> and </w:t>
-      </w:r>
-      <w:proofErr w:type="spellStart"/>
-      <w:r>
-        <w:rPr>
-          <w:rFonts w:ascii="Arial" w:hAnsi="Arial" w:cs="Arial"/>
-          <w:sz w:val="24"/>
-          <w:szCs w:val="24"/>
-        </w:rPr>
-        <w:t>ExitRates</w:t>
-      </w:r>
-      <w:proofErr w:type="spellEnd"/>
-      <w:r>
-        <w:rPr>
-          <w:rFonts w:ascii="Arial" w:hAnsi="Arial" w:cs="Arial"/>
-          <w:sz w:val="24"/>
-          <w:szCs w:val="24"/>
-        </w:rPr>
-        <w:t xml:space="preserve"> correlate at 0.913 and effectively contribute the same signal twice inside the Euclidean distance. Dropping one or applying PCA would reduce this redundancy.</w:t>
+      <w:r>
+        <w:rPr>
+          <w:rFonts w:ascii="Arial" w:hAnsi="Arial" w:cs="Arial"/>
+          <w:sz w:val="24"/>
+          <w:szCs w:val="24"/>
+        </w:rPr>
+        <w:t>BounceRates and ExitRates correlate at 0.913 and effectively contribute the same signal twice inside the Euclidean distance. Dropping one or applying PCA would reduce this redundancy.</w:t>
       </w:r>
     </w:p>
     <w:p>
@@ -6637,25 +6334,7 @@
           <w:sz w:val="24"/>
           <w:szCs w:val="24"/>
         </w:rPr>
-        <w:t xml:space="preserve">The 13 binary one-hot columns (10 for Month, 3 for </w:t>
-      </w:r>
-      <w:proofErr w:type="spellStart"/>
-      <w:r>
-        <w:rPr>
-          <w:rFonts w:ascii="Arial" w:hAnsi="Arial" w:cs="Arial"/>
-          <w:sz w:val="24"/>
-          <w:szCs w:val="24"/>
-        </w:rPr>
-        <w:t>VisitorType</w:t>
-      </w:r>
-      <w:proofErr w:type="spellEnd"/>
-      <w:r>
-        <w:rPr>
-          <w:rFonts w:ascii="Arial" w:hAnsi="Arial" w:cs="Arial"/>
-          <w:sz w:val="24"/>
-          <w:szCs w:val="24"/>
-        </w:rPr>
-        <w:t>) sit alongside 14 continuous features in the same Euclidean space. Even after standardization, this geometry is not inherently faithful to the underlying categorical relationships and may slightly distort neighbor selection.</w:t>
+        <w:t>The 13 binary one-hot columns (10 for Month, 3 for VisitorType) sit alongside 14 continuous features in the same Euclidean space. Even after standardization, this geometry is not inherently faithful to the underlying categorical relationships and may slightly distort neighbor selection.</w:t>
       </w:r>
     </w:p>
     <w:p>
@@ -6697,7 +6376,25 @@
           <w:sz w:val="24"/>
           <w:szCs w:val="24"/>
         </w:rPr>
-        <w:t xml:space="preserve">The hyperparameter sweep selected k = 7 by directly evaluating F1 on the held-out test set. A more rigorous protocol would use a separate validation </w:t>
+        <w:t xml:space="preserve">The hyperparameter </w:t>
+      </w:r>
+      <w:proofErr w:type="gramStart"/>
+      <w:r>
+        <w:rPr>
+          <w:rFonts w:ascii="Arial" w:hAnsi="Arial" w:cs="Arial"/>
+          <w:sz w:val="24"/>
+          <w:szCs w:val="24"/>
+        </w:rPr>
+        <w:t>sweep</w:t>
+      </w:r>
+      <w:proofErr w:type="gramEnd"/>
+      <w:r>
+        <w:rPr>
+          <w:rFonts w:ascii="Arial" w:hAnsi="Arial" w:cs="Arial"/>
+          <w:sz w:val="24"/>
+          <w:szCs w:val="24"/>
+        </w:rPr>
+        <w:t xml:space="preserve"> selected k = 7 by directly evaluating F1 on the held-out test set. A more rigorous protocol would use a separate validation </w:t>
       </w:r>
       <w:r>
         <w:rPr>
@@ -6760,25 +6457,43 @@
           <w:sz w:val="24"/>
           <w:szCs w:val="24"/>
         </w:rPr>
-        <w:t xml:space="preserve">Manhattan, Chebyshev, and </w:t>
-      </w:r>
-      <w:proofErr w:type="spellStart"/>
-      <w:r>
-        <w:rPr>
-          <w:rFonts w:ascii="Arial" w:hAnsi="Arial" w:cs="Arial"/>
-          <w:sz w:val="24"/>
-          <w:szCs w:val="24"/>
-        </w:rPr>
-        <w:t>Mahalanobis</w:t>
-      </w:r>
-      <w:proofErr w:type="spellEnd"/>
-      <w:r>
-        <w:rPr>
-          <w:rFonts w:ascii="Arial" w:hAnsi="Arial" w:cs="Arial"/>
-          <w:sz w:val="24"/>
-          <w:szCs w:val="24"/>
-        </w:rPr>
-        <w:t xml:space="preserve"> distance metrics, plus distance-weighted (rather than majority-vote) neighbor aggregation, were not explored. Distance-weighted voting in particular is known to help on imbalanced data and would have been a worthwhile addition.</w:t>
+        <w:t xml:space="preserve">Manhattan, Chebyshev, and Mahalanobis distance metrics, plus distance-weighted (rather than majority-vote) neighbor aggregation, were not explored. Distance-weighted voting </w:t>
+      </w:r>
+      <w:proofErr w:type="gramStart"/>
+      <w:r>
+        <w:rPr>
+          <w:rFonts w:ascii="Arial" w:hAnsi="Arial" w:cs="Arial"/>
+          <w:sz w:val="24"/>
+          <w:szCs w:val="24"/>
+        </w:rPr>
+        <w:t>in particular is</w:t>
+      </w:r>
+      <w:proofErr w:type="gramEnd"/>
+      <w:r>
+        <w:rPr>
+          <w:rFonts w:ascii="Arial" w:hAnsi="Arial" w:cs="Arial"/>
+          <w:sz w:val="24"/>
+          <w:szCs w:val="24"/>
+        </w:rPr>
+        <w:t xml:space="preserve"> known to help </w:t>
+      </w:r>
+      <w:proofErr w:type="gramStart"/>
+      <w:r>
+        <w:rPr>
+          <w:rFonts w:ascii="Arial" w:hAnsi="Arial" w:cs="Arial"/>
+          <w:sz w:val="24"/>
+          <w:szCs w:val="24"/>
+        </w:rPr>
+        <w:t>on</w:t>
+      </w:r>
+      <w:proofErr w:type="gramEnd"/>
+      <w:r>
+        <w:rPr>
+          <w:rFonts w:ascii="Arial" w:hAnsi="Arial" w:cs="Arial"/>
+          <w:sz w:val="24"/>
+          <w:szCs w:val="24"/>
+        </w:rPr>
+        <w:t xml:space="preserve"> imbalanced data and would have been a worthwhile addition.</w:t>
       </w:r>
     </w:p>
     <w:p>
@@ -6826,23 +6541,13 @@
           <w:szCs w:val="24"/>
         </w:rPr>
       </w:pPr>
-      <w:proofErr w:type="spellStart"/>
-      <w:r>
-        <w:rPr>
-          <w:rFonts w:ascii="Arial" w:hAnsi="Arial" w:cs="Arial"/>
-          <w:sz w:val="24"/>
-          <w:szCs w:val="24"/>
-        </w:rPr>
-        <w:t>kNN</w:t>
-      </w:r>
-      <w:proofErr w:type="spellEnd"/>
-      <w:r>
-        <w:rPr>
-          <w:rFonts w:ascii="Arial" w:hAnsi="Arial" w:cs="Arial"/>
-          <w:sz w:val="24"/>
-          <w:szCs w:val="24"/>
-        </w:rPr>
-        <w:t xml:space="preserve"> can produce a soft score equal to the proportion of positive neighbors among the k. Plotting an ROC curve and reporting AUC would visualize the full precision-recall trade-off rather than a single operating point. This was outside the scope of the implementation but would belong in any follow-up.</w:t>
+      <w:r>
+        <w:rPr>
+          <w:rFonts w:ascii="Arial" w:hAnsi="Arial" w:cs="Arial"/>
+          <w:sz w:val="24"/>
+          <w:szCs w:val="24"/>
+        </w:rPr>
+        <w:t>kNN can produce a soft score equal to the proportion of positive neighbors among the k. Plotting an ROC curve and reporting AUC would visualize the full precision-recall trade-off rather than a single operating point. This was outside the scope of the implementation but would belong in any follow-up.</w:t>
       </w:r>
     </w:p>
     <w:p>
@@ -6904,25 +6609,7 @@
           <w:sz w:val="24"/>
           <w:szCs w:val="24"/>
         </w:rPr>
-        <w:t xml:space="preserve">This capstone implemented a complete </w:t>
-      </w:r>
-      <w:proofErr w:type="spellStart"/>
-      <w:r>
-        <w:rPr>
-          <w:rFonts w:ascii="Arial" w:hAnsi="Arial" w:cs="Arial"/>
-          <w:sz w:val="24"/>
-          <w:szCs w:val="24"/>
-        </w:rPr>
-        <w:t>kNN</w:t>
-      </w:r>
-      <w:proofErr w:type="spellEnd"/>
-      <w:r>
-        <w:rPr>
-          <w:rFonts w:ascii="Arial" w:hAnsi="Arial" w:cs="Arial"/>
-          <w:sz w:val="24"/>
-          <w:szCs w:val="24"/>
-        </w:rPr>
-        <w:t xml:space="preserve"> classification pipeline</w:t>
+        <w:t>This capstone implemented a complete kNN classification pipeline</w:t>
       </w:r>
       <w:r>
         <w:rPr>
@@ -6946,25 +6633,25 @@
           <w:sz w:val="24"/>
           <w:szCs w:val="24"/>
         </w:rPr>
-        <w:t xml:space="preserve">The model decisively beats a majority-class baseline, but is itself beaten by a single-feature </w:t>
-      </w:r>
-      <w:proofErr w:type="spellStart"/>
-      <w:r>
-        <w:rPr>
-          <w:rFonts w:ascii="Arial" w:hAnsi="Arial" w:cs="Arial"/>
-          <w:sz w:val="24"/>
-          <w:szCs w:val="24"/>
-        </w:rPr>
-        <w:t>PageValues</w:t>
-      </w:r>
-      <w:proofErr w:type="spellEnd"/>
-      <w:r>
-        <w:rPr>
-          <w:rFonts w:ascii="Arial" w:hAnsi="Arial" w:cs="Arial"/>
-          <w:sz w:val="24"/>
-          <w:szCs w:val="24"/>
-        </w:rPr>
-        <w:t xml:space="preserve"> rule on F1 and recall — and its low recall on the minority class is a real structural limitation rather than a presentation flaw.</w:t>
+        <w:t xml:space="preserve">The model decisively beats a majority-class </w:t>
+      </w:r>
+      <w:proofErr w:type="gramStart"/>
+      <w:r>
+        <w:rPr>
+          <w:rFonts w:ascii="Arial" w:hAnsi="Arial" w:cs="Arial"/>
+          <w:sz w:val="24"/>
+          <w:szCs w:val="24"/>
+        </w:rPr>
+        <w:t>baseline, but</w:t>
+      </w:r>
+      <w:proofErr w:type="gramEnd"/>
+      <w:r>
+        <w:rPr>
+          <w:rFonts w:ascii="Arial" w:hAnsi="Arial" w:cs="Arial"/>
+          <w:sz w:val="24"/>
+          <w:szCs w:val="24"/>
+        </w:rPr>
+        <w:t xml:space="preserve"> is itself beaten by a single-feature PageValues rule on F1 and recall — and its low recall on the minority class is a real structural limitation rather than a presentation flaw.</w:t>
       </w:r>
     </w:p>
     <w:p>
@@ -7027,55 +6714,33 @@
           <w:sz w:val="24"/>
           <w:szCs w:val="24"/>
         </w:rPr>
-        <w:t xml:space="preserve">Sakar, C. O., Polat, S. O., </w:t>
-      </w:r>
-      <w:proofErr w:type="spellStart"/>
-      <w:r>
-        <w:rPr>
-          <w:rFonts w:ascii="Arial" w:hAnsi="Arial" w:cs="Arial"/>
-          <w:bCs/>
-          <w:sz w:val="24"/>
-          <w:szCs w:val="24"/>
-        </w:rPr>
-        <w:t>Katircioglu</w:t>
-      </w:r>
-      <w:proofErr w:type="spellEnd"/>
-      <w:r>
-        <w:rPr>
-          <w:rFonts w:ascii="Arial" w:hAnsi="Arial" w:cs="Arial"/>
-          <w:bCs/>
-          <w:sz w:val="24"/>
-          <w:szCs w:val="24"/>
-        </w:rPr>
-        <w:t xml:space="preserve">, M., &amp; </w:t>
-      </w:r>
-      <w:proofErr w:type="spellStart"/>
-      <w:r>
-        <w:rPr>
-          <w:rFonts w:ascii="Arial" w:hAnsi="Arial" w:cs="Arial"/>
-          <w:bCs/>
-          <w:sz w:val="24"/>
-          <w:szCs w:val="24"/>
-        </w:rPr>
-        <w:t>Kastro</w:t>
-      </w:r>
-      <w:proofErr w:type="spellEnd"/>
-      <w:r>
-        <w:rPr>
-          <w:rFonts w:ascii="Arial" w:hAnsi="Arial" w:cs="Arial"/>
-          <w:bCs/>
-          <w:sz w:val="24"/>
-          <w:szCs w:val="24"/>
-        </w:rPr>
-        <w:t>, Y. (2019).</w:t>
-      </w:r>
-      <w:r>
-        <w:rPr>
-          <w:rFonts w:ascii="Arial" w:hAnsi="Arial" w:cs="Arial"/>
-          <w:sz w:val="24"/>
-          <w:szCs w:val="24"/>
-        </w:rPr>
-        <w:t xml:space="preserve"> Real-time prediction of online shoppers’ purchasing intention using multilayer perceptron and LSTM recurrent neural networks. Neural Computing and Applications, 31(10), 6893–6908.</w:t>
+        <w:t>Sakar, C. O., Polat, S. O., Katircioglu, M., &amp; Kastro, Y. (2019).</w:t>
+      </w:r>
+      <w:r>
+        <w:rPr>
+          <w:rFonts w:ascii="Arial" w:hAnsi="Arial" w:cs="Arial"/>
+          <w:sz w:val="24"/>
+          <w:szCs w:val="24"/>
+        </w:rPr>
+        <w:t xml:space="preserve"> Real-time prediction of online shoppers’ purchasing intention using multilayer </w:t>
+      </w:r>
+      <w:proofErr w:type="gramStart"/>
+      <w:r>
+        <w:rPr>
+          <w:rFonts w:ascii="Arial" w:hAnsi="Arial" w:cs="Arial"/>
+          <w:sz w:val="24"/>
+          <w:szCs w:val="24"/>
+        </w:rPr>
+        <w:t>perceptron</w:t>
+      </w:r>
+      <w:proofErr w:type="gramEnd"/>
+      <w:r>
+        <w:rPr>
+          <w:rFonts w:ascii="Arial" w:hAnsi="Arial" w:cs="Arial"/>
+          <w:sz w:val="24"/>
+          <w:szCs w:val="24"/>
+        </w:rPr>
+        <w:t xml:space="preserve"> and LSTM recurrent neural networks. Neural Computing and Applications, 31(10), 6893–6908.</w:t>
       </w:r>
     </w:p>
     <w:p>
@@ -7461,43 +7126,7 @@
                 <w:sz w:val="24"/>
                 <w:szCs w:val="24"/>
               </w:rPr>
-              <w:t xml:space="preserve">One-hot encoding, Boolean cast, save </w:t>
-            </w:r>
-            <w:proofErr w:type="spellStart"/>
-            <w:r>
-              <w:rPr>
-                <w:rFonts w:ascii="Arial" w:hAnsi="Arial" w:cs="Arial"/>
-                <w:sz w:val="24"/>
-                <w:szCs w:val="24"/>
-              </w:rPr>
-              <w:t>X_features.npy</w:t>
-            </w:r>
-            <w:proofErr w:type="spellEnd"/>
-            <w:r>
-              <w:rPr>
-                <w:rFonts w:ascii="Arial" w:hAnsi="Arial" w:cs="Arial"/>
-                <w:sz w:val="24"/>
-                <w:szCs w:val="24"/>
-              </w:rPr>
-              <w:t xml:space="preserve"> / </w:t>
-            </w:r>
-            <w:proofErr w:type="spellStart"/>
-            <w:r>
-              <w:rPr>
-                <w:rFonts w:ascii="Arial" w:hAnsi="Arial" w:cs="Arial"/>
-                <w:sz w:val="24"/>
-                <w:szCs w:val="24"/>
-              </w:rPr>
-              <w:t>y_target.npy</w:t>
-            </w:r>
-            <w:proofErr w:type="spellEnd"/>
-            <w:r>
-              <w:rPr>
-                <w:rFonts w:ascii="Arial" w:hAnsi="Arial" w:cs="Arial"/>
-                <w:sz w:val="24"/>
-                <w:szCs w:val="24"/>
-              </w:rPr>
-              <w:t>.</w:t>
+              <w:t>One-hot encoding, Boolean cast, save X_features.npy / y_target.npy.</w:t>
             </w:r>
           </w:p>
         </w:tc>
@@ -7552,25 +7181,7 @@
                 <w:sz w:val="24"/>
                 <w:szCs w:val="24"/>
               </w:rPr>
-              <w:t>Stratified 80/20 split + train-only standardization (saves *_</w:t>
-            </w:r>
-            <w:proofErr w:type="spellStart"/>
-            <w:r>
-              <w:rPr>
-                <w:rFonts w:ascii="Arial" w:hAnsi="Arial" w:cs="Arial"/>
-                <w:sz w:val="24"/>
-                <w:szCs w:val="24"/>
-              </w:rPr>
-              <w:t>scaled.npy</w:t>
-            </w:r>
-            <w:proofErr w:type="spellEnd"/>
-            <w:r>
-              <w:rPr>
-                <w:rFonts w:ascii="Arial" w:hAnsi="Arial" w:cs="Arial"/>
-                <w:sz w:val="24"/>
-                <w:szCs w:val="24"/>
-              </w:rPr>
-              <w:t>).</w:t>
+              <w:t>Stratified 80/20 split + train-only standardization (saves *_scaled.npy).</w:t>
             </w:r>
           </w:p>
         </w:tc>
@@ -7625,25 +7236,7 @@
                 <w:sz w:val="24"/>
                 <w:szCs w:val="24"/>
               </w:rPr>
-              <w:t xml:space="preserve">Vectorized </w:t>
-            </w:r>
-            <w:proofErr w:type="spellStart"/>
-            <w:r>
-              <w:rPr>
-                <w:rFonts w:ascii="Arial" w:hAnsi="Arial" w:cs="Arial"/>
-                <w:sz w:val="24"/>
-                <w:szCs w:val="24"/>
-              </w:rPr>
-              <w:t>kNN</w:t>
-            </w:r>
-            <w:proofErr w:type="spellEnd"/>
-            <w:r>
-              <w:rPr>
-                <w:rFonts w:ascii="Arial" w:hAnsi="Arial" w:cs="Arial"/>
-                <w:sz w:val="24"/>
-                <w:szCs w:val="24"/>
-              </w:rPr>
-              <w:t xml:space="preserve"> + manual confusion-matrix metrics; baseline run at k = 5.</w:t>
+              <w:t>Vectorized kNN + manual confusion-matrix metrics; baseline run at k = 5.</w:t>
             </w:r>
           </w:p>
         </w:tc>
@@ -8854,6 +8447,7 @@
   <w:style w:type="character" w:default="1" w:styleId="DefaultParagraphFont">
     <w:name w:val="Default Paragraph Font"/>
     <w:uiPriority w:val="1"/>
+    <w:semiHidden/>
     <w:unhideWhenUsed/>
   </w:style>
   <w:style w:type="table" w:default="1" w:styleId="TableNormal">

</xml_diff>